<commit_message>
E10: the patched score's rise under drift is systematic (not noise) but not significant for 7B; significant for 32B
Co-Authored-By: Claude Opus 5.5 <noreply@anthropic.com>
</commit_message>
<xml_diff>
--- a/results/experiments/RESULTS_PAPER.docx
+++ b/results/experiments/RESULTS_PAPER.docx
@@ -778,13 +778,37 @@
         <w:pStyle w:val="BodyText"/>
       </w:pPr>
       <w:r>
-        <w:t xml:space="preserve">With patching, the score at 100% drift is never more than 0.014 below the fully anticipated build (0% drift), and on</w:t>
-      </w:r>
-      <w:r>
-        <w:t xml:space="preserve"> </w:t>
-      </w:r>
-      <w:r>
-        <w:t xml:space="preserve">player and cspaper it is higher (+0.008, +0.019).</w:t>
+        <w:t xml:space="preserve">With patching, the score at 100% drift is never more than 0.014 below the fully anticipated build (0% drift). On</w:t>
+      </w:r>
+      <w:r>
+        <w:t xml:space="preserve"> </w:t>
+      </w:r>
+      <w:r>
+        <w:t xml:space="preserve">player and cspaper it is slightly higher (+0.008, +0.019), but neither rise is significant (paired 95% CIs −0.007 to</w:t>
+      </w:r>
+      <w:r>
+        <w:t xml:space="preserve"> </w:t>
+      </w:r>
+      <w:r>
+        <w:t xml:space="preserve">+0.028 and −0.011 to +0.052; query-level gains and losses cancel), so the patched curve is flat under drift. The rise</w:t>
+      </w:r>
+      <w:r>
+        <w:t xml:space="preserve"> </w:t>
+      </w:r>
+      <w:r>
+        <w:t xml:space="preserve">is not extraction noise either: patching changes 2.5–3.7× as many cells of the drifted columns as re-running the same</w:t>
+      </w:r>
+      <w:r>
+        <w:t xml:space="preserve"> </w:t>
+      </w:r>
+      <w:r>
+        <w:t xml:space="preserve">stream does, because patches read under a query-specific prompt and only on the documents the query can select. With</w:t>
+      </w:r>
+      <w:r>
+        <w:t xml:space="preserve"> </w:t>
+      </w:r>
+      <w:r>
+        <w:t xml:space="preserve">a stronger model the rise becomes significant (Qwen 2.5 32B on cspaper: +0.062, 95% CI +0.019 to +0.113; RQ7).</w:t>
       </w:r>
     </w:p>
     <w:p>

</xml_diff>

<commit_message>
RESULTS_PAPER: RQ1 holds across four drift draws (new Figure 2); docx rebuilt
Co-Authored-By: Claude Opus 5.5 <noreply@anthropic.com>
</commit_message>
<xml_diff>
--- a/results/experiments/RESULTS_PAPER.docx
+++ b/results/experiments/RESULTS_PAPER.docx
@@ -2,7 +2,7 @@
 <file path=word/document.xml><?xml version="1.0" encoding="utf-8"?>
 <w:document xmlns:w="http://schemas.openxmlformats.org/wordprocessingml/2006/main" xmlns:m="http://schemas.openxmlformats.org/officeDocument/2006/math" xmlns:r="http://schemas.openxmlformats.org/officeDocument/2006/relationships" xmlns:o="urn:schemas-microsoft-com:office:office" xmlns:v="urn:schemas-microsoft-com:vml" xmlns:w10="urn:schemas-microsoft-com:office:word" xmlns:a="http://schemas.openxmlformats.org/drawingml/2006/main" xmlns:pic="http://schemas.openxmlformats.org/drawingml/2006/picture" xmlns:wp="http://schemas.openxmlformats.org/drawingml/2006/wordprocessingDrawing">
   <w:body>
-    <w:bookmarkStart w:id="66" w:name="answers-to-the-research-questions"/>
+    <w:bookmarkStart w:id="69" w:name="answers-to-the-research-questions"/>
     <w:p>
       <w:pPr>
         <w:pStyle w:val="Heading1"/>
@@ -382,7 +382,7 @@
       </w:r>
     </w:p>
     <w:bookmarkEnd w:id="20"/>
-    <w:bookmarkStart w:id="27" w:name="X79963ffe1c90ad4bb45325ee4071b13a7c33244"/>
+    <w:bookmarkStart w:id="30" w:name="X79963ffe1c90ad4bb45325ee4071b13a7c33244"/>
     <w:p>
       <w:pPr>
         <w:pStyle w:val="Heading2"/>
@@ -873,6 +873,89 @@
         <w:pStyle w:val="BodyText"/>
       </w:pPr>
       <w:r>
+        <w:t xml:space="preserve">The result does not depend on which columns were withheld. Re-drawing the withheld columns three more times at the</w:t>
+      </w:r>
+      <w:r>
+        <w:t xml:space="preserve"> </w:t>
+      </w:r>
+      <w:r>
+        <w:t xml:space="preserve">same drift levels (cspaper and player), static collapses on every draw (to 0.008 and 0.040 at 100% drift), the</w:t>
+      </w:r>
+      <w:r>
+        <w:t xml:space="preserve"> </w:t>
+      </w:r>
+      <w:r>
+        <w:t xml:space="preserve">patched curve stays within 0.035 of its 0% score at every level, and no draw’s 100% − 0% difference is significant</w:t>
+      </w:r>
+      <w:r>
+        <w:t xml:space="preserve"> </w:t>
+      </w:r>
+      <w:r>
+        <w:t xml:space="preserve">(cspaper +0.007 to +0.020; player −0.010 to +0.008).</w:t>
+      </w:r>
+    </w:p>
+    <w:p>
+      <w:pPr>
+        <w:pStyle w:val="BodyText"/>
+      </w:pPr>
+      <w:r>
+        <w:drawing>
+          <wp:inline>
+            <wp:extent cx="5334000" cy="1891145"/>
+            <wp:effectExtent b="0" l="0" r="0" t="0"/>
+            <wp:docPr descr="The drift result across four draws of the withheld columns." title="" id="25" name="Picture"/>
+            <a:graphic>
+              <a:graphicData uri="http://schemas.openxmlformats.org/drawingml/2006/picture">
+                <pic:pic>
+                  <pic:nvPicPr>
+                    <pic:cNvPr descr="figures/rq1_seeds.png" id="26" name="Picture"/>
+                    <pic:cNvPicPr>
+                      <a:picLocks noChangeArrowheads="1" noChangeAspect="1"/>
+                    </pic:cNvPicPr>
+                  </pic:nvPicPr>
+                  <pic:blipFill>
+                    <a:blip r:embed="rId24"/>
+                    <a:stretch>
+                      <a:fillRect/>
+                    </a:stretch>
+                  </pic:blipFill>
+                  <pic:spPr bwMode="auto">
+                    <a:xfrm>
+                      <a:off x="0" y="0"/>
+                      <a:ext cx="5334000" cy="1891145"/>
+                    </a:xfrm>
+                    <a:prstGeom prst="rect">
+                      <a:avLst/>
+                    </a:prstGeom>
+                    <a:noFill/>
+                    <a:ln w="9525">
+                      <a:noFill/>
+                      <a:headEnd/>
+                      <a:tailEnd/>
+                    </a:ln>
+                  </pic:spPr>
+                </pic:pic>
+              </a:graphicData>
+            </a:graphic>
+          </wp:inline>
+        </w:drawing>
+      </w:r>
+      <w:r>
+        <w:t xml:space="preserve"> </w:t>
+      </w:r>
+      <w:r>
+        <w:rPr>
+          <w:iCs/>
+          <w:i/>
+        </w:rPr>
+        <w:t xml:space="preserve">Figure 2. The drift result across four draws of the withheld columns (cspaper, player).</w:t>
+      </w:r>
+    </w:p>
+    <w:p>
+      <w:pPr>
+        <w:pStyle w:val="BodyText"/>
+      </w:pPr>
+      <w:r>
         <w:rPr>
           <w:iCs/>
           <w:i/>
@@ -1310,18 +1393,18 @@
           <wp:inline>
             <wp:extent cx="5334000" cy="2800350"/>
             <wp:effectExtent b="0" l="0" r="0" t="0"/>
-            <wp:docPr descr="Total extraction tokens relative to a build that anticipated every column." title="" id="25" name="Picture"/>
+            <wp:docPr descr="Total extraction tokens relative to a build that anticipated every column." title="" id="28" name="Picture"/>
             <a:graphic>
               <a:graphicData uri="http://schemas.openxmlformats.org/drawingml/2006/picture">
                 <pic:pic>
                   <pic:nvPicPr>
-                    <pic:cNvPr descr="figures/rq1_anticipation.png" id="26" name="Picture"/>
+                    <pic:cNvPr descr="figures/rq1_anticipation.png" id="29" name="Picture"/>
                     <pic:cNvPicPr>
                       <a:picLocks noChangeArrowheads="1" noChangeAspect="1"/>
                     </pic:cNvPicPr>
                   </pic:nvPicPr>
                   <pic:blipFill>
-                    <a:blip r:embed="rId24"/>
+                    <a:blip r:embed="rId27"/>
                     <a:stretch>
                       <a:fillRect/>
                     </a:stretch>
@@ -1355,7 +1438,7 @@
           <w:iCs/>
           <w:i/>
         </w:rPr>
-        <w:t xml:space="preserve">Figure 2. Total extraction tokens relative to a build that anticipated every column.</w:t>
+        <w:t xml:space="preserve">Figure 3. Total extraction tokens relative to a build that anticipated every column.</w:t>
       </w:r>
     </w:p>
     <w:p>
@@ -1397,7 +1480,13 @@
         <w:t xml:space="preserve"> </w:t>
       </w:r>
       <w:r>
-        <w:t xml:space="preserve">Five corpora, all drift levels, one model (the drift result was replicated with two other models; RQ7).</w:t>
+        <w:t xml:space="preserve">Five corpora, all drift levels, one model; four draws of the withheld columns on cspaper and player;</w:t>
+      </w:r>
+      <w:r>
+        <w:t xml:space="preserve"> </w:t>
+      </w:r>
+      <w:r>
+        <w:t xml:space="preserve">replicated with two other models (RQ7).</w:t>
       </w:r>
     </w:p>
     <w:p>
@@ -1407,8 +1496,8 @@
         </w:pict>
       </w:r>
     </w:p>
-    <w:bookmarkEnd w:id="27"/>
-    <w:bookmarkStart w:id="31" w:name="X5d55baef0da26aed42f4f5fddc0e8d159be3c4f"/>
+    <w:bookmarkEnd w:id="30"/>
+    <w:bookmarkStart w:id="34" w:name="X5d55baef0da26aed42f4f5fddc0e8d159be3c4f"/>
     <w:p>
       <w:pPr>
         <w:pStyle w:val="Heading2"/>
@@ -1899,18 +1988,18 @@
           <wp:inline>
             <wp:extent cx="5334000" cy="2800350"/>
             <wp:effectExtent b="0" l="0" r="0" t="0"/>
-            <wp:docPr descr="Agreement with gold by number of columns asked per prompt." title="" id="29" name="Picture"/>
+            <wp:docPr descr="Agreement with gold by number of columns asked per prompt." title="" id="32" name="Picture"/>
             <a:graphic>
               <a:graphicData uri="http://schemas.openxmlformats.org/drawingml/2006/picture">
                 <pic:pic>
                   <pic:nvPicPr>
-                    <pic:cNvPr descr="figures/rq2_width.png" id="30" name="Picture"/>
+                    <pic:cNvPr descr="figures/rq2_width.png" id="33" name="Picture"/>
                     <pic:cNvPicPr>
                       <a:picLocks noChangeArrowheads="1" noChangeAspect="1"/>
                     </pic:cNvPicPr>
                   </pic:nvPicPr>
                   <pic:blipFill>
-                    <a:blip r:embed="rId28"/>
+                    <a:blip r:embed="rId31"/>
                     <a:stretch>
                       <a:fillRect/>
                     </a:stretch>
@@ -1944,7 +2033,7 @@
           <w:iCs/>
           <w:i/>
         </w:rPr>
-        <w:t xml:space="preserve">Figure 3. Agreement with gold by number of columns asked per prompt.</w:t>
+        <w:t xml:space="preserve">Figure 4. Agreement with gold by number of columns asked per prompt.</w:t>
       </w:r>
     </w:p>
     <w:p>
@@ -1990,8 +2079,8 @@
         </w:pict>
       </w:r>
     </w:p>
-    <w:bookmarkEnd w:id="31"/>
-    <w:bookmarkStart w:id="38" w:name="Xea857518a4cc4f8f457a64234e79d2973005789"/>
+    <w:bookmarkEnd w:id="34"/>
+    <w:bookmarkStart w:id="41" w:name="Xea857518a4cc4f8f457a64234e79d2973005789"/>
     <w:p>
       <w:pPr>
         <w:pStyle w:val="Heading2"/>
@@ -2112,18 +2201,18 @@
           <wp:inline>
             <wp:extent cx="5334000" cy="2844800"/>
             <wp:effectExtent b="0" l="0" r="0" t="0"/>
-            <wp:docPr descr="Legal at 100% drift: score by budget, first-come-first-served vs skipping MIN/MAX-over-text queries." title="" id="33" name="Picture"/>
+            <wp:docPr descr="Legal at 100% drift: score by budget, first-come-first-served vs skipping MIN/MAX-over-text queries." title="" id="36" name="Picture"/>
             <a:graphic>
               <a:graphicData uri="http://schemas.openxmlformats.org/drawingml/2006/picture">
                 <pic:pic>
                   <pic:nvPicPr>
-                    <pic:cNvPr descr="figures/rq3_legal_budget.png" id="34" name="Picture"/>
+                    <pic:cNvPr descr="figures/rq3_legal_budget.png" id="37" name="Picture"/>
                     <pic:cNvPicPr>
                       <a:picLocks noChangeArrowheads="1" noChangeAspect="1"/>
                     </pic:cNvPicPr>
                   </pic:nvPicPr>
                   <pic:blipFill>
-                    <a:blip r:embed="rId32"/>
+                    <a:blip r:embed="rId35"/>
                     <a:stretch>
                       <a:fillRect/>
                     </a:stretch>
@@ -2157,7 +2246,7 @@
           <w:iCs/>
           <w:i/>
         </w:rPr>
-        <w:t xml:space="preserve">Figure 4. Legal at 100% drift: score by budget, first-come-first-served vs skipping MIN/MAX-over-text queries.</w:t>
+        <w:t xml:space="preserve">Figure 5. Legal at 100% drift: score by budget, first-come-first-served vs skipping MIN/MAX-over-text queries.</w:t>
       </w:r>
     </w:p>
     <w:p>
@@ -2731,18 +2820,18 @@
           <wp:inline>
             <wp:extent cx="5334000" cy="2240280"/>
             <wp:effectExtent b="0" l="0" r="0" t="0"/>
-            <wp:docPr descr="Each policy’s mean score minus first-come-first-served, per corpus." title="" id="36" name="Picture"/>
+            <wp:docPr descr="Each policy’s mean score minus first-come-first-served, per corpus." title="" id="39" name="Picture"/>
             <a:graphic>
               <a:graphicData uri="http://schemas.openxmlformats.org/drawingml/2006/picture">
                 <pic:pic>
                   <pic:nvPicPr>
-                    <pic:cNvPr descr="figures/rq3_policies.png" id="37" name="Picture"/>
+                    <pic:cNvPr descr="figures/rq3_policies.png" id="40" name="Picture"/>
                     <pic:cNvPicPr>
                       <a:picLocks noChangeArrowheads="1" noChangeAspect="1"/>
                     </pic:cNvPicPr>
                   </pic:nvPicPr>
                   <pic:blipFill>
-                    <a:blip r:embed="rId35"/>
+                    <a:blip r:embed="rId38"/>
                     <a:stretch>
                       <a:fillRect/>
                     </a:stretch>
@@ -2776,7 +2865,7 @@
           <w:iCs/>
           <w:i/>
         </w:rPr>
-        <w:t xml:space="preserve">Figure 5. Each policy’s mean score minus first-come-first-served, per corpus.</w:t>
+        <w:t xml:space="preserve">Figure 6. Each policy’s mean score minus first-come-first-served, per corpus.</w:t>
       </w:r>
     </w:p>
     <w:p>
@@ -2834,8 +2923,8 @@
         </w:pict>
       </w:r>
     </w:p>
-    <w:bookmarkEnd w:id="38"/>
-    <w:bookmarkStart w:id="42" w:name="X5722249a796b26fcc2ef85b7f325a424b6509e1"/>
+    <w:bookmarkEnd w:id="41"/>
+    <w:bookmarkStart w:id="45" w:name="X5722249a796b26fcc2ef85b7f325a424b6509e1"/>
     <w:p>
       <w:pPr>
         <w:pStyle w:val="Heading2"/>
@@ -3136,18 +3225,18 @@
           <wp:inline>
             <wp:extent cx="5334000" cy="1648690"/>
             <wp:effectExtent b="0" l="0" r="0" t="0"/>
-            <wp:docPr descr="Wasted extraction tokens by SQL-visible signal." title="" id="40" name="Picture"/>
+            <wp:docPr descr="Wasted extraction tokens by SQL-visible signal." title="" id="43" name="Picture"/>
             <a:graphic>
               <a:graphicData uri="http://schemas.openxmlformats.org/drawingml/2006/picture">
                 <pic:pic>
                   <pic:nvPicPr>
-                    <pic:cNvPr descr="figures/rq4_signals.png" id="41" name="Picture"/>
+                    <pic:cNvPr descr="figures/rq4_signals.png" id="44" name="Picture"/>
                     <pic:cNvPicPr>
                       <a:picLocks noChangeArrowheads="1" noChangeAspect="1"/>
                     </pic:cNvPicPr>
                   </pic:nvPicPr>
                   <pic:blipFill>
-                    <a:blip r:embed="rId39"/>
+                    <a:blip r:embed="rId42"/>
                     <a:stretch>
                       <a:fillRect/>
                     </a:stretch>
@@ -3181,7 +3270,7 @@
           <w:iCs/>
           <w:i/>
         </w:rPr>
-        <w:t xml:space="preserve">Figure 6. Wasted extraction tokens by SQL-visible signal.</w:t>
+        <w:t xml:space="preserve">Figure 7. Wasted extraction tokens by SQL-visible signal.</w:t>
       </w:r>
     </w:p>
     <w:p>
@@ -3233,8 +3322,8 @@
         </w:pict>
       </w:r>
     </w:p>
-    <w:bookmarkEnd w:id="42"/>
-    <w:bookmarkStart w:id="46" w:name="Xe8b3b4dee71c336614042affb4d375ab12ca1b7"/>
+    <w:bookmarkEnd w:id="45"/>
+    <w:bookmarkStart w:id="49" w:name="Xe8b3b4dee71c336614042affb4d375ab12ca1b7"/>
     <w:p>
       <w:pPr>
         <w:pStyle w:val="Heading2"/>
@@ -3625,18 +3714,18 @@
           <wp:inline>
             <wp:extent cx="5334000" cy="2726266"/>
             <wp:effectExtent b="0" l="0" r="0" t="0"/>
-            <wp:docPr descr="Score vs tokens for planner configurations and single shared passes (player)." title="" id="44" name="Picture"/>
+            <wp:docPr descr="Score vs tokens for planner configurations and single shared passes (player)." title="" id="47" name="Picture"/>
             <a:graphic>
               <a:graphicData uri="http://schemas.openxmlformats.org/drawingml/2006/picture">
                 <pic:pic>
                   <pic:nvPicPr>
-                    <pic:cNvPr descr="figures/rq5_planner.png" id="45" name="Picture"/>
+                    <pic:cNvPr descr="figures/rq5_planner.png" id="48" name="Picture"/>
                     <pic:cNvPicPr>
                       <a:picLocks noChangeArrowheads="1" noChangeAspect="1"/>
                     </pic:cNvPicPr>
                   </pic:nvPicPr>
                   <pic:blipFill>
-                    <a:blip r:embed="rId43"/>
+                    <a:blip r:embed="rId46"/>
                     <a:stretch>
                       <a:fillRect/>
                     </a:stretch>
@@ -3670,7 +3759,7 @@
           <w:iCs/>
           <w:i/>
         </w:rPr>
-        <w:t xml:space="preserve">Figure 7. Score vs tokens for planner configurations and single shared passes (player).</w:t>
+        <w:t xml:space="preserve">Figure 8. Score vs tokens for planner configurations and single shared passes (player).</w:t>
       </w:r>
     </w:p>
     <w:p>
@@ -3734,8 +3823,8 @@
         </w:pict>
       </w:r>
     </w:p>
-    <w:bookmarkEnd w:id="46"/>
-    <w:bookmarkStart w:id="50" w:name="Xe9a8932c350571f932f195ad307ddbaa6c29e8e"/>
+    <w:bookmarkEnd w:id="49"/>
+    <w:bookmarkStart w:id="53" w:name="Xe9a8932c350571f932f195ad307ddbaa6c29e8e"/>
     <w:p>
       <w:pPr>
         <w:pStyle w:val="Heading2"/>
@@ -3847,18 +3936,18 @@
           <wp:inline>
             <wp:extent cx="5334000" cy="2252133"/>
             <wp:effectExtent b="0" l="0" r="0" t="0"/>
-            <wp:docPr descr="Cells that differ between budgeted and unlimited streams, by kind (log scale)." title="" id="48" name="Picture"/>
+            <wp:docPr descr="Cells that differ between budgeted and unlimited streams, by kind (log scale)." title="" id="51" name="Picture"/>
             <a:graphic>
               <a:graphicData uri="http://schemas.openxmlformats.org/drawingml/2006/picture">
                 <pic:pic>
                   <pic:nvPicPr>
-                    <pic:cNvPr descr="figures/rq6_cells.png" id="49" name="Picture"/>
+                    <pic:cNvPr descr="figures/rq6_cells.png" id="52" name="Picture"/>
                     <pic:cNvPicPr>
                       <a:picLocks noChangeArrowheads="1" noChangeAspect="1"/>
                     </pic:cNvPicPr>
                   </pic:nvPicPr>
                   <pic:blipFill>
-                    <a:blip r:embed="rId47"/>
+                    <a:blip r:embed="rId50"/>
                     <a:stretch>
                       <a:fillRect/>
                     </a:stretch>
@@ -3892,7 +3981,7 @@
           <w:iCs/>
           <w:i/>
         </w:rPr>
-        <w:t xml:space="preserve">Figure 8. Cells that differ between budgeted and unlimited streams, by kind (log scale).</w:t>
+        <w:t xml:space="preserve">Figure 9. Cells that differ between budgeted and unlimited streams, by kind (log scale).</w:t>
       </w:r>
     </w:p>
     <w:p>
@@ -3944,8 +4033,8 @@
         </w:pict>
       </w:r>
     </w:p>
-    <w:bookmarkEnd w:id="50"/>
-    <w:bookmarkStart w:id="54" w:name="Xdc29460b1fb7bc7d935a35e4e1ce23be79b2d07"/>
+    <w:bookmarkEnd w:id="53"/>
+    <w:bookmarkStart w:id="57" w:name="Xdc29460b1fb7bc7d935a35e4e1ce23be79b2d07"/>
     <w:p>
       <w:pPr>
         <w:pStyle w:val="Heading2"/>
@@ -4267,18 +4356,18 @@
           <wp:inline>
             <wp:extent cx="5334000" cy="1559169"/>
             <wp:effectExtent b="0" l="0" r="0" t="0"/>
-            <wp:docPr descr="Three models: single pass, and patched vs static at 100% drift." title="" id="52" name="Picture"/>
+            <wp:docPr descr="Three models: single pass, and patched vs static at 100% drift." title="" id="55" name="Picture"/>
             <a:graphic>
               <a:graphicData uri="http://schemas.openxmlformats.org/drawingml/2006/picture">
                 <pic:pic>
                   <pic:nvPicPr>
-                    <pic:cNvPr descr="figures/rq7_models.png" id="53" name="Picture"/>
+                    <pic:cNvPr descr="figures/rq7_models.png" id="56" name="Picture"/>
                     <pic:cNvPicPr>
                       <a:picLocks noChangeArrowheads="1" noChangeAspect="1"/>
                     </pic:cNvPicPr>
                   </pic:nvPicPr>
                   <pic:blipFill>
-                    <a:blip r:embed="rId51"/>
+                    <a:blip r:embed="rId54"/>
                     <a:stretch>
                       <a:fillRect/>
                     </a:stretch>
@@ -4312,7 +4401,7 @@
           <w:iCs/>
           <w:i/>
         </w:rPr>
-        <w:t xml:space="preserve">Figure 9. Three models: single pass, and patched vs static at 100% drift.</w:t>
+        <w:t xml:space="preserve">Figure 10. Three models: single pass, and patched vs static at 100% drift.</w:t>
       </w:r>
     </w:p>
     <w:p>
@@ -4364,8 +4453,8 @@
         </w:pict>
       </w:r>
     </w:p>
-    <w:bookmarkEnd w:id="54"/>
-    <w:bookmarkStart w:id="61" w:name="X7120b8bd2634908d82c5ef655f8b5faf4a3d922"/>
+    <w:bookmarkEnd w:id="57"/>
+    <w:bookmarkStart w:id="64" w:name="X7120b8bd2634908d82c5ef655f8b5faf4a3d922"/>
     <w:p>
       <w:pPr>
         <w:pStyle w:val="Heading2"/>
@@ -4765,18 +4854,18 @@
           <wp:inline>
             <wp:extent cx="5334000" cy="2384611"/>
             <wp:effectExtent b="0" l="0" r="0" t="0"/>
-            <wp:docPr descr="Structure F2 vs cell F1 per corpus, with on-demand patching at 100% drift." title="" id="56" name="Picture"/>
+            <wp:docPr descr="Structure F2 vs cell F1 per corpus, with on-demand patching at 100% drift." title="" id="59" name="Picture"/>
             <a:graphic>
               <a:graphicData uri="http://schemas.openxmlformats.org/drawingml/2006/picture">
                 <pic:pic>
                   <pic:nvPicPr>
-                    <pic:cNvPr descr="figures/rq8_bottleneck.png" id="57" name="Picture"/>
+                    <pic:cNvPr descr="figures/rq8_bottleneck.png" id="60" name="Picture"/>
                     <pic:cNvPicPr>
                       <a:picLocks noChangeArrowheads="1" noChangeAspect="1"/>
                     </pic:cNvPicPr>
                   </pic:nvPicPr>
                   <pic:blipFill>
-                    <a:blip r:embed="rId55"/>
+                    <a:blip r:embed="rId58"/>
                     <a:stretch>
                       <a:fillRect/>
                     </a:stretch>
@@ -4810,7 +4899,7 @@
           <w:iCs/>
           <w:i/>
         </w:rPr>
-        <w:t xml:space="preserve">Figure 10. Structure F2 vs cell F1 per corpus, with on-demand patching at 100% drift.</w:t>
+        <w:t xml:space="preserve">Figure 11. Structure F2 vs cell F1 per corpus, with on-demand patching at 100% drift.</w:t>
       </w:r>
     </w:p>
     <w:p>
@@ -4927,18 +5016,18 @@
           <wp:inline>
             <wp:extent cx="5334000" cy="2761129"/>
             <wp:effectExtent b="0" l="0" r="0" t="0"/>
-            <wp:docPr descr="Exact vs lenient agreement for the ten columns with the largest gap." title="" id="59" name="Picture"/>
+            <wp:docPr descr="Exact vs lenient agreement for the ten columns with the largest gap." title="" id="62" name="Picture"/>
             <a:graphic>
               <a:graphicData uri="http://schemas.openxmlformats.org/drawingml/2006/picture">
                 <pic:pic>
                   <pic:nvPicPr>
-                    <pic:cNvPr descr="figures/rq8_form.png" id="60" name="Picture"/>
+                    <pic:cNvPr descr="figures/rq8_form.png" id="63" name="Picture"/>
                     <pic:cNvPicPr>
                       <a:picLocks noChangeArrowheads="1" noChangeAspect="1"/>
                     </pic:cNvPicPr>
                   </pic:nvPicPr>
                   <pic:blipFill>
-                    <a:blip r:embed="rId58"/>
+                    <a:blip r:embed="rId61"/>
                     <a:stretch>
                       <a:fillRect/>
                     </a:stretch>
@@ -4972,7 +5061,7 @@
           <w:iCs/>
           <w:i/>
         </w:rPr>
-        <w:t xml:space="preserve">Figure 11. Exact vs lenient agreement for the ten columns with the largest gap.</w:t>
+        <w:t xml:space="preserve">Figure 12. Exact vs lenient agreement for the ten columns with the largest gap.</w:t>
       </w:r>
     </w:p>
     <w:p>
@@ -5048,8 +5137,8 @@
         </w:pict>
       </w:r>
     </w:p>
-    <w:bookmarkEnd w:id="61"/>
-    <w:bookmarkStart w:id="65" w:name="comparison-with-docetl"/>
+    <w:bookmarkEnd w:id="64"/>
+    <w:bookmarkStart w:id="68" w:name="comparison-with-docetl"/>
     <w:p>
       <w:pPr>
         <w:pStyle w:val="Heading2"/>
@@ -5699,18 +5788,18 @@
           <wp:inline>
             <wp:extent cx="5334000" cy="1723292"/>
             <wp:effectExtent b="0" l="0" r="0" t="0"/>
-            <wp:docPr descr="Ours vs DocETL per corpus (left) and on player by number of joins (right)." title="" id="63" name="Picture"/>
+            <wp:docPr descr="Ours vs DocETL per corpus (left) and on player by number of joins (right)." title="" id="66" name="Picture"/>
             <a:graphic>
               <a:graphicData uri="http://schemas.openxmlformats.org/drawingml/2006/picture">
                 <pic:pic>
                   <pic:nvPicPr>
-                    <pic:cNvPr descr="figures/docetl.png" id="64" name="Picture"/>
+                    <pic:cNvPr descr="figures/docetl.png" id="67" name="Picture"/>
                     <pic:cNvPicPr>
                       <a:picLocks noChangeArrowheads="1" noChangeAspect="1"/>
                     </pic:cNvPicPr>
                   </pic:nvPicPr>
                   <pic:blipFill>
-                    <a:blip r:embed="rId62"/>
+                    <a:blip r:embed="rId65"/>
                     <a:stretch>
                       <a:fillRect/>
                     </a:stretch>
@@ -5744,7 +5833,7 @@
           <w:iCs/>
           <w:i/>
         </w:rPr>
-        <w:t xml:space="preserve">Figure 12. Ours vs DocETL per corpus (left) and on player by number of joins (right).</w:t>
+        <w:t xml:space="preserve">Figure 13. Ours vs DocETL per corpus (left) and on player by number of joins (right).</w:t>
       </w:r>
     </w:p>
     <w:p>
@@ -5791,8 +5880,8 @@
         <w:t xml:space="preserve">Legal is 16 of 30 queries (DocETL takes about 3 hours per legal query); the other corpora are complete.</w:t>
       </w:r>
     </w:p>
-    <w:bookmarkEnd w:id="65"/>
-    <w:bookmarkEnd w:id="66"/>
+    <w:bookmarkEnd w:id="68"/>
+    <w:bookmarkEnd w:id="69"/>
     <w:sectPr/>
   </w:body>
 </w:document>

</xml_diff>

<commit_message>
E12 recorded: drift result holds for train shares 10-50% (new Figure 3); smaller build workload costs more in patches
Co-Authored-By: Claude Opus 5.5 <noreply@anthropic.com>
</commit_message>
<xml_diff>
--- a/results/experiments/RESULTS_PAPER.docx
+++ b/results/experiments/RESULTS_PAPER.docx
@@ -2,7 +2,7 @@
 <file path=word/document.xml><?xml version="1.0" encoding="utf-8"?>
 <w:document xmlns:w="http://schemas.openxmlformats.org/wordprocessingml/2006/main" xmlns:m="http://schemas.openxmlformats.org/officeDocument/2006/math" xmlns:r="http://schemas.openxmlformats.org/officeDocument/2006/relationships" xmlns:o="urn:schemas-microsoft-com:office:office" xmlns:v="urn:schemas-microsoft-com:vml" xmlns:w10="urn:schemas-microsoft-com:office:word" xmlns:a="http://schemas.openxmlformats.org/drawingml/2006/main" xmlns:pic="http://schemas.openxmlformats.org/drawingml/2006/picture" xmlns:wp="http://schemas.openxmlformats.org/drawingml/2006/wordprocessingDrawing">
   <w:body>
-    <w:bookmarkStart w:id="69" w:name="answers-to-the-research-questions"/>
+    <w:bookmarkStart w:id="72" w:name="answers-to-the-research-questions"/>
     <w:p>
       <w:pPr>
         <w:pStyle w:val="Heading1"/>
@@ -382,7 +382,7 @@
       </w:r>
     </w:p>
     <w:bookmarkEnd w:id="20"/>
-    <w:bookmarkStart w:id="30" w:name="X79963ffe1c90ad4bb45325ee4071b13a7c33244"/>
+    <w:bookmarkStart w:id="33" w:name="X79963ffe1c90ad4bb45325ee4071b13a7c33244"/>
     <w:p>
       <w:pPr>
         <w:pStyle w:val="Heading2"/>
@@ -956,6 +956,95 @@
         <w:pStyle w:val="BodyText"/>
       </w:pPr>
       <w:r>
+        <w:t xml:space="preserve">It does not depend on how much of the workload the build anticipates either. Cutting the build workload to 10%, 25%</w:t>
+      </w:r>
+      <w:r>
+        <w:t xml:space="preserve"> </w:t>
+      </w:r>
+      <w:r>
+        <w:t xml:space="preserve">or 50% of its queries (same test queries) leaves more columns to the patches (art at 10%: 14 new columns instead of</w:t>
+      </w:r>
+      <w:r>
+        <w:t xml:space="preserve"> </w:t>
+      </w:r>
+      <w:r>
+        <w:t xml:space="preserve">9). Static still collapses at 100% drift (0.000–0.043), the patched curve stays within 0.025 of its 0% score, and no</w:t>
+      </w:r>
+      <w:r>
+        <w:t xml:space="preserve"> </w:t>
+      </w:r>
+      <w:r>
+        <w:t xml:space="preserve">100% − 0% difference is significant (−0.015 to +0.014). The cost moves from the build to the patches and grows: art</w:t>
+      </w:r>
+      <w:r>
+        <w:t xml:space="preserve"> </w:t>
+      </w:r>
+      <w:r>
+        <w:t xml:space="preserve">at 10% saves 1.0M build tokens but adds 2.6M patch tokens (+19% total); cspaper +23%, player +7%.</w:t>
+      </w:r>
+    </w:p>
+    <w:p>
+      <w:pPr>
+        <w:pStyle w:val="BodyText"/>
+      </w:pPr>
+      <w:r>
+        <w:drawing>
+          <wp:inline>
+            <wp:extent cx="5334000" cy="1635760"/>
+            <wp:effectExtent b="0" l="0" r="0" t="0"/>
+            <wp:docPr descr="The drift result for build workloads cut to 10–50% of their queries." title="" id="28" name="Picture"/>
+            <a:graphic>
+              <a:graphicData uri="http://schemas.openxmlformats.org/drawingml/2006/picture">
+                <pic:pic>
+                  <pic:nvPicPr>
+                    <pic:cNvPr descr="figures/rq1_train.png" id="29" name="Picture"/>
+                    <pic:cNvPicPr>
+                      <a:picLocks noChangeArrowheads="1" noChangeAspect="1"/>
+                    </pic:cNvPicPr>
+                  </pic:nvPicPr>
+                  <pic:blipFill>
+                    <a:blip r:embed="rId27"/>
+                    <a:stretch>
+                      <a:fillRect/>
+                    </a:stretch>
+                  </pic:blipFill>
+                  <pic:spPr bwMode="auto">
+                    <a:xfrm>
+                      <a:off x="0" y="0"/>
+                      <a:ext cx="5334000" cy="1635760"/>
+                    </a:xfrm>
+                    <a:prstGeom prst="rect">
+                      <a:avLst/>
+                    </a:prstGeom>
+                    <a:noFill/>
+                    <a:ln w="9525">
+                      <a:noFill/>
+                      <a:headEnd/>
+                      <a:tailEnd/>
+                    </a:ln>
+                  </pic:spPr>
+                </pic:pic>
+              </a:graphicData>
+            </a:graphic>
+          </wp:inline>
+        </w:drawing>
+      </w:r>
+      <w:r>
+        <w:t xml:space="preserve"> </w:t>
+      </w:r>
+      <w:r>
+        <w:rPr>
+          <w:iCs/>
+          <w:i/>
+        </w:rPr>
+        <w:t xml:space="preserve">Figure 3. The drift result for build workloads cut to 10–50% of their queries (cspaper, player, art).</w:t>
+      </w:r>
+    </w:p>
+    <w:p>
+      <w:pPr>
+        <w:pStyle w:val="BodyText"/>
+      </w:pPr>
+      <w:r>
         <w:rPr>
           <w:iCs/>
           <w:i/>
@@ -1393,18 +1482,18 @@
           <wp:inline>
             <wp:extent cx="5334000" cy="2800350"/>
             <wp:effectExtent b="0" l="0" r="0" t="0"/>
-            <wp:docPr descr="Total extraction tokens relative to a build that anticipated every column." title="" id="28" name="Picture"/>
+            <wp:docPr descr="Total extraction tokens relative to a build that anticipated every column." title="" id="31" name="Picture"/>
             <a:graphic>
               <a:graphicData uri="http://schemas.openxmlformats.org/drawingml/2006/picture">
                 <pic:pic>
                   <pic:nvPicPr>
-                    <pic:cNvPr descr="figures/rq1_anticipation.png" id="29" name="Picture"/>
+                    <pic:cNvPr descr="figures/rq1_anticipation.png" id="32" name="Picture"/>
                     <pic:cNvPicPr>
                       <a:picLocks noChangeArrowheads="1" noChangeAspect="1"/>
                     </pic:cNvPicPr>
                   </pic:nvPicPr>
                   <pic:blipFill>
-                    <a:blip r:embed="rId27"/>
+                    <a:blip r:embed="rId30"/>
                     <a:stretch>
                       <a:fillRect/>
                     </a:stretch>
@@ -1438,7 +1527,7 @@
           <w:iCs/>
           <w:i/>
         </w:rPr>
-        <w:t xml:space="preserve">Figure 3. Total extraction tokens relative to a build that anticipated every column.</w:t>
+        <w:t xml:space="preserve">Figure 4. Total extraction tokens relative to a build that anticipated every column.</w:t>
       </w:r>
     </w:p>
     <w:p>
@@ -1480,7 +1569,7 @@
         <w:t xml:space="preserve"> </w:t>
       </w:r>
       <w:r>
-        <w:t xml:space="preserve">Five corpora, all drift levels, one model; four draws of the withheld columns on cspaper and player;</w:t>
+        <w:t xml:space="preserve">Five corpora, all drift levels, one model; four draws of the withheld columns on cspaper and player; three smaller build workloads on cspaper, player and art;</w:t>
       </w:r>
       <w:r>
         <w:t xml:space="preserve"> </w:t>
@@ -1496,8 +1585,8 @@
         </w:pict>
       </w:r>
     </w:p>
-    <w:bookmarkEnd w:id="30"/>
-    <w:bookmarkStart w:id="34" w:name="X5d55baef0da26aed42f4f5fddc0e8d159be3c4f"/>
+    <w:bookmarkEnd w:id="33"/>
+    <w:bookmarkStart w:id="37" w:name="X5d55baef0da26aed42f4f5fddc0e8d159be3c4f"/>
     <w:p>
       <w:pPr>
         <w:pStyle w:val="Heading2"/>
@@ -1988,18 +2077,18 @@
           <wp:inline>
             <wp:extent cx="5334000" cy="2800350"/>
             <wp:effectExtent b="0" l="0" r="0" t="0"/>
-            <wp:docPr descr="Agreement with gold by number of columns asked per prompt." title="" id="32" name="Picture"/>
+            <wp:docPr descr="Agreement with gold by number of columns asked per prompt." title="" id="35" name="Picture"/>
             <a:graphic>
               <a:graphicData uri="http://schemas.openxmlformats.org/drawingml/2006/picture">
                 <pic:pic>
                   <pic:nvPicPr>
-                    <pic:cNvPr descr="figures/rq2_width.png" id="33" name="Picture"/>
+                    <pic:cNvPr descr="figures/rq2_width.png" id="36" name="Picture"/>
                     <pic:cNvPicPr>
                       <a:picLocks noChangeArrowheads="1" noChangeAspect="1"/>
                     </pic:cNvPicPr>
                   </pic:nvPicPr>
                   <pic:blipFill>
-                    <a:blip r:embed="rId31"/>
+                    <a:blip r:embed="rId34"/>
                     <a:stretch>
                       <a:fillRect/>
                     </a:stretch>
@@ -2033,7 +2122,7 @@
           <w:iCs/>
           <w:i/>
         </w:rPr>
-        <w:t xml:space="preserve">Figure 4. Agreement with gold by number of columns asked per prompt.</w:t>
+        <w:t xml:space="preserve">Figure 5. Agreement with gold by number of columns asked per prompt.</w:t>
       </w:r>
     </w:p>
     <w:p>
@@ -2079,8 +2168,8 @@
         </w:pict>
       </w:r>
     </w:p>
-    <w:bookmarkEnd w:id="34"/>
-    <w:bookmarkStart w:id="41" w:name="Xea857518a4cc4f8f457a64234e79d2973005789"/>
+    <w:bookmarkEnd w:id="37"/>
+    <w:bookmarkStart w:id="44" w:name="Xea857518a4cc4f8f457a64234e79d2973005789"/>
     <w:p>
       <w:pPr>
         <w:pStyle w:val="Heading2"/>
@@ -2201,18 +2290,18 @@
           <wp:inline>
             <wp:extent cx="5334000" cy="2844800"/>
             <wp:effectExtent b="0" l="0" r="0" t="0"/>
-            <wp:docPr descr="Legal at 100% drift: score by budget, first-come-first-served vs skipping MIN/MAX-over-text queries." title="" id="36" name="Picture"/>
+            <wp:docPr descr="Legal at 100% drift: score by budget, first-come-first-served vs skipping MIN/MAX-over-text queries." title="" id="39" name="Picture"/>
             <a:graphic>
               <a:graphicData uri="http://schemas.openxmlformats.org/drawingml/2006/picture">
                 <pic:pic>
                   <pic:nvPicPr>
-                    <pic:cNvPr descr="figures/rq3_legal_budget.png" id="37" name="Picture"/>
+                    <pic:cNvPr descr="figures/rq3_legal_budget.png" id="40" name="Picture"/>
                     <pic:cNvPicPr>
                       <a:picLocks noChangeArrowheads="1" noChangeAspect="1"/>
                     </pic:cNvPicPr>
                   </pic:nvPicPr>
                   <pic:blipFill>
-                    <a:blip r:embed="rId35"/>
+                    <a:blip r:embed="rId38"/>
                     <a:stretch>
                       <a:fillRect/>
                     </a:stretch>
@@ -2246,7 +2335,7 @@
           <w:iCs/>
           <w:i/>
         </w:rPr>
-        <w:t xml:space="preserve">Figure 5. Legal at 100% drift: score by budget, first-come-first-served vs skipping MIN/MAX-over-text queries.</w:t>
+        <w:t xml:space="preserve">Figure 6. Legal at 100% drift: score by budget, first-come-first-served vs skipping MIN/MAX-over-text queries.</w:t>
       </w:r>
     </w:p>
     <w:p>
@@ -2820,18 +2909,18 @@
           <wp:inline>
             <wp:extent cx="5334000" cy="2240280"/>
             <wp:effectExtent b="0" l="0" r="0" t="0"/>
-            <wp:docPr descr="Each policy’s mean score minus first-come-first-served, per corpus." title="" id="39" name="Picture"/>
+            <wp:docPr descr="Each policy’s mean score minus first-come-first-served, per corpus." title="" id="42" name="Picture"/>
             <a:graphic>
               <a:graphicData uri="http://schemas.openxmlformats.org/drawingml/2006/picture">
                 <pic:pic>
                   <pic:nvPicPr>
-                    <pic:cNvPr descr="figures/rq3_policies.png" id="40" name="Picture"/>
+                    <pic:cNvPr descr="figures/rq3_policies.png" id="43" name="Picture"/>
                     <pic:cNvPicPr>
                       <a:picLocks noChangeArrowheads="1" noChangeAspect="1"/>
                     </pic:cNvPicPr>
                   </pic:nvPicPr>
                   <pic:blipFill>
-                    <a:blip r:embed="rId38"/>
+                    <a:blip r:embed="rId41"/>
                     <a:stretch>
                       <a:fillRect/>
                     </a:stretch>
@@ -2865,7 +2954,7 @@
           <w:iCs/>
           <w:i/>
         </w:rPr>
-        <w:t xml:space="preserve">Figure 6. Each policy’s mean score minus first-come-first-served, per corpus.</w:t>
+        <w:t xml:space="preserve">Figure 7. Each policy’s mean score minus first-come-first-served, per corpus.</w:t>
       </w:r>
     </w:p>
     <w:p>
@@ -2923,8 +3012,8 @@
         </w:pict>
       </w:r>
     </w:p>
-    <w:bookmarkEnd w:id="41"/>
-    <w:bookmarkStart w:id="45" w:name="X5722249a796b26fcc2ef85b7f325a424b6509e1"/>
+    <w:bookmarkEnd w:id="44"/>
+    <w:bookmarkStart w:id="48" w:name="X5722249a796b26fcc2ef85b7f325a424b6509e1"/>
     <w:p>
       <w:pPr>
         <w:pStyle w:val="Heading2"/>
@@ -3225,18 +3314,18 @@
           <wp:inline>
             <wp:extent cx="5334000" cy="1648690"/>
             <wp:effectExtent b="0" l="0" r="0" t="0"/>
-            <wp:docPr descr="Wasted extraction tokens by SQL-visible signal." title="" id="43" name="Picture"/>
+            <wp:docPr descr="Wasted extraction tokens by SQL-visible signal." title="" id="46" name="Picture"/>
             <a:graphic>
               <a:graphicData uri="http://schemas.openxmlformats.org/drawingml/2006/picture">
                 <pic:pic>
                   <pic:nvPicPr>
-                    <pic:cNvPr descr="figures/rq4_signals.png" id="44" name="Picture"/>
+                    <pic:cNvPr descr="figures/rq4_signals.png" id="47" name="Picture"/>
                     <pic:cNvPicPr>
                       <a:picLocks noChangeArrowheads="1" noChangeAspect="1"/>
                     </pic:cNvPicPr>
                   </pic:nvPicPr>
                   <pic:blipFill>
-                    <a:blip r:embed="rId42"/>
+                    <a:blip r:embed="rId45"/>
                     <a:stretch>
                       <a:fillRect/>
                     </a:stretch>
@@ -3270,7 +3359,7 @@
           <w:iCs/>
           <w:i/>
         </w:rPr>
-        <w:t xml:space="preserve">Figure 7. Wasted extraction tokens by SQL-visible signal.</w:t>
+        <w:t xml:space="preserve">Figure 8. Wasted extraction tokens by SQL-visible signal.</w:t>
       </w:r>
     </w:p>
     <w:p>
@@ -3322,8 +3411,8 @@
         </w:pict>
       </w:r>
     </w:p>
-    <w:bookmarkEnd w:id="45"/>
-    <w:bookmarkStart w:id="49" w:name="Xe8b3b4dee71c336614042affb4d375ab12ca1b7"/>
+    <w:bookmarkEnd w:id="48"/>
+    <w:bookmarkStart w:id="52" w:name="Xe8b3b4dee71c336614042affb4d375ab12ca1b7"/>
     <w:p>
       <w:pPr>
         <w:pStyle w:val="Heading2"/>
@@ -3714,18 +3803,18 @@
           <wp:inline>
             <wp:extent cx="5334000" cy="2726266"/>
             <wp:effectExtent b="0" l="0" r="0" t="0"/>
-            <wp:docPr descr="Score vs tokens for planner configurations and single shared passes (player)." title="" id="47" name="Picture"/>
+            <wp:docPr descr="Score vs tokens for planner configurations and single shared passes (player)." title="" id="50" name="Picture"/>
             <a:graphic>
               <a:graphicData uri="http://schemas.openxmlformats.org/drawingml/2006/picture">
                 <pic:pic>
                   <pic:nvPicPr>
-                    <pic:cNvPr descr="figures/rq5_planner.png" id="48" name="Picture"/>
+                    <pic:cNvPr descr="figures/rq5_planner.png" id="51" name="Picture"/>
                     <pic:cNvPicPr>
                       <a:picLocks noChangeArrowheads="1" noChangeAspect="1"/>
                     </pic:cNvPicPr>
                   </pic:nvPicPr>
                   <pic:blipFill>
-                    <a:blip r:embed="rId46"/>
+                    <a:blip r:embed="rId49"/>
                     <a:stretch>
                       <a:fillRect/>
                     </a:stretch>
@@ -3759,7 +3848,7 @@
           <w:iCs/>
           <w:i/>
         </w:rPr>
-        <w:t xml:space="preserve">Figure 8. Score vs tokens for planner configurations and single shared passes (player).</w:t>
+        <w:t xml:space="preserve">Figure 9. Score vs tokens for planner configurations and single shared passes (player).</w:t>
       </w:r>
     </w:p>
     <w:p>
@@ -3823,8 +3912,8 @@
         </w:pict>
       </w:r>
     </w:p>
-    <w:bookmarkEnd w:id="49"/>
-    <w:bookmarkStart w:id="53" w:name="Xe9a8932c350571f932f195ad307ddbaa6c29e8e"/>
+    <w:bookmarkEnd w:id="52"/>
+    <w:bookmarkStart w:id="56" w:name="Xe9a8932c350571f932f195ad307ddbaa6c29e8e"/>
     <w:p>
       <w:pPr>
         <w:pStyle w:val="Heading2"/>
@@ -3936,18 +4025,18 @@
           <wp:inline>
             <wp:extent cx="5334000" cy="2252133"/>
             <wp:effectExtent b="0" l="0" r="0" t="0"/>
-            <wp:docPr descr="Cells that differ between budgeted and unlimited streams, by kind (log scale)." title="" id="51" name="Picture"/>
+            <wp:docPr descr="Cells that differ between budgeted and unlimited streams, by kind (log scale)." title="" id="54" name="Picture"/>
             <a:graphic>
               <a:graphicData uri="http://schemas.openxmlformats.org/drawingml/2006/picture">
                 <pic:pic>
                   <pic:nvPicPr>
-                    <pic:cNvPr descr="figures/rq6_cells.png" id="52" name="Picture"/>
+                    <pic:cNvPr descr="figures/rq6_cells.png" id="55" name="Picture"/>
                     <pic:cNvPicPr>
                       <a:picLocks noChangeArrowheads="1" noChangeAspect="1"/>
                     </pic:cNvPicPr>
                   </pic:nvPicPr>
                   <pic:blipFill>
-                    <a:blip r:embed="rId50"/>
+                    <a:blip r:embed="rId53"/>
                     <a:stretch>
                       <a:fillRect/>
                     </a:stretch>
@@ -3981,7 +4070,7 @@
           <w:iCs/>
           <w:i/>
         </w:rPr>
-        <w:t xml:space="preserve">Figure 9. Cells that differ between budgeted and unlimited streams, by kind (log scale).</w:t>
+        <w:t xml:space="preserve">Figure 10. Cells that differ between budgeted and unlimited streams, by kind (log scale).</w:t>
       </w:r>
     </w:p>
     <w:p>
@@ -4033,8 +4122,8 @@
         </w:pict>
       </w:r>
     </w:p>
-    <w:bookmarkEnd w:id="53"/>
-    <w:bookmarkStart w:id="57" w:name="Xdc29460b1fb7bc7d935a35e4e1ce23be79b2d07"/>
+    <w:bookmarkEnd w:id="56"/>
+    <w:bookmarkStart w:id="60" w:name="Xdc29460b1fb7bc7d935a35e4e1ce23be79b2d07"/>
     <w:p>
       <w:pPr>
         <w:pStyle w:val="Heading2"/>
@@ -4356,18 +4445,18 @@
           <wp:inline>
             <wp:extent cx="5334000" cy="1559169"/>
             <wp:effectExtent b="0" l="0" r="0" t="0"/>
-            <wp:docPr descr="Three models: single pass, and patched vs static at 100% drift." title="" id="55" name="Picture"/>
+            <wp:docPr descr="Three models: single pass, and patched vs static at 100% drift." title="" id="58" name="Picture"/>
             <a:graphic>
               <a:graphicData uri="http://schemas.openxmlformats.org/drawingml/2006/picture">
                 <pic:pic>
                   <pic:nvPicPr>
-                    <pic:cNvPr descr="figures/rq7_models.png" id="56" name="Picture"/>
+                    <pic:cNvPr descr="figures/rq7_models.png" id="59" name="Picture"/>
                     <pic:cNvPicPr>
                       <a:picLocks noChangeArrowheads="1" noChangeAspect="1"/>
                     </pic:cNvPicPr>
                   </pic:nvPicPr>
                   <pic:blipFill>
-                    <a:blip r:embed="rId54"/>
+                    <a:blip r:embed="rId57"/>
                     <a:stretch>
                       <a:fillRect/>
                     </a:stretch>
@@ -4401,7 +4490,7 @@
           <w:iCs/>
           <w:i/>
         </w:rPr>
-        <w:t xml:space="preserve">Figure 10. Three models: single pass, and patched vs static at 100% drift.</w:t>
+        <w:t xml:space="preserve">Figure 11. Three models: single pass, and patched vs static at 100% drift.</w:t>
       </w:r>
     </w:p>
     <w:p>
@@ -4453,8 +4542,8 @@
         </w:pict>
       </w:r>
     </w:p>
-    <w:bookmarkEnd w:id="57"/>
-    <w:bookmarkStart w:id="64" w:name="X7120b8bd2634908d82c5ef655f8b5faf4a3d922"/>
+    <w:bookmarkEnd w:id="60"/>
+    <w:bookmarkStart w:id="67" w:name="X7120b8bd2634908d82c5ef655f8b5faf4a3d922"/>
     <w:p>
       <w:pPr>
         <w:pStyle w:val="Heading2"/>
@@ -4854,18 +4943,18 @@
           <wp:inline>
             <wp:extent cx="5334000" cy="2384611"/>
             <wp:effectExtent b="0" l="0" r="0" t="0"/>
-            <wp:docPr descr="Structure F2 vs cell F1 per corpus, with on-demand patching at 100% drift." title="" id="59" name="Picture"/>
+            <wp:docPr descr="Structure F2 vs cell F1 per corpus, with on-demand patching at 100% drift." title="" id="62" name="Picture"/>
             <a:graphic>
               <a:graphicData uri="http://schemas.openxmlformats.org/drawingml/2006/picture">
                 <pic:pic>
                   <pic:nvPicPr>
-                    <pic:cNvPr descr="figures/rq8_bottleneck.png" id="60" name="Picture"/>
+                    <pic:cNvPr descr="figures/rq8_bottleneck.png" id="63" name="Picture"/>
                     <pic:cNvPicPr>
                       <a:picLocks noChangeArrowheads="1" noChangeAspect="1"/>
                     </pic:cNvPicPr>
                   </pic:nvPicPr>
                   <pic:blipFill>
-                    <a:blip r:embed="rId58"/>
+                    <a:blip r:embed="rId61"/>
                     <a:stretch>
                       <a:fillRect/>
                     </a:stretch>
@@ -4899,7 +4988,7 @@
           <w:iCs/>
           <w:i/>
         </w:rPr>
-        <w:t xml:space="preserve">Figure 11. Structure F2 vs cell F1 per corpus, with on-demand patching at 100% drift.</w:t>
+        <w:t xml:space="preserve">Figure 12. Structure F2 vs cell F1 per corpus, with on-demand patching at 100% drift.</w:t>
       </w:r>
     </w:p>
     <w:p>
@@ -5016,18 +5105,18 @@
           <wp:inline>
             <wp:extent cx="5334000" cy="2761129"/>
             <wp:effectExtent b="0" l="0" r="0" t="0"/>
-            <wp:docPr descr="Exact vs lenient agreement for the ten columns with the largest gap." title="" id="62" name="Picture"/>
+            <wp:docPr descr="Exact vs lenient agreement for the ten columns with the largest gap." title="" id="65" name="Picture"/>
             <a:graphic>
               <a:graphicData uri="http://schemas.openxmlformats.org/drawingml/2006/picture">
                 <pic:pic>
                   <pic:nvPicPr>
-                    <pic:cNvPr descr="figures/rq8_form.png" id="63" name="Picture"/>
+                    <pic:cNvPr descr="figures/rq8_form.png" id="66" name="Picture"/>
                     <pic:cNvPicPr>
                       <a:picLocks noChangeArrowheads="1" noChangeAspect="1"/>
                     </pic:cNvPicPr>
                   </pic:nvPicPr>
                   <pic:blipFill>
-                    <a:blip r:embed="rId61"/>
+                    <a:blip r:embed="rId64"/>
                     <a:stretch>
                       <a:fillRect/>
                     </a:stretch>
@@ -5061,7 +5150,7 @@
           <w:iCs/>
           <w:i/>
         </w:rPr>
-        <w:t xml:space="preserve">Figure 12. Exact vs lenient agreement for the ten columns with the largest gap.</w:t>
+        <w:t xml:space="preserve">Figure 13. Exact vs lenient agreement for the ten columns with the largest gap.</w:t>
       </w:r>
     </w:p>
     <w:p>
@@ -5137,8 +5226,8 @@
         </w:pict>
       </w:r>
     </w:p>
-    <w:bookmarkEnd w:id="64"/>
-    <w:bookmarkStart w:id="68" w:name="comparison-with-docetl"/>
+    <w:bookmarkEnd w:id="67"/>
+    <w:bookmarkStart w:id="71" w:name="comparison-with-docetl"/>
     <w:p>
       <w:pPr>
         <w:pStyle w:val="Heading2"/>
@@ -5788,18 +5877,18 @@
           <wp:inline>
             <wp:extent cx="5334000" cy="1723292"/>
             <wp:effectExtent b="0" l="0" r="0" t="0"/>
-            <wp:docPr descr="Ours vs DocETL per corpus (left) and on player by number of joins (right)." title="" id="66" name="Picture"/>
+            <wp:docPr descr="Ours vs DocETL per corpus (left) and on player by number of joins (right)." title="" id="69" name="Picture"/>
             <a:graphic>
               <a:graphicData uri="http://schemas.openxmlformats.org/drawingml/2006/picture">
                 <pic:pic>
                   <pic:nvPicPr>
-                    <pic:cNvPr descr="figures/docetl.png" id="67" name="Picture"/>
+                    <pic:cNvPr descr="figures/docetl.png" id="70" name="Picture"/>
                     <pic:cNvPicPr>
                       <a:picLocks noChangeArrowheads="1" noChangeAspect="1"/>
                     </pic:cNvPicPr>
                   </pic:nvPicPr>
                   <pic:blipFill>
-                    <a:blip r:embed="rId65"/>
+                    <a:blip r:embed="rId68"/>
                     <a:stretch>
                       <a:fillRect/>
                     </a:stretch>
@@ -5833,7 +5922,7 @@
           <w:iCs/>
           <w:i/>
         </w:rPr>
-        <w:t xml:space="preserve">Figure 13. Ours vs DocETL per corpus (left) and on player by number of joins (right).</w:t>
+        <w:t xml:space="preserve">Figure 14. Ours vs DocETL per corpus (left) and on player by number of joins (right).</w:t>
       </w:r>
     </w:p>
     <w:p>
@@ -5880,8 +5969,8 @@
         <w:t xml:space="preserve">Legal is 16 of 30 queries (DocETL takes about 3 hours per legal query); the other corpora are complete.</w:t>
       </w:r>
     </w:p>
-    <w:bookmarkEnd w:id="68"/>
-    <w:bookmarkEnd w:id="69"/>
+    <w:bookmarkEnd w:id="71"/>
+    <w:bookmarkEnd w:id="72"/>
     <w:sectPr/>
   </w:body>
 </w:document>

</xml_diff>

<commit_message>
DocETL complete on all 326 drift test queries (legal 30/30: 0.040 vs 0.114, 14x tokens); E12 med runs
Co-Authored-By: Claude Opus 5.5 <noreply@anthropic.com>
</commit_message>
<xml_diff>
--- a/results/experiments/RESULTS_PAPER.docx
+++ b/results/experiments/RESULTS_PAPER.docx
@@ -5790,79 +5790,79 @@
               <w:jc w:val="left"/>
             </w:pPr>
             <w:r>
-              <w:t xml:space="preserve">16 of 30</w:t>
-            </w:r>
-          </w:p>
-        </w:tc>
-        <w:tc>
-          <w:tcPr/>
-          <w:p>
-            <w:pPr>
-              <w:pStyle w:val="Compact"/>
-              <w:jc w:val="left"/>
-            </w:pPr>
-            <w:r>
-              <w:t xml:space="preserve">0.046</w:t>
-            </w:r>
-          </w:p>
-        </w:tc>
-        <w:tc>
-          <w:tcPr/>
-          <w:p>
-            <w:pPr>
-              <w:pStyle w:val="Compact"/>
-              <w:jc w:val="left"/>
-            </w:pPr>
-            <w:r>
-              <w:t xml:space="preserve">0.147</w:t>
-            </w:r>
-          </w:p>
-        </w:tc>
-        <w:tc>
-          <w:tcPr/>
-          <w:p>
-            <w:pPr>
-              <w:pStyle w:val="Compact"/>
-              <w:jc w:val="left"/>
-            </w:pPr>
-            <w:r>
-              <w:t xml:space="preserve">+0.101 (0.046 – 0.165)</w:t>
-            </w:r>
-          </w:p>
-        </w:tc>
-        <w:tc>
-          <w:tcPr/>
-          <w:p>
-            <w:pPr>
-              <w:pStyle w:val="Compact"/>
-              <w:jc w:val="left"/>
-            </w:pPr>
-            <w:r>
-              <w:t xml:space="preserve">269.1M</w:t>
-            </w:r>
-          </w:p>
-        </w:tc>
-        <w:tc>
-          <w:tcPr/>
-          <w:p>
-            <w:pPr>
-              <w:pStyle w:val="Compact"/>
-              <w:jc w:val="left"/>
-            </w:pPr>
-            <w:r>
-              <w:t xml:space="preserve">26.73M</w:t>
-            </w:r>
-          </w:p>
-        </w:tc>
-        <w:tc>
-          <w:tcPr/>
-          <w:p>
-            <w:pPr>
-              <w:pStyle w:val="Compact"/>
-              <w:jc w:val="left"/>
-            </w:pPr>
-            <w:r>
-              <w:t xml:space="preserve">10×</w:t>
+              <w:t xml:space="preserve">30</w:t>
+            </w:r>
+          </w:p>
+        </w:tc>
+        <w:tc>
+          <w:tcPr/>
+          <w:p>
+            <w:pPr>
+              <w:pStyle w:val="Compact"/>
+              <w:jc w:val="left"/>
+            </w:pPr>
+            <w:r>
+              <w:t xml:space="preserve">0.040</w:t>
+            </w:r>
+          </w:p>
+        </w:tc>
+        <w:tc>
+          <w:tcPr/>
+          <w:p>
+            <w:pPr>
+              <w:pStyle w:val="Compact"/>
+              <w:jc w:val="left"/>
+            </w:pPr>
+            <w:r>
+              <w:t xml:space="preserve">0.114</w:t>
+            </w:r>
+          </w:p>
+        </w:tc>
+        <w:tc>
+          <w:tcPr/>
+          <w:p>
+            <w:pPr>
+              <w:pStyle w:val="Compact"/>
+              <w:jc w:val="left"/>
+            </w:pPr>
+            <w:r>
+              <w:t xml:space="preserve">+0.075 (0.029 – 0.124)</w:t>
+            </w:r>
+          </w:p>
+        </w:tc>
+        <w:tc>
+          <w:tcPr/>
+          <w:p>
+            <w:pPr>
+              <w:pStyle w:val="Compact"/>
+              <w:jc w:val="left"/>
+            </w:pPr>
+            <w:r>
+              <w:t xml:space="preserve">475.1M</w:t>
+            </w:r>
+          </w:p>
+        </w:tc>
+        <w:tc>
+          <w:tcPr/>
+          <w:p>
+            <w:pPr>
+              <w:pStyle w:val="Compact"/>
+              <w:jc w:val="left"/>
+            </w:pPr>
+            <w:r>
+              <w:t xml:space="preserve">34.49M</w:t>
+            </w:r>
+          </w:p>
+        </w:tc>
+        <w:tc>
+          <w:tcPr/>
+          <w:p>
+            <w:pPr>
+              <w:pStyle w:val="Compact"/>
+              <w:jc w:val="left"/>
+            </w:pPr>
+            <w:r>
+              <w:t xml:space="preserve">14×</w:t>
             </w:r>
           </w:p>
         </w:tc>
@@ -5966,7 +5966,7 @@
         <w:t xml:space="preserve"> </w:t>
       </w:r>
       <w:r>
-        <w:t xml:space="preserve">Legal is 16 of 30 queries (DocETL takes about 3 hours per legal query); the other corpora are complete.</w:t>
+        <w:t xml:space="preserve">All 326 drift test queries on the five corpora; one model.</w:t>
       </w:r>
     </w:p>
     <w:bookmarkEnd w:id="71"/>

</xml_diff>

<commit_message>
E12 complete on all five corpora (18 runs): drift result holds; med 0% drop traced to prompt grouping of the join key
Co-Authored-By: Claude Opus 5.5 <noreply@anthropic.com>
</commit_message>
<xml_diff>
--- a/results/experiments/RESULTS_PAPER.docx
+++ b/results/experiments/RESULTS_PAPER.docx
@@ -962,25 +962,43 @@
         <w:t xml:space="preserve"> </w:t>
       </w:r>
       <w:r>
-        <w:t xml:space="preserve">or 50% of its queries (same test queries) leaves more columns to the patches (art at 10%: 14 new columns instead of</w:t>
-      </w:r>
-      <w:r>
-        <w:t xml:space="preserve"> </w:t>
-      </w:r>
-      <w:r>
-        <w:t xml:space="preserve">9). Static still collapses at 100% drift (0.000–0.043), the patched curve stays within 0.025 of its 0% score, and no</w:t>
-      </w:r>
-      <w:r>
-        <w:t xml:space="preserve"> </w:t>
-      </w:r>
-      <w:r>
-        <w:t xml:space="preserve">100% − 0% difference is significant (−0.015 to +0.014). The cost moves from the build to the patches and grows: art</w:t>
-      </w:r>
-      <w:r>
-        <w:t xml:space="preserve"> </w:t>
-      </w:r>
-      <w:r>
-        <w:t xml:space="preserve">at 10% saves 1.0M build tokens but adds 2.6M patch tokens (+19% total); cspaper +23%, player +7%.</w:t>
+        <w:t xml:space="preserve">or 50% of its queries (same test queries; 18 runs over the five corpora) leaves more columns to the patches (art at</w:t>
+      </w:r>
+      <w:r>
+        <w:t xml:space="preserve"> </w:t>
+      </w:r>
+      <w:r>
+        <w:t xml:space="preserve">10%: 14 new columns instead of 9). Static still collapses at 100% drift (0.000–0.043), the patched curve stays within</w:t>
+      </w:r>
+      <w:r>
+        <w:t xml:space="preserve"> </w:t>
+      </w:r>
+      <w:r>
+        <w:t xml:space="preserve">0.025 of its 0% score, and no 100% − 0% difference is significant (−0.015 to +0.014). The cost moves from the build to</w:t>
+      </w:r>
+      <w:r>
+        <w:t xml:space="preserve"> </w:t>
+      </w:r>
+      <w:r>
+        <w:t xml:space="preserve">the patches and grows: art at 10% saves 1.0M build tokens but adds 2.6M patch tokens (+19% total); cspaper +23%, med</w:t>
+      </w:r>
+      <w:r>
+        <w:t xml:space="preserve"> </w:t>
+      </w:r>
+      <w:r>
+        <w:t xml:space="preserve">+19%, legal +12%, player +7%. The 0% score itself shifts with the share (med 0.095 → 0.062–0.077), because the build</w:t>
+      </w:r>
+      <w:r>
+        <w:t xml:space="preserve"> </w:t>
+      </w:r>
+      <w:r>
+        <w:t xml:space="preserve">groups columns into prompts by workload: at 10–25% med’s join key is read in a 2–3-column prompt and left empty on</w:t>
+      </w:r>
+      <w:r>
+        <w:t xml:space="preserve"> </w:t>
+      </w:r>
+      <w:r>
+        <w:t xml:space="preserve">half the documents, against 12% in the full build (see RQ2).</w:t>
       </w:r>
     </w:p>
     <w:p>
@@ -990,7 +1008,7 @@
       <w:r>
         <w:drawing>
           <wp:inline>
-            <wp:extent cx="5334000" cy="1635760"/>
+            <wp:extent cx="5334000" cy="2915920"/>
             <wp:effectExtent b="0" l="0" r="0" t="0"/>
             <wp:docPr descr="The drift result for build workloads cut to 10–50% of their queries." title="" id="28" name="Picture"/>
             <a:graphic>
@@ -1011,7 +1029,7 @@
                   <pic:spPr bwMode="auto">
                     <a:xfrm>
                       <a:off x="0" y="0"/>
-                      <a:ext cx="5334000" cy="1635760"/>
+                      <a:ext cx="5334000" cy="2915920"/>
                     </a:xfrm>
                     <a:prstGeom prst="rect">
                       <a:avLst/>
@@ -1037,7 +1055,7 @@
           <w:iCs/>
           <w:i/>
         </w:rPr>
-        <w:t xml:space="preserve">Figure 3. The drift result for build workloads cut to 10–50% of their queries (cspaper, player, art).</w:t>
+        <w:t xml:space="preserve">Figure 3. The drift result for build workloads cut to 10–50% of their queries (all five corpora).</w:t>
       </w:r>
     </w:p>
     <w:p>
@@ -1569,7 +1587,7 @@
         <w:t xml:space="preserve"> </w:t>
       </w:r>
       <w:r>
-        <w:t xml:space="preserve">Five corpora, all drift levels, one model; four draws of the withheld columns on cspaper and player; three smaller build workloads on cspaper, player and art;</w:t>
+        <w:t xml:space="preserve">Five corpora, all drift levels, one model; four draws of the withheld columns on cspaper and player; three smaller build workloads on all five corpora;</w:t>
       </w:r>
       <w:r>
         <w:t xml:space="preserve"> </w:t>
@@ -2066,6 +2084,57 @@
       </w:r>
       <w:r>
         <w:t xml:space="preserve">mostly filled (legal, player) and hurts where it is often empty (art, med).</w:t>
+      </w:r>
+    </w:p>
+    <w:p>
+      <w:pPr>
+        <w:pStyle w:val="BodyText"/>
+      </w:pPr>
+      <w:r>
+        <w:t xml:space="preserve">The direction is not even fixed per column. In the smaller-workload builds of RQ1 (E12), med’s join key</w:t>
+      </w:r>
+      <w:r>
+        <w:t xml:space="preserve"> </w:t>
+      </w:r>
+      <w:r>
+        <w:rPr>
+          <w:rStyle w:val="VerbatimChar"/>
+        </w:rPr>
+        <w:t xml:space="preserve">disease.disease_name</w:t>
+      </w:r>
+      <w:r>
+        <w:t xml:space="preserve"> </w:t>
+      </w:r>
+      <w:r>
+        <w:t xml:space="preserve">read with 1–2 other columns is left</w:t>
+      </w:r>
+      <w:r>
+        <w:t xml:space="preserve"> </w:t>
+      </w:r>
+      <w:r>
+        <w:rPr>
+          <w:iCs/>
+          <w:i/>
+        </w:rPr>
+        <w:t xml:space="preserve">empty</w:t>
+      </w:r>
+      <w:r>
+        <w:t xml:space="preserve"> </w:t>
+      </w:r>
+      <w:r>
+        <w:t xml:space="preserve">on half the documents, against 12% when read with</w:t>
+      </w:r>
+      <w:r>
+        <w:t xml:space="preserve"> </w:t>
+      </w:r>
+      <w:r>
+        <w:t xml:space="preserve">8–11 other disease columns; the wide prompt fills it, often with every disease the article mentions. What a prompt’s</w:t>
+      </w:r>
+      <w:r>
+        <w:t xml:space="preserve"> </w:t>
+      </w:r>
+      <w:r>
+        <w:t xml:space="preserve">other columns do to a column is unpredictable in sign, which is a further reason not to tune width.</w:t>
       </w:r>
     </w:p>
     <w:p>

</xml_diff>

<commit_message>
E3.1 recorded: offline knapsack is not better than fcfs (cost and value depend on patch order); policies figure with knapsack; E13 runs so far
Co-Authored-By: Claude Opus 5.5 <noreply@anthropic.com>
</commit_message>
<xml_diff>
--- a/results/experiments/RESULTS_PAPER.docx
+++ b/results/experiments/RESULTS_PAPER.docx
@@ -2942,6 +2942,84 @@
           </w:p>
         </w:tc>
       </w:tr>
+      <w:tr>
+        <w:tc>
+          <w:tcPr/>
+          <w:p>
+            <w:pPr>
+              <w:pStyle w:val="Compact"/>
+              <w:jc w:val="left"/>
+            </w:pPr>
+            <w:r>
+              <w:t xml:space="preserve">Offline knapsack over patches (whole stream known)</w:t>
+            </w:r>
+          </w:p>
+        </w:tc>
+        <w:tc>
+          <w:tcPr/>
+          <w:p>
+            <w:pPr>
+              <w:pStyle w:val="Compact"/>
+              <w:jc w:val="left"/>
+            </w:pPr>
+            <w:r>
+              <w:t xml:space="preserve">0.1369</w:t>
+            </w:r>
+          </w:p>
+        </w:tc>
+        <w:tc>
+          <w:tcPr/>
+          <w:p>
+            <w:pPr>
+              <w:pStyle w:val="Compact"/>
+              <w:jc w:val="left"/>
+            </w:pPr>
+            <w:r>
+              <w:rPr>
+                <w:bCs/>
+                <w:b/>
+              </w:rPr>
+              <w:t xml:space="preserve">0.3389</w:t>
+            </w:r>
+          </w:p>
+        </w:tc>
+        <w:tc>
+          <w:tcPr/>
+          <w:p>
+            <w:pPr>
+              <w:pStyle w:val="Compact"/>
+              <w:jc w:val="left"/>
+            </w:pPr>
+            <w:r>
+              <w:t xml:space="preserve">0.2306</w:t>
+            </w:r>
+          </w:p>
+        </w:tc>
+        <w:tc>
+          <w:tcPr/>
+          <w:p>
+            <w:pPr>
+              <w:pStyle w:val="Compact"/>
+              <w:jc w:val="left"/>
+            </w:pPr>
+            <w:r>
+              <w:t xml:space="preserve">0.1128 (156M)</w:t>
+            </w:r>
+          </w:p>
+        </w:tc>
+        <w:tc>
+          <w:tcPr/>
+          <w:p>
+            <w:pPr>
+              <w:pStyle w:val="Compact"/>
+              <w:jc w:val="left"/>
+            </w:pPr>
+            <w:r>
+              <w:t xml:space="preserve">0.0827 (127M)</w:t>
+            </w:r>
+          </w:p>
+        </w:tc>
+      </w:tr>
     </w:tbl>
     <w:p>
       <w:pPr>
@@ -2967,6 +3045,54 @@
       </w:r>
       <w:r>
         <w:t xml:space="preserve">the share of patch tokens that bought nothing: none on player, about a third on legal and med.</w:t>
+      </w:r>
+    </w:p>
+    <w:p>
+      <w:pPr>
+        <w:pStyle w:val="BodyText"/>
+      </w:pPr>
+      <w:r>
+        <w:rPr>
+          <w:iCs/>
+          <w:i/>
+        </w:rPr>
+        <w:t xml:space="preserve">Even hindsight does not give a better fixed plan.</w:t>
+      </w:r>
+      <w:r>
+        <w:t xml:space="preserve"> </w:t>
+      </w:r>
+      <w:r>
+        <w:t xml:space="preserve">An offline 0/1 knapsack that knows the whole stream and picks the</w:t>
+      </w:r>
+      <w:r>
+        <w:t xml:space="preserve"> </w:t>
+      </w:r>
+      <w:r>
+        <w:t xml:space="preserve">patches with the most measured value per budget is not better overall (−0.008 to +0.003 against first-come-first-served).</w:t>
+      </w:r>
+      <w:r>
+        <w:t xml:space="preserve"> </w:t>
+      </w:r>
+      <w:r>
+        <w:t xml:space="preserve">A patch’s cost and value both depend on the patches before it: without the earlier patches that made its filter</w:t>
+      </w:r>
+      <w:r>
+        <w:t xml:space="preserve"> </w:t>
+      </w:r>
+      <w:r>
+        <w:t xml:space="preserve">columns known, a chosen legal patch reads 570 documents instead of 57 (4.2M tokens instead of 0.14M) and no longer</w:t>
+      </w:r>
+      <w:r>
+        <w:t xml:space="preserve"> </w:t>
+      </w:r>
+      <w:r>
+        <w:t xml:space="preserve">fits; and gains measured with every other patch present are not additive. The knapsack does confirm how much budget</w:t>
+      </w:r>
+      <w:r>
+        <w:t xml:space="preserve"> </w:t>
+      </w:r>
+      <w:r>
+        <w:t xml:space="preserve">buys nothing: at the full budget it leaves 23–39% unspent on legal, med and cspaper at about the same score.</w:t>
       </w:r>
     </w:p>
     <w:p>
@@ -3047,7 +3173,13 @@
         <w:t xml:space="preserve"> </w:t>
       </w:r>
       <w:r>
-        <w:t xml:space="preserve">capture most of the value of hindsight; budget pacing and per-patch caps are not safe defaults.</w:t>
+        <w:t xml:space="preserve">capture most of the value of hindsight; budget pacing and per-patch caps are not safe defaults, and because patch costs and</w:t>
+      </w:r>
+      <w:r>
+        <w:t xml:space="preserve"> </w:t>
+      </w:r>
+      <w:r>
+        <w:t xml:space="preserve">values depend on order, an offline plan over patches is no substitute for deciding online.</w:t>
       </w:r>
     </w:p>
     <w:p>

</xml_diff>

<commit_message>
E13 ablations, E14 prompt factors (drift effect = prompt grouping), E6.3 32B drift curves recorded; Ablations section and figure; 32B server 8 slots on large GPUs
Co-Authored-By: Claude Opus 5.5 <noreply@anthropic.com>
</commit_message>
<xml_diff>
--- a/results/experiments/RESULTS_PAPER.docx
+++ b/results/experiments/RESULTS_PAPER.docx
@@ -2,7 +2,7 @@
 <file path=word/document.xml><?xml version="1.0" encoding="utf-8"?>
 <w:document xmlns:w="http://schemas.openxmlformats.org/wordprocessingml/2006/main" xmlns:m="http://schemas.openxmlformats.org/officeDocument/2006/math" xmlns:r="http://schemas.openxmlformats.org/officeDocument/2006/relationships" xmlns:o="urn:schemas-microsoft-com:office:office" xmlns:v="urn:schemas-microsoft-com:vml" xmlns:w10="urn:schemas-microsoft-com:office:word" xmlns:a="http://schemas.openxmlformats.org/drawingml/2006/main" xmlns:pic="http://schemas.openxmlformats.org/drawingml/2006/picture" xmlns:wp="http://schemas.openxmlformats.org/drawingml/2006/wordprocessingDrawing">
   <w:body>
-    <w:bookmarkStart w:id="72" w:name="answers-to-the-research-questions"/>
+    <w:bookmarkStart w:id="76" w:name="answers-to-the-research-questions"/>
     <w:p>
       <w:pPr>
         <w:pStyle w:val="Heading1"/>
@@ -802,13 +802,50 @@
         <w:t xml:space="preserve"> </w:t>
       </w:r>
       <w:r>
-        <w:t xml:space="preserve">stream does, because patches read under a query-specific prompt and only on the documents the query can select. With</w:t>
-      </w:r>
-      <w:r>
-        <w:t xml:space="preserve"> </w:t>
-      </w:r>
-      <w:r>
-        <w:t xml:space="preserve">a stronger model the rise becomes significant (Qwen 2.5 32B on cspaper: +0.062, 95% CI +0.019 to +0.113; RQ7).</w:t>
+        <w:t xml:space="preserve">stream does. It is a prompt effect, and we isolated it (see</w:t>
+      </w:r>
+      <w:r>
+        <w:t xml:space="preserve"> </w:t>
+      </w:r>
+      <w:r>
+        <w:rPr>
+          <w:iCs/>
+          <w:i/>
+        </w:rPr>
+        <w:t xml:space="preserve">Ablations</w:t>
+      </w:r>
+      <w:r>
+        <w:t xml:space="preserve">): giving patches exactly the build’s prompt</w:t>
+      </w:r>
+      <w:r>
+        <w:t xml:space="preserve"> </w:t>
+      </w:r>
+      <w:r>
+        <w:t xml:space="preserve">moves every corpus’s 100%-drift score to its 0%-drift score, and almost all of that is grouping. A patch asks for 1–3</w:t>
+      </w:r>
+      <w:r>
+        <w:t xml:space="preserve"> </w:t>
+      </w:r>
+      <w:r>
+        <w:t xml:space="preserve">columns, the build for all of a table’s new columns at once; fewer columns per prompt give better values on cspaper and</w:t>
+      </w:r>
+      <w:r>
+        <w:t xml:space="preserve"> </w:t>
+      </w:r>
+      <w:r>
+        <w:t xml:space="preserve">player and worse on art and med (RQ2). Which documents a patch reads contributes nothing. With the 32B model the same</w:t>
+      </w:r>
+      <w:r>
+        <w:t xml:space="preserve"> </w:t>
+      </w:r>
+      <w:r>
+        <w:t xml:space="preserve">effect is significant on cspaper (+0.062, 95% CI +0.019 to +0.113) and player (+0.020, +0.009 to +0.034) and absent on</w:t>
+      </w:r>
+      <w:r>
+        <w:t xml:space="preserve"> </w:t>
+      </w:r>
+      <w:r>
+        <w:t xml:space="preserve">art and med (RQ7): a corpus-specific gain from narrow prompts, not a benefit of drift.</w:t>
       </w:r>
     </w:p>
     <w:p>
@@ -4616,6 +4653,158 @@
           </w:p>
         </w:tc>
       </w:tr>
+      <w:tr>
+        <w:tc>
+          <w:tcPr/>
+          <w:p>
+            <w:pPr>
+              <w:pStyle w:val="Compact"/>
+              <w:jc w:val="left"/>
+            </w:pPr>
+            <w:r>
+              <w:t xml:space="preserve">player, patched at 0% → 100% drift</w:t>
+            </w:r>
+          </w:p>
+        </w:tc>
+        <w:tc>
+          <w:tcPr/>
+          <w:p>
+            <w:pPr>
+              <w:pStyle w:val="Compact"/>
+              <w:jc w:val="left"/>
+            </w:pPr>
+            <w:r>
+              <w:t xml:space="preserve">0.356 → 0.359</w:t>
+            </w:r>
+          </w:p>
+        </w:tc>
+        <w:tc>
+          <w:tcPr/>
+          <w:p>
+            <w:pPr>
+              <w:pStyle w:val="Compact"/>
+              <w:jc w:val="left"/>
+            </w:pPr>
+            <w:r>
+              <w:t xml:space="preserve">0.379 → 0.387</w:t>
+            </w:r>
+          </w:p>
+        </w:tc>
+        <w:tc>
+          <w:tcPr/>
+          <w:p>
+            <w:pPr>
+              <w:pStyle w:val="Compact"/>
+              <w:jc w:val="left"/>
+            </w:pPr>
+            <w:r>
+              <w:t xml:space="preserve">0.401 →</w:t>
+            </w:r>
+            <w:r>
+              <w:t xml:space="preserve"> </w:t>
+            </w:r>
+            <w:r>
+              <w:rPr>
+                <w:bCs/>
+                <w:b/>
+              </w:rPr>
+              <w:t xml:space="preserve">0.421</w:t>
+            </w:r>
+          </w:p>
+        </w:tc>
+      </w:tr>
+      <w:tr>
+        <w:tc>
+          <w:tcPr/>
+          <w:p>
+            <w:pPr>
+              <w:pStyle w:val="Compact"/>
+              <w:jc w:val="left"/>
+            </w:pPr>
+            <w:r>
+              <w:t xml:space="preserve">art, patched at 0% → 100% drift (static at 100%)</w:t>
+            </w:r>
+          </w:p>
+        </w:tc>
+        <w:tc>
+          <w:tcPr/>
+          <w:p>
+            <w:pPr>
+              <w:pStyle w:val="Compact"/>
+            </w:pPr>
+          </w:p>
+        </w:tc>
+        <w:tc>
+          <w:tcPr/>
+          <w:p>
+            <w:pPr>
+              <w:pStyle w:val="Compact"/>
+              <w:jc w:val="left"/>
+            </w:pPr>
+            <w:r>
+              <w:t xml:space="preserve">0.270 → 0.256 (0.031)</w:t>
+            </w:r>
+          </w:p>
+        </w:tc>
+        <w:tc>
+          <w:tcPr/>
+          <w:p>
+            <w:pPr>
+              <w:pStyle w:val="Compact"/>
+              <w:jc w:val="left"/>
+            </w:pPr>
+            <w:r>
+              <w:t xml:space="preserve">0.293 → 0.289 (0.031)</w:t>
+            </w:r>
+          </w:p>
+        </w:tc>
+      </w:tr>
+      <w:tr>
+        <w:tc>
+          <w:tcPr/>
+          <w:p>
+            <w:pPr>
+              <w:pStyle w:val="Compact"/>
+              <w:jc w:val="left"/>
+            </w:pPr>
+            <w:r>
+              <w:t xml:space="preserve">med, patched at 0% → 100% drift (static at 100%)</w:t>
+            </w:r>
+          </w:p>
+        </w:tc>
+        <w:tc>
+          <w:tcPr/>
+          <w:p>
+            <w:pPr>
+              <w:pStyle w:val="Compact"/>
+            </w:pPr>
+          </w:p>
+        </w:tc>
+        <w:tc>
+          <w:tcPr/>
+          <w:p>
+            <w:pPr>
+              <w:pStyle w:val="Compact"/>
+              <w:jc w:val="left"/>
+            </w:pPr>
+            <w:r>
+              <w:t xml:space="preserve">0.095 → 0.086 (0.031)</w:t>
+            </w:r>
+          </w:p>
+        </w:tc>
+        <w:tc>
+          <w:tcPr/>
+          <w:p>
+            <w:pPr>
+              <w:pStyle w:val="Compact"/>
+              <w:jc w:val="left"/>
+            </w:pPr>
+            <w:r>
+              <w:t xml:space="preserve">0.092 → 0.098 (0.050)</w:t>
+            </w:r>
+          </w:p>
+        </w:tc>
+      </w:tr>
     </w:tbl>
     <w:p>
       <w:pPr>
@@ -4723,6 +4912,42 @@
         <w:pStyle w:val="BodyText"/>
       </w:pPr>
       <w:r>
+        <w:t xml:space="preserve">The 32B model raises the 0%-drift score on every corpus (cspaper +0.028, player +0.022, art +0.023) except med</w:t>
+      </w:r>
+      <w:r>
+        <w:t xml:space="preserve"> </w:t>
+      </w:r>
+      <w:r>
+        <w:t xml:space="preserve">(−0.003). Its 100% − 0% difference is significant on cspaper and player only (+0.062, +0.020), the narrow-prompt effect</w:t>
+      </w:r>
+      <w:r>
+        <w:t xml:space="preserve"> </w:t>
+      </w:r>
+      <w:r>
+        <w:t xml:space="preserve">of the</w:t>
+      </w:r>
+      <w:r>
+        <w:t xml:space="preserve"> </w:t>
+      </w:r>
+      <w:r>
+        <w:rPr>
+          <w:iCs/>
+          <w:i/>
+        </w:rPr>
+        <w:t xml:space="preserve">Ablations</w:t>
+      </w:r>
+      <w:r>
+        <w:t xml:space="preserve"> </w:t>
+      </w:r>
+      <w:r>
+        <w:t xml:space="preserve">section, larger with the stronger model.</w:t>
+      </w:r>
+    </w:p>
+    <w:p>
+      <w:pPr>
+        <w:pStyle w:val="BodyText"/>
+      </w:pPr>
+      <w:r>
         <w:rPr>
           <w:bCs/>
           <w:b/>
@@ -4733,7 +4958,7 @@
         <w:t xml:space="preserve"> </w:t>
       </w:r>
       <w:r>
-        <w:t xml:space="preserve">Two corpora for the other models; quantization on one corpus.</w:t>
+        <w:t xml:space="preserve">Llama 8B on two corpora; Qwen 32B on four (legal running); quantization on one corpus.</w:t>
       </w:r>
     </w:p>
     <w:p>
@@ -5428,7 +5653,1036 @@
       </w:r>
     </w:p>
     <w:bookmarkEnd w:id="67"/>
-    <w:bookmarkStart w:id="71" w:name="comparison-with-docetl"/>
+    <w:bookmarkStart w:id="71" w:name="X4fbca8666ffa01dde183b623440658a29ce2a84"/>
+    <w:p>
+      <w:pPr>
+        <w:pStyle w:val="Heading2"/>
+      </w:pPr>
+      <w:r>
+        <w:t xml:space="preserve">Ablations: which parts of the system matter</w:t>
+      </w:r>
+    </w:p>
+    <w:p>
+      <w:pPr>
+        <w:pStyle w:val="FirstParagraph"/>
+      </w:pPr>
+      <w:r>
+        <w:rPr>
+          <w:bCs/>
+          <w:b/>
+        </w:rPr>
+        <w:t xml:space="preserve">Answer.</w:t>
+      </w:r>
+      <w:r>
+        <w:t xml:space="preserve"> </w:t>
+      </w:r>
+      <w:r>
+        <w:t xml:space="preserve">Three components carry accuracy: field descriptions in the extraction prompt (up to −0.136 without them),</w:t>
+      </w:r>
+      <w:r>
+        <w:t xml:space="preserve"> </w:t>
+      </w:r>
+      <w:r>
+        <w:t xml:space="preserve">normalizing values when they are stored (up to −0.131), and mapping free-text values to the workload’s forms in the</w:t>
+      </w:r>
+      <w:r>
+        <w:t xml:space="preserve"> </w:t>
+      </w:r>
+      <w:r>
+        <w:t xml:space="preserve">served view (−0.066 on art). Two carry cost: reusing patched columns (without it, 3.7–16.9× the tokens for the same</w:t>
+      </w:r>
+      <w:r>
+        <w:t xml:space="preserve"> </w:t>
+      </w:r>
+      <w:r>
+        <w:t xml:space="preserve">score) and restricting a patch to the documents the query can select (up to 1.46× without it). The rest (the</w:t>
+      </w:r>
+      <w:r>
+        <w:t xml:space="preserve"> </w:t>
+      </w:r>
+      <w:r>
+        <w:t xml:space="preserve">workload usage phrase, chained reading of long documents, batching other workload columns into a patch) change the</w:t>
+      </w:r>
+      <w:r>
+        <w:t xml:space="preserve"> </w:t>
+      </w:r>
+      <w:r>
+        <w:t xml:space="preserve">score by at most 0.015 in either direction.</w:t>
+      </w:r>
+    </w:p>
+    <w:p>
+      <w:pPr>
+        <w:pStyle w:val="BodyText"/>
+      </w:pPr>
+      <w:r>
+        <w:rPr>
+          <w:bCs/>
+          <w:b/>
+        </w:rPr>
+        <w:t xml:space="preserve">Evidence.</w:t>
+      </w:r>
+      <w:r>
+        <w:t xml:space="preserve"> </w:t>
+      </w:r>
+      <w:r>
+        <w:t xml:space="preserve">The unlimited stream at 100% drift with one component turned off, against the full system (paired</w:t>
+      </w:r>
+      <w:r>
+        <w:t xml:space="preserve"> </w:t>
+      </w:r>
+      <w:r>
+        <w:t xml:space="preserve">score change over each corpus’s test queries; * = 95% CI excludes 0):</w:t>
+      </w:r>
+    </w:p>
+    <w:tbl>
+      <w:tblPr>
+        <w:tblStyle w:val="Table"/>
+        <w:tblW w:type="pct" w:w="5000"/>
+        <w:tblLook w:firstRow="1" w:lastRow="0" w:firstColumn="0" w:lastColumn="0" w:noHBand="0" w:noVBand="0" w:val="0020"/>
+      </w:tblPr>
+      <w:tblGrid>
+        <w:gridCol w:w="1131"/>
+        <w:gridCol w:w="1131"/>
+        <w:gridCol w:w="1131"/>
+        <w:gridCol w:w="1131"/>
+        <w:gridCol w:w="1131"/>
+        <w:gridCol w:w="1131"/>
+        <w:gridCol w:w="1131"/>
+      </w:tblGrid>
+      <w:tr>
+        <w:trPr>
+          <w:tblHeader w:val="true"/>
+        </w:trPr>
+        <w:tc>
+          <w:tcPr/>
+          <w:p>
+            <w:pPr>
+              <w:pStyle w:val="Compact"/>
+              <w:jc w:val="left"/>
+            </w:pPr>
+            <w:r>
+              <w:t xml:space="preserve">Turned off</w:t>
+            </w:r>
+          </w:p>
+        </w:tc>
+        <w:tc>
+          <w:tcPr/>
+          <w:p>
+            <w:pPr>
+              <w:pStyle w:val="Compact"/>
+              <w:jc w:val="left"/>
+            </w:pPr>
+            <w:r>
+              <w:t xml:space="preserve">cspaper</w:t>
+            </w:r>
+          </w:p>
+        </w:tc>
+        <w:tc>
+          <w:tcPr/>
+          <w:p>
+            <w:pPr>
+              <w:pStyle w:val="Compact"/>
+              <w:jc w:val="left"/>
+            </w:pPr>
+            <w:r>
+              <w:t xml:space="preserve">player</w:t>
+            </w:r>
+          </w:p>
+        </w:tc>
+        <w:tc>
+          <w:tcPr/>
+          <w:p>
+            <w:pPr>
+              <w:pStyle w:val="Compact"/>
+              <w:jc w:val="left"/>
+            </w:pPr>
+            <w:r>
+              <w:t xml:space="preserve">art</w:t>
+            </w:r>
+          </w:p>
+        </w:tc>
+        <w:tc>
+          <w:tcPr/>
+          <w:p>
+            <w:pPr>
+              <w:pStyle w:val="Compact"/>
+              <w:jc w:val="left"/>
+            </w:pPr>
+            <w:r>
+              <w:t xml:space="preserve">med</w:t>
+            </w:r>
+          </w:p>
+        </w:tc>
+        <w:tc>
+          <w:tcPr/>
+          <w:p>
+            <w:pPr>
+              <w:pStyle w:val="Compact"/>
+              <w:jc w:val="left"/>
+            </w:pPr>
+            <w:r>
+              <w:t xml:space="preserve">legal</w:t>
+            </w:r>
+          </w:p>
+        </w:tc>
+        <w:tc>
+          <w:tcPr/>
+          <w:p>
+            <w:pPr>
+              <w:pStyle w:val="Compact"/>
+              <w:jc w:val="left"/>
+            </w:pPr>
+            <w:r>
+              <w:t xml:space="preserve">Patch tokens</w:t>
+            </w:r>
+          </w:p>
+        </w:tc>
+      </w:tr>
+      <w:tr>
+        <w:tc>
+          <w:tcPr/>
+          <w:p>
+            <w:pPr>
+              <w:pStyle w:val="Compact"/>
+              <w:jc w:val="left"/>
+            </w:pPr>
+            <w:r>
+              <w:t xml:space="preserve">Field descriptions</w:t>
+            </w:r>
+          </w:p>
+        </w:tc>
+        <w:tc>
+          <w:tcPr/>
+          <w:p>
+            <w:pPr>
+              <w:pStyle w:val="Compact"/>
+              <w:jc w:val="left"/>
+            </w:pPr>
+            <w:r>
+              <w:t xml:space="preserve">−0.034*</w:t>
+            </w:r>
+          </w:p>
+        </w:tc>
+        <w:tc>
+          <w:tcPr/>
+          <w:p>
+            <w:pPr>
+              <w:pStyle w:val="Compact"/>
+              <w:jc w:val="left"/>
+            </w:pPr>
+            <w:r>
+              <w:t xml:space="preserve">−0.136*</w:t>
+            </w:r>
+          </w:p>
+        </w:tc>
+        <w:tc>
+          <w:tcPr/>
+          <w:p>
+            <w:pPr>
+              <w:pStyle w:val="Compact"/>
+              <w:jc w:val="left"/>
+            </w:pPr>
+            <w:r>
+              <w:t xml:space="preserve">−0.101*</w:t>
+            </w:r>
+          </w:p>
+        </w:tc>
+        <w:tc>
+          <w:tcPr/>
+          <w:p>
+            <w:pPr>
+              <w:pStyle w:val="Compact"/>
+              <w:jc w:val="left"/>
+            </w:pPr>
+            <w:r>
+              <w:t xml:space="preserve">+0.005</w:t>
+            </w:r>
+          </w:p>
+        </w:tc>
+        <w:tc>
+          <w:tcPr/>
+          <w:p>
+            <w:pPr>
+              <w:pStyle w:val="Compact"/>
+              <w:jc w:val="left"/>
+            </w:pPr>
+            <w:r>
+              <w:t xml:space="preserve">−0.034</w:t>
+            </w:r>
+          </w:p>
+        </w:tc>
+        <w:tc>
+          <w:tcPr/>
+          <w:p>
+            <w:pPr>
+              <w:pStyle w:val="Compact"/>
+              <w:jc w:val="left"/>
+            </w:pPr>
+            <w:r>
+              <w:t xml:space="preserve">1.0×</w:t>
+            </w:r>
+          </w:p>
+        </w:tc>
+      </w:tr>
+      <w:tr>
+        <w:tc>
+          <w:tcPr/>
+          <w:p>
+            <w:pPr>
+              <w:pStyle w:val="Compact"/>
+              <w:jc w:val="left"/>
+            </w:pPr>
+            <w:r>
+              <w:t xml:space="preserve">Value normalization at commit</w:t>
+            </w:r>
+          </w:p>
+        </w:tc>
+        <w:tc>
+          <w:tcPr/>
+          <w:p>
+            <w:pPr>
+              <w:pStyle w:val="Compact"/>
+              <w:jc w:val="left"/>
+            </w:pPr>
+            <w:r>
+              <w:t xml:space="preserve">−0.011*</w:t>
+            </w:r>
+          </w:p>
+        </w:tc>
+        <w:tc>
+          <w:tcPr/>
+          <w:p>
+            <w:pPr>
+              <w:pStyle w:val="Compact"/>
+              <w:jc w:val="left"/>
+            </w:pPr>
+            <w:r>
+              <w:t xml:space="preserve">−0.131*</w:t>
+            </w:r>
+          </w:p>
+        </w:tc>
+        <w:tc>
+          <w:tcPr/>
+          <w:p>
+            <w:pPr>
+              <w:pStyle w:val="Compact"/>
+              <w:jc w:val="left"/>
+            </w:pPr>
+            <w:r>
+              <w:t xml:space="preserve">−0.003</w:t>
+            </w:r>
+          </w:p>
+        </w:tc>
+        <w:tc>
+          <w:tcPr/>
+          <w:p>
+            <w:pPr>
+              <w:pStyle w:val="Compact"/>
+              <w:jc w:val="left"/>
+            </w:pPr>
+            <w:r>
+              <w:t xml:space="preserve">+0.004</w:t>
+            </w:r>
+          </w:p>
+        </w:tc>
+        <w:tc>
+          <w:tcPr/>
+          <w:p>
+            <w:pPr>
+              <w:pStyle w:val="Compact"/>
+              <w:jc w:val="left"/>
+            </w:pPr>
+            <w:r>
+              <w:t xml:space="preserve">0.000</w:t>
+            </w:r>
+          </w:p>
+        </w:tc>
+        <w:tc>
+          <w:tcPr/>
+          <w:p>
+            <w:pPr>
+              <w:pStyle w:val="Compact"/>
+              <w:jc w:val="left"/>
+            </w:pPr>
+            <w:r>
+              <w:t xml:space="preserve">1.0×</w:t>
+            </w:r>
+          </w:p>
+        </w:tc>
+      </w:tr>
+      <w:tr>
+        <w:tc>
+          <w:tcPr/>
+          <w:p>
+            <w:pPr>
+              <w:pStyle w:val="Compact"/>
+              <w:jc w:val="left"/>
+            </w:pPr>
+            <w:r>
+              <w:t xml:space="preserve">Value representation in the view</w:t>
+            </w:r>
+          </w:p>
+        </w:tc>
+        <w:tc>
+          <w:tcPr/>
+          <w:p>
+            <w:pPr>
+              <w:pStyle w:val="Compact"/>
+              <w:jc w:val="left"/>
+            </w:pPr>
+            <w:r>
+              <w:t xml:space="preserve">0.000</w:t>
+            </w:r>
+          </w:p>
+        </w:tc>
+        <w:tc>
+          <w:tcPr/>
+          <w:p>
+            <w:pPr>
+              <w:pStyle w:val="Compact"/>
+              <w:jc w:val="left"/>
+            </w:pPr>
+            <w:r>
+              <w:t xml:space="preserve">0.000</w:t>
+            </w:r>
+          </w:p>
+        </w:tc>
+        <w:tc>
+          <w:tcPr/>
+          <w:p>
+            <w:pPr>
+              <w:pStyle w:val="Compact"/>
+              <w:jc w:val="left"/>
+            </w:pPr>
+            <w:r>
+              <w:t xml:space="preserve">−0.066*</w:t>
+            </w:r>
+          </w:p>
+        </w:tc>
+        <w:tc>
+          <w:tcPr/>
+          <w:p>
+            <w:pPr>
+              <w:pStyle w:val="Compact"/>
+              <w:jc w:val="left"/>
+            </w:pPr>
+            <w:r>
+              <w:t xml:space="preserve">+0.010</w:t>
+            </w:r>
+          </w:p>
+        </w:tc>
+        <w:tc>
+          <w:tcPr/>
+          <w:p>
+            <w:pPr>
+              <w:pStyle w:val="Compact"/>
+              <w:jc w:val="left"/>
+            </w:pPr>
+            <w:r>
+              <w:t xml:space="preserve">−0.016</w:t>
+            </w:r>
+          </w:p>
+        </w:tc>
+        <w:tc>
+          <w:tcPr/>
+          <w:p>
+            <w:pPr>
+              <w:pStyle w:val="Compact"/>
+              <w:jc w:val="left"/>
+            </w:pPr>
+            <w:r>
+              <w:t xml:space="preserve">1.0×</w:t>
+            </w:r>
+          </w:p>
+        </w:tc>
+      </w:tr>
+      <w:tr>
+        <w:tc>
+          <w:tcPr/>
+          <w:p>
+            <w:pPr>
+              <w:pStyle w:val="Compact"/>
+              <w:jc w:val="left"/>
+            </w:pPr>
+            <w:r>
+              <w:t xml:space="preserve">Reuse of patched columns</w:t>
+            </w:r>
+          </w:p>
+        </w:tc>
+        <w:tc>
+          <w:tcPr/>
+          <w:p>
+            <w:pPr>
+              <w:pStyle w:val="Compact"/>
+              <w:jc w:val="left"/>
+            </w:pPr>
+            <w:r>
+              <w:t xml:space="preserve">−0.012</w:t>
+            </w:r>
+          </w:p>
+        </w:tc>
+        <w:tc>
+          <w:tcPr/>
+          <w:p>
+            <w:pPr>
+              <w:pStyle w:val="Compact"/>
+              <w:jc w:val="left"/>
+            </w:pPr>
+            <w:r>
+              <w:t xml:space="preserve">−0.003*</w:t>
+            </w:r>
+          </w:p>
+        </w:tc>
+        <w:tc>
+          <w:tcPr/>
+          <w:p>
+            <w:pPr>
+              <w:pStyle w:val="Compact"/>
+              <w:jc w:val="left"/>
+            </w:pPr>
+            <w:r>
+              <w:t xml:space="preserve">+0.010*</w:t>
+            </w:r>
+          </w:p>
+        </w:tc>
+        <w:tc>
+          <w:tcPr/>
+          <w:p>
+            <w:pPr>
+              <w:pStyle w:val="Compact"/>
+              <w:jc w:val="left"/>
+            </w:pPr>
+            <w:r>
+              <w:t xml:space="preserve">+0.002</w:t>
+            </w:r>
+          </w:p>
+        </w:tc>
+        <w:tc>
+          <w:tcPr/>
+          <w:p>
+            <w:pPr>
+              <w:pStyle w:val="Compact"/>
+              <w:jc w:val="left"/>
+            </w:pPr>
+            <w:r>
+              <w:t xml:space="preserve">−0.012</w:t>
+            </w:r>
+          </w:p>
+        </w:tc>
+        <w:tc>
+          <w:tcPr/>
+          <w:p>
+            <w:pPr>
+              <w:pStyle w:val="Compact"/>
+              <w:jc w:val="left"/>
+            </w:pPr>
+            <w:r>
+              <w:t xml:space="preserve">3.7–16.9×</w:t>
+            </w:r>
+          </w:p>
+        </w:tc>
+      </w:tr>
+      <w:tr>
+        <w:tc>
+          <w:tcPr/>
+          <w:p>
+            <w:pPr>
+              <w:pStyle w:val="Compact"/>
+              <w:jc w:val="left"/>
+            </w:pPr>
+            <w:r>
+              <w:t xml:space="preserve">Scope (patch every document)</w:t>
+            </w:r>
+          </w:p>
+        </w:tc>
+        <w:tc>
+          <w:tcPr/>
+          <w:p>
+            <w:pPr>
+              <w:pStyle w:val="Compact"/>
+              <w:jc w:val="left"/>
+            </w:pPr>
+            <w:r>
+              <w:t xml:space="preserve">0.000</w:t>
+            </w:r>
+          </w:p>
+        </w:tc>
+        <w:tc>
+          <w:tcPr/>
+          <w:p>
+            <w:pPr>
+              <w:pStyle w:val="Compact"/>
+              <w:jc w:val="left"/>
+            </w:pPr>
+            <w:r>
+              <w:t xml:space="preserve">0.000</w:t>
+            </w:r>
+          </w:p>
+        </w:tc>
+        <w:tc>
+          <w:tcPr/>
+          <w:p>
+            <w:pPr>
+              <w:pStyle w:val="Compact"/>
+              <w:jc w:val="left"/>
+            </w:pPr>
+            <w:r>
+              <w:t xml:space="preserve">+0.011*</w:t>
+            </w:r>
+          </w:p>
+        </w:tc>
+        <w:tc>
+          <w:tcPr/>
+          <w:p>
+            <w:pPr>
+              <w:pStyle w:val="Compact"/>
+              <w:jc w:val="left"/>
+            </w:pPr>
+            <w:r>
+              <w:t xml:space="preserve">0.000</w:t>
+            </w:r>
+          </w:p>
+        </w:tc>
+        <w:tc>
+          <w:tcPr/>
+          <w:p>
+            <w:pPr>
+              <w:pStyle w:val="Compact"/>
+              <w:jc w:val="left"/>
+            </w:pPr>
+            <w:r>
+              <w:t xml:space="preserve">+0.001</w:t>
+            </w:r>
+          </w:p>
+        </w:tc>
+        <w:tc>
+          <w:tcPr/>
+          <w:p>
+            <w:pPr>
+              <w:pStyle w:val="Compact"/>
+              <w:jc w:val="left"/>
+            </w:pPr>
+            <w:r>
+              <w:t xml:space="preserve">1.0–1.46×</w:t>
+            </w:r>
+          </w:p>
+        </w:tc>
+      </w:tr>
+      <w:tr>
+        <w:tc>
+          <w:tcPr/>
+          <w:p>
+            <w:pPr>
+              <w:pStyle w:val="Compact"/>
+              <w:jc w:val="left"/>
+            </w:pPr>
+            <w:r>
+              <w:t xml:space="preserve">Chained reading of long documents</w:t>
+            </w:r>
+          </w:p>
+        </w:tc>
+        <w:tc>
+          <w:tcPr/>
+          <w:p>
+            <w:pPr>
+              <w:pStyle w:val="Compact"/>
+              <w:jc w:val="left"/>
+            </w:pPr>
+            <w:r>
+              <w:t xml:space="preserve">0.000</w:t>
+            </w:r>
+          </w:p>
+        </w:tc>
+        <w:tc>
+          <w:tcPr/>
+          <w:p>
+            <w:pPr>
+              <w:pStyle w:val="Compact"/>
+              <w:jc w:val="left"/>
+            </w:pPr>
+            <w:r>
+              <w:t xml:space="preserve">−0.004</w:t>
+            </w:r>
+          </w:p>
+        </w:tc>
+        <w:tc>
+          <w:tcPr/>
+          <w:p>
+            <w:pPr>
+              <w:pStyle w:val="Compact"/>
+              <w:jc w:val="left"/>
+            </w:pPr>
+            <w:r>
+              <w:t xml:space="preserve">0.000</w:t>
+            </w:r>
+          </w:p>
+        </w:tc>
+        <w:tc>
+          <w:tcPr/>
+          <w:p>
+            <w:pPr>
+              <w:pStyle w:val="Compact"/>
+              <w:jc w:val="left"/>
+            </w:pPr>
+            <w:r>
+              <w:t xml:space="preserve">+0.015*</w:t>
+            </w:r>
+          </w:p>
+        </w:tc>
+        <w:tc>
+          <w:tcPr/>
+          <w:p>
+            <w:pPr>
+              <w:pStyle w:val="Compact"/>
+              <w:jc w:val="left"/>
+            </w:pPr>
+            <w:r>
+              <w:t xml:space="preserve">−0.012*</w:t>
+            </w:r>
+          </w:p>
+        </w:tc>
+        <w:tc>
+          <w:tcPr/>
+          <w:p>
+            <w:pPr>
+              <w:pStyle w:val="Compact"/>
+              <w:jc w:val="left"/>
+            </w:pPr>
+            <w:r>
+              <w:t xml:space="preserve">0.58–1.0×</w:t>
+            </w:r>
+          </w:p>
+        </w:tc>
+      </w:tr>
+      <w:tr>
+        <w:tc>
+          <w:tcPr/>
+          <w:p>
+            <w:pPr>
+              <w:pStyle w:val="Compact"/>
+              <w:jc w:val="left"/>
+            </w:pPr>
+            <w:r>
+              <w:t xml:space="preserve">Batching other workload columns</w:t>
+            </w:r>
+          </w:p>
+        </w:tc>
+        <w:tc>
+          <w:tcPr/>
+          <w:p>
+            <w:pPr>
+              <w:pStyle w:val="Compact"/>
+              <w:jc w:val="left"/>
+            </w:pPr>
+            <w:r>
+              <w:t xml:space="preserve">−0.003</w:t>
+            </w:r>
+          </w:p>
+        </w:tc>
+        <w:tc>
+          <w:tcPr/>
+          <w:p>
+            <w:pPr>
+              <w:pStyle w:val="Compact"/>
+              <w:jc w:val="left"/>
+            </w:pPr>
+            <w:r>
+              <w:t xml:space="preserve">0.000</w:t>
+            </w:r>
+          </w:p>
+        </w:tc>
+        <w:tc>
+          <w:tcPr/>
+          <w:p>
+            <w:pPr>
+              <w:pStyle w:val="Compact"/>
+              <w:jc w:val="left"/>
+            </w:pPr>
+            <w:r>
+              <w:t xml:space="preserve">+0.011*</w:t>
+            </w:r>
+          </w:p>
+        </w:tc>
+        <w:tc>
+          <w:tcPr/>
+          <w:p>
+            <w:pPr>
+              <w:pStyle w:val="Compact"/>
+              <w:jc w:val="left"/>
+            </w:pPr>
+            <w:r>
+              <w:t xml:space="preserve">0.000</w:t>
+            </w:r>
+          </w:p>
+        </w:tc>
+        <w:tc>
+          <w:tcPr/>
+          <w:p>
+            <w:pPr>
+              <w:pStyle w:val="Compact"/>
+              <w:jc w:val="left"/>
+            </w:pPr>
+            <w:r>
+              <w:t xml:space="preserve">−0.007</w:t>
+            </w:r>
+          </w:p>
+        </w:tc>
+        <w:tc>
+          <w:tcPr/>
+          <w:p>
+            <w:pPr>
+              <w:pStyle w:val="Compact"/>
+              <w:jc w:val="left"/>
+            </w:pPr>
+            <w:r>
+              <w:t xml:space="preserve">1.0–1.46×</w:t>
+            </w:r>
+          </w:p>
+        </w:tc>
+      </w:tr>
+      <w:tr>
+        <w:tc>
+          <w:tcPr/>
+          <w:p>
+            <w:pPr>
+              <w:pStyle w:val="Compact"/>
+              <w:jc w:val="left"/>
+            </w:pPr>
+            <w:r>
+              <w:t xml:space="preserve">Workload usage phrase</w:t>
+            </w:r>
+          </w:p>
+        </w:tc>
+        <w:tc>
+          <w:tcPr/>
+          <w:p>
+            <w:pPr>
+              <w:pStyle w:val="Compact"/>
+              <w:jc w:val="left"/>
+            </w:pPr>
+            <w:r>
+              <w:t xml:space="preserve">−0.006</w:t>
+            </w:r>
+          </w:p>
+        </w:tc>
+        <w:tc>
+          <w:tcPr/>
+          <w:p>
+            <w:pPr>
+              <w:pStyle w:val="Compact"/>
+              <w:jc w:val="left"/>
+            </w:pPr>
+            <w:r>
+              <w:t xml:space="preserve">0.000</w:t>
+            </w:r>
+          </w:p>
+        </w:tc>
+        <w:tc>
+          <w:tcPr/>
+          <w:p>
+            <w:pPr>
+              <w:pStyle w:val="Compact"/>
+              <w:jc w:val="left"/>
+            </w:pPr>
+            <w:r>
+              <w:t xml:space="preserve">+0.001</w:t>
+            </w:r>
+          </w:p>
+        </w:tc>
+        <w:tc>
+          <w:tcPr/>
+          <w:p>
+            <w:pPr>
+              <w:pStyle w:val="Compact"/>
+              <w:jc w:val="left"/>
+            </w:pPr>
+            <w:r>
+              <w:t xml:space="preserve">+0.003</w:t>
+            </w:r>
+          </w:p>
+        </w:tc>
+        <w:tc>
+          <w:tcPr/>
+          <w:p>
+            <w:pPr>
+              <w:pStyle w:val="Compact"/>
+              <w:jc w:val="left"/>
+            </w:pPr>
+            <w:r>
+              <w:t xml:space="preserve">+0.010</w:t>
+            </w:r>
+          </w:p>
+        </w:tc>
+        <w:tc>
+          <w:tcPr/>
+          <w:p>
+            <w:pPr>
+              <w:pStyle w:val="Compact"/>
+              <w:jc w:val="left"/>
+            </w:pPr>
+            <w:r>
+              <w:t xml:space="preserve">1.0×</w:t>
+            </w:r>
+          </w:p>
+        </w:tc>
+      </w:tr>
+    </w:tbl>
+    <w:p>
+      <w:pPr>
+        <w:pStyle w:val="BodyText"/>
+      </w:pPr>
+      <w:r>
+        <w:drawing>
+          <wp:inline>
+            <wp:extent cx="5334000" cy="2297723"/>
+            <wp:effectExtent b="0" l="0" r="0" t="0"/>
+            <wp:docPr descr="Each component turned off in turn: score change and patch tokens." title="" id="69" name="Picture"/>
+            <a:graphic>
+              <a:graphicData uri="http://schemas.openxmlformats.org/drawingml/2006/picture">
+                <pic:pic>
+                  <pic:nvPicPr>
+                    <pic:cNvPr descr="figures/ablations.png" id="70" name="Picture"/>
+                    <pic:cNvPicPr>
+                      <a:picLocks noChangeArrowheads="1" noChangeAspect="1"/>
+                    </pic:cNvPicPr>
+                  </pic:nvPicPr>
+                  <pic:blipFill>
+                    <a:blip r:embed="rId68"/>
+                    <a:stretch>
+                      <a:fillRect/>
+                    </a:stretch>
+                  </pic:blipFill>
+                  <pic:spPr bwMode="auto">
+                    <a:xfrm>
+                      <a:off x="0" y="0"/>
+                      <a:ext cx="5334000" cy="2297723"/>
+                    </a:xfrm>
+                    <a:prstGeom prst="rect">
+                      <a:avLst/>
+                    </a:prstGeom>
+                    <a:noFill/>
+                    <a:ln w="9525">
+                      <a:noFill/>
+                      <a:headEnd/>
+                      <a:tailEnd/>
+                    </a:ln>
+                  </pic:spPr>
+                </pic:pic>
+              </a:graphicData>
+            </a:graphic>
+          </wp:inline>
+        </w:drawing>
+      </w:r>
+      <w:r>
+        <w:t xml:space="preserve"> </w:t>
+      </w:r>
+      <w:r>
+        <w:rPr>
+          <w:iCs/>
+          <w:i/>
+        </w:rPr>
+        <w:t xml:space="preserve">Figure 14. Each component turned off in turn: score change (95% CI) and patch tokens, at 100% drift.</w:t>
+      </w:r>
+    </w:p>
+    <w:p>
+      <w:pPr>
+        <w:pStyle w:val="BodyText"/>
+      </w:pPr>
+      <w:r>
+        <w:rPr>
+          <w:iCs/>
+          <w:i/>
+        </w:rPr>
+        <w:t xml:space="preserve">Prompt factors.</w:t>
+      </w:r>
+      <w:r>
+        <w:t xml:space="preserve"> </w:t>
+      </w:r>
+      <w:r>
+        <w:t xml:space="preserve">The same column is read differently by the build and by a patch. Giving patches the build’s exact</w:t>
+      </w:r>
+      <w:r>
+        <w:t xml:space="preserve"> </w:t>
+      </w:r>
+      <w:r>
+        <w:t xml:space="preserve">prompt (field specs and co-read columns; no new model call was needed, so the prompts were byte-identical) moves each</w:t>
+      </w:r>
+      <w:r>
+        <w:t xml:space="preserve"> </w:t>
+      </w:r>
+      <w:r>
+        <w:t xml:space="preserve">corpus’s 100%-drift score to its 0%-drift score; on cspaper, applied to every document, it reproduces the 0% stream</w:t>
+      </w:r>
+      <w:r>
+        <w:t xml:space="preserve"> </w:t>
+      </w:r>
+      <w:r>
+        <w:t xml:space="preserve">query for query (58 of 59). Splitting the prompt into its two parts, the grouping alone reproduces the shift (cspaper</w:t>
+      </w:r>
+      <w:r>
+        <w:t xml:space="preserve"> </w:t>
+      </w:r>
+      <w:r>
+        <w:t xml:space="preserve">−0.022, player −0.009, art +0.017 against the 0%-to-100% differences −0.019, −0.008, +0.014), while the build’s field</w:t>
+      </w:r>
+      <w:r>
+        <w:t xml:space="preserve"> </w:t>
+      </w:r>
+      <w:r>
+        <w:t xml:space="preserve">specs alone move it little. Reading all new columns together costs 0.13–0.35× the patch tokens.</w:t>
+      </w:r>
+    </w:p>
+    <w:p>
+      <w:pPr>
+        <w:pStyle w:val="BodyText"/>
+      </w:pPr>
+      <w:r>
+        <w:rPr>
+          <w:bCs/>
+          <w:b/>
+        </w:rPr>
+        <w:t xml:space="preserve">Implication.</w:t>
+      </w:r>
+      <w:r>
+        <w:t xml:space="preserve"> </w:t>
+      </w:r>
+      <w:r>
+        <w:t xml:space="preserve">Invest in field definitions and in value normalization; keep reuse and scoping for cost. Prompt</w:t>
+      </w:r>
+      <w:r>
+        <w:t xml:space="preserve"> </w:t>
+      </w:r>
+      <w:r>
+        <w:t xml:space="preserve">grouping changes values in a corpus-specific direction, so it is a cost decision, not an accuracy lever.</w:t>
+      </w:r>
+    </w:p>
+    <w:p>
+      <w:pPr>
+        <w:pStyle w:val="BodyText"/>
+      </w:pPr>
+      <w:r>
+        <w:rPr>
+          <w:bCs/>
+          <w:b/>
+        </w:rPr>
+        <w:t xml:space="preserve">Scope.</w:t>
+      </w:r>
+      <w:r>
+        <w:t xml:space="preserve"> </w:t>
+      </w:r>
+      <w:r>
+        <w:t xml:space="preserve">Five corpora, one model (Qwen 2.5 7B), 100% drift.</w:t>
+      </w:r>
+    </w:p>
+    <w:p>
+      <w:r>
+        <w:pict>
+          <v:rect style="width:0;height:1.5pt" o:hralign="center" o:hrstd="t" o:hr="t"/>
+        </w:pict>
+      </w:r>
+    </w:p>
+    <w:bookmarkEnd w:id="71"/>
+    <w:bookmarkStart w:id="75" w:name="comparison-with-docetl"/>
     <w:p>
       <w:pPr>
         <w:pStyle w:val="Heading2"/>
@@ -6078,18 +7332,18 @@
           <wp:inline>
             <wp:extent cx="5334000" cy="1723292"/>
             <wp:effectExtent b="0" l="0" r="0" t="0"/>
-            <wp:docPr descr="Ours vs DocETL per corpus (left) and on player by number of joins (right)." title="" id="69" name="Picture"/>
+            <wp:docPr descr="Ours vs DocETL per corpus (left) and on player by number of joins (right)." title="" id="73" name="Picture"/>
             <a:graphic>
               <a:graphicData uri="http://schemas.openxmlformats.org/drawingml/2006/picture">
                 <pic:pic>
                   <pic:nvPicPr>
-                    <pic:cNvPr descr="figures/docetl.png" id="70" name="Picture"/>
+                    <pic:cNvPr descr="figures/docetl.png" id="74" name="Picture"/>
                     <pic:cNvPicPr>
                       <a:picLocks noChangeArrowheads="1" noChangeAspect="1"/>
                     </pic:cNvPicPr>
                   </pic:nvPicPr>
                   <pic:blipFill>
-                    <a:blip r:embed="rId68"/>
+                    <a:blip r:embed="rId72"/>
                     <a:stretch>
                       <a:fillRect/>
                     </a:stretch>
@@ -6123,7 +7377,7 @@
           <w:iCs/>
           <w:i/>
         </w:rPr>
-        <w:t xml:space="preserve">Figure 14. Ours vs DocETL per corpus (left) and on player by number of joins (right).</w:t>
+        <w:t xml:space="preserve">Figure 15. Ours vs DocETL per corpus (left) and on player by number of joins (right).</w:t>
       </w:r>
     </w:p>
     <w:p>
@@ -6170,8 +7424,8 @@
         <w:t xml:space="preserve">All 326 drift test queries on the five corpora; one model.</w:t>
       </w:r>
     </w:p>
-    <w:bookmarkEnd w:id="71"/>
-    <w:bookmarkEnd w:id="72"/>
+    <w:bookmarkEnd w:id="75"/>
+    <w:bookmarkEnd w:id="76"/>
     <w:sectPr/>
   </w:body>
 </w:document>

</xml_diff>

<commit_message>
E6.3: 32B legal (0.239 -> 0.224, no drift rise; doubles 7B at equal cost) and Llama art recorded
Co-Authored-By: Claude Opus 5.5 <noreply@anthropic.com>
</commit_message>
<xml_diff>
--- a/results/experiments/RESULTS_PAPER.docx
+++ b/results/experiments/RESULTS_PAPER.docx
@@ -4731,7 +4731,11 @@
           <w:p>
             <w:pPr>
               <w:pStyle w:val="Compact"/>
-            </w:pPr>
+              <w:jc w:val="left"/>
+            </w:pPr>
+            <w:r>
+              <w:t xml:space="preserve">0.209 → 0.203 (0.031)</w:t>
+            </w:r>
           </w:p>
         </w:tc>
         <w:tc>
@@ -4801,6 +4805,52 @@
             </w:pPr>
             <w:r>
               <w:t xml:space="preserve">0.092 → 0.098 (0.050)</w:t>
+            </w:r>
+          </w:p>
+        </w:tc>
+      </w:tr>
+      <w:tr>
+        <w:tc>
+          <w:tcPr/>
+          <w:p>
+            <w:pPr>
+              <w:pStyle w:val="Compact"/>
+              <w:jc w:val="left"/>
+            </w:pPr>
+            <w:r>
+              <w:t xml:space="preserve">legal, patched at 0% → 100% drift (static at 100%)</w:t>
+            </w:r>
+          </w:p>
+        </w:tc>
+        <w:tc>
+          <w:tcPr/>
+          <w:p>
+            <w:pPr>
+              <w:pStyle w:val="Compact"/>
+            </w:pPr>
+          </w:p>
+        </w:tc>
+        <w:tc>
+          <w:tcPr/>
+          <w:p>
+            <w:pPr>
+              <w:pStyle w:val="Compact"/>
+              <w:jc w:val="left"/>
+            </w:pPr>
+            <w:r>
+              <w:t xml:space="preserve">0.121 → 0.114 (0.005)</w:t>
+            </w:r>
+          </w:p>
+        </w:tc>
+        <w:tc>
+          <w:tcPr/>
+          <w:p>
+            <w:pPr>
+              <w:pStyle w:val="Compact"/>
+              <w:jc w:val="left"/>
+            </w:pPr>
+            <w:r>
+              <w:t xml:space="preserve">0.239 → 0.224 (0.005)</w:t>
             </w:r>
           </w:p>
         </w:tc>
@@ -4912,13 +4962,19 @@
         <w:pStyle w:val="BodyText"/>
       </w:pPr>
       <w:r>
-        <w:t xml:space="preserve">The 32B model raises the 0%-drift score on every corpus (cspaper +0.028, player +0.022, art +0.023) except med</w:t>
-      </w:r>
-      <w:r>
-        <w:t xml:space="preserve"> </w:t>
-      </w:r>
-      <w:r>
-        <w:t xml:space="preserve">(−0.003). Its 100% − 0% difference is significant on cspaper and player only (+0.062, +0.020), the narrow-prompt effect</w:t>
+        <w:t xml:space="preserve">The 32B model raises the 0%-drift score on every corpus (cspaper +0.028, player +0.022, art +0.023, legal +0.118)</w:t>
+      </w:r>
+      <w:r>
+        <w:t xml:space="preserve"> </w:t>
+      </w:r>
+      <w:r>
+        <w:t xml:space="preserve">except med (−0.003); on legal it doubles the score at the same patch cost (0.224 vs 0.114 at 100% drift, 29.9M tokens</w:t>
+      </w:r>
+      <w:r>
+        <w:t xml:space="preserve"> </w:t>
+      </w:r>
+      <w:r>
+        <w:t xml:space="preserve">each). Its 100% − 0% difference is significant on cspaper and player only (+0.062, +0.020), the narrow-prompt effect</w:t>
       </w:r>
       <w:r>
         <w:t xml:space="preserve"> </w:t>
@@ -4958,7 +5014,7 @@
         <w:t xml:space="preserve"> </w:t>
       </w:r>
       <w:r>
-        <w:t xml:space="preserve">Llama 8B on two corpora; Qwen 32B on four (legal running); quantization on one corpus.</w:t>
+        <w:t xml:space="preserve">Qwen 32B on all five corpora; Llama 8B on three (med, legal running); quantization on one corpus.</w:t>
       </w:r>
     </w:p>
     <w:p>

</xml_diff>

<commit_message>
RESULTS_PAPER: RQ3 marked under revision (artifact queries)
Co-Authored-By: Claude Opus 5.5 <noreply@anthropic.com>
</commit_message>
<xml_diff>
--- a/results/experiments/RESULTS_PAPER.docx
+++ b/results/experiments/RESULTS_PAPER.docx
@@ -2282,6 +2282,57 @@
       </w:pPr>
       <w:r>
         <w:t xml:space="preserve">RQ3. How should an adaptive system spend a limited extraction budget?</w:t>
+      </w:r>
+    </w:p>
+    <w:p>
+      <w:pPr>
+        <w:pStyle w:val="BlockText"/>
+      </w:pPr>
+      <w:r>
+        <w:rPr>
+          <w:bCs/>
+          <w:b/>
+        </w:rPr>
+        <w:t xml:space="preserve">Under revision.</w:t>
+      </w:r>
+      <w:r>
+        <w:t xml:space="preserve"> </w:t>
+      </w:r>
+      <w:r>
+        <w:t xml:space="preserve">The MIN/MAX-over-text queries this section builds on are artifacts of our drift query generator</w:t>
+      </w:r>
+      <w:r>
+        <w:t xml:space="preserve"> </w:t>
+      </w:r>
+      <w:r>
+        <w:t xml:space="preserve">(a type-blind attribute swap; 12 of legal’s and 30 of med’s test queries) and score zero by construction under the</w:t>
+      </w:r>
+      <w:r>
+        <w:t xml:space="preserve"> </w:t>
+      </w:r>
+      <w:r>
+        <w:t xml:space="preserve">benchmark metric. The</w:t>
+      </w:r>
+      <w:r>
+        <w:t xml:space="preserve"> </w:t>
+      </w:r>
+      <w:r>
+        <w:rPr>
+          <w:rStyle w:val="VerbatimChar"/>
+        </w:rPr>
+        <w:t xml:space="preserve">fragile</w:t>
+      </w:r>
+      <w:r>
+        <w:t xml:space="preserve"> </w:t>
+      </w:r>
+      <w:r>
+        <w:t xml:space="preserve">rule’s advantage and legal’s budget collapse come from them; this section will be</w:t>
+      </w:r>
+      <w:r>
+        <w:t xml:space="preserve"> </w:t>
+      </w:r>
+      <w:r>
+        <w:t xml:space="preserve">re-run on test streams without them.</w:t>
       </w:r>
     </w:p>
     <w:p>

</xml_diff>

<commit_message>
Results docs: med and legal marked not yet run; figures and pooled numbers on cspaper, player, art
Co-Authored-By: Claude Opus 5.5 <noreply@anthropic.com>
</commit_message>
<xml_diff>
--- a/results/experiments/RESULTS_PAPER.docx
+++ b/results/experiments/RESULTS_PAPER.docx
@@ -2,7 +2,7 @@
 <file path=word/document.xml><?xml version="1.0" encoding="utf-8"?>
 <w:document xmlns:w="http://schemas.openxmlformats.org/wordprocessingml/2006/main" xmlns:m="http://schemas.openxmlformats.org/officeDocument/2006/math" xmlns:r="http://schemas.openxmlformats.org/officeDocument/2006/relationships" xmlns:o="urn:schemas-microsoft-com:office:office" xmlns:v="urn:schemas-microsoft-com:vml" xmlns:w10="urn:schemas-microsoft-com:office:word" xmlns:a="http://schemas.openxmlformats.org/drawingml/2006/main" xmlns:pic="http://schemas.openxmlformats.org/drawingml/2006/picture" xmlns:wp="http://schemas.openxmlformats.org/drawingml/2006/wordprocessingDrawing">
   <w:body>
-    <w:bookmarkStart w:id="76" w:name="answers-to-the-research-questions"/>
+    <w:bookmarkStart w:id="73" w:name="answers-to-the-research-questions"/>
     <w:p>
       <w:pPr>
         <w:pStyle w:val="Heading1"/>
@@ -293,7 +293,13 @@
         <w:t xml:space="preserve"> </w:t>
       </w:r>
       <w:r>
-        <w:t xml:space="preserve">tables, about 300), and court cases (legal, 570). 326 drift test queries over all five.</w:t>
+        <w:t xml:space="preserve">tables, about 300), and court cases (legal, 570). The results below cover cspaper, player and art (220 drift test</w:t>
+      </w:r>
+      <w:r>
+        <w:t xml:space="preserve"> </w:t>
+      </w:r>
+      <w:r>
+        <w:t xml:space="preserve">queries); med and legal have not been run yet.</w:t>
       </w:r>
     </w:p>
     <w:p>
@@ -693,32 +699,24 @@
               <w:jc w:val="left"/>
             </w:pPr>
             <w:r>
-              <w:t xml:space="preserve">0.005</w:t>
-            </w:r>
-          </w:p>
-        </w:tc>
-        <w:tc>
-          <w:tcPr/>
-          <w:p>
-            <w:pPr>
-              <w:pStyle w:val="Compact"/>
-              <w:jc w:val="left"/>
-            </w:pPr>
-            <w:r>
-              <w:t xml:space="preserve">0.114</w:t>
-            </w:r>
-          </w:p>
-        </w:tc>
-        <w:tc>
-          <w:tcPr/>
-          <w:p>
-            <w:pPr>
-              <w:pStyle w:val="Compact"/>
-              <w:jc w:val="left"/>
-            </w:pPr>
-            <w:r>
-              <w:t xml:space="preserve">+0.110 (0.055 – 0.177)</w:t>
-            </w:r>
+              <w:t xml:space="preserve">not yet run</w:t>
+            </w:r>
+          </w:p>
+        </w:tc>
+        <w:tc>
+          <w:tcPr/>
+          <w:p>
+            <w:pPr>
+              <w:pStyle w:val="Compact"/>
+            </w:pPr>
+          </w:p>
+        </w:tc>
+        <w:tc>
+          <w:tcPr/>
+          <w:p>
+            <w:pPr>
+              <w:pStyle w:val="Compact"/>
+            </w:pPr>
           </w:p>
         </w:tc>
       </w:tr>
@@ -743,32 +741,24 @@
               <w:jc w:val="left"/>
             </w:pPr>
             <w:r>
-              <w:t xml:space="preserve">0.031</w:t>
-            </w:r>
-          </w:p>
-        </w:tc>
-        <w:tc>
-          <w:tcPr/>
-          <w:p>
-            <w:pPr>
-              <w:pStyle w:val="Compact"/>
-              <w:jc w:val="left"/>
-            </w:pPr>
-            <w:r>
-              <w:t xml:space="preserve">0.086</w:t>
-            </w:r>
-          </w:p>
-        </w:tc>
-        <w:tc>
-          <w:tcPr/>
-          <w:p>
-            <w:pPr>
-              <w:pStyle w:val="Compact"/>
-              <w:jc w:val="left"/>
-            </w:pPr>
-            <w:r>
-              <w:t xml:space="preserve">+0.055 (0.030 – 0.082)</w:t>
-            </w:r>
+              <w:t xml:space="preserve">not yet run</w:t>
+            </w:r>
+          </w:p>
+        </w:tc>
+        <w:tc>
+          <w:tcPr/>
+          <w:p>
+            <w:pPr>
+              <w:pStyle w:val="Compact"/>
+            </w:pPr>
+          </w:p>
+        </w:tc>
+        <w:tc>
+          <w:tcPr/>
+          <w:p>
+            <w:pPr>
+              <w:pStyle w:val="Compact"/>
+            </w:pPr>
           </w:p>
         </w:tc>
       </w:tr>
@@ -833,7 +823,7 @@
         <w:t xml:space="preserve"> </w:t>
       </w:r>
       <w:r>
-        <w:t xml:space="preserve">player and worse on art and med (RQ2). Which documents a patch reads contributes nothing. With the 32B model the same</w:t>
+        <w:t xml:space="preserve">player and worse on art (RQ2). Which documents a patch reads contributes nothing. With the 32B model the same</w:t>
       </w:r>
       <w:r>
         <w:t xml:space="preserve"> </w:t>
@@ -845,7 +835,7 @@
         <w:t xml:space="preserve"> </w:t>
       </w:r>
       <w:r>
-        <w:t xml:space="preserve">art and med (RQ7): a corpus-specific gain from narrow prompts, not a benefit of drift.</w:t>
+        <w:t xml:space="preserve">art (RQ7): a corpus-specific gain from narrow prompts, not a benefit of drift.</w:t>
       </w:r>
     </w:p>
     <w:p>
@@ -855,7 +845,7 @@
       <w:r>
         <w:drawing>
           <wp:inline>
-            <wp:extent cx="5334000" cy="1280160"/>
+            <wp:extent cx="5334000" cy="1828800"/>
             <wp:effectExtent b="0" l="0" r="0" t="0"/>
             <wp:docPr descr="Score as drift grows, static build vs on-demand patching, per corpus." title="" id="22" name="Picture"/>
             <a:graphic>
@@ -876,7 +866,7 @@
                   <pic:spPr bwMode="auto">
                     <a:xfrm>
                       <a:off x="0" y="0"/>
-                      <a:ext cx="5334000" cy="1280160"/>
+                      <a:ext cx="5334000" cy="1828800"/>
                     </a:xfrm>
                     <a:prstGeom prst="rect">
                       <a:avLst/>
@@ -999,43 +989,43 @@
         <w:t xml:space="preserve"> </w:t>
       </w:r>
       <w:r>
-        <w:t xml:space="preserve">or 50% of its queries (same test queries; 18 runs over the five corpora) leaves more columns to the patches (art at</w:t>
-      </w:r>
-      <w:r>
-        <w:t xml:space="preserve"> </w:t>
-      </w:r>
-      <w:r>
-        <w:t xml:space="preserve">10%: 14 new columns instead of 9). Static still collapses at 100% drift (0.000–0.043), the patched curve stays within</w:t>
-      </w:r>
-      <w:r>
-        <w:t xml:space="preserve"> </w:t>
-      </w:r>
-      <w:r>
-        <w:t xml:space="preserve">0.025 of its 0% score, and no 100% − 0% difference is significant (−0.015 to +0.014). The cost moves from the build to</w:t>
-      </w:r>
-      <w:r>
-        <w:t xml:space="preserve"> </w:t>
-      </w:r>
-      <w:r>
-        <w:t xml:space="preserve">the patches and grows: art at 10% saves 1.0M build tokens but adds 2.6M patch tokens (+19% total); cspaper +23%, med</w:t>
-      </w:r>
-      <w:r>
-        <w:t xml:space="preserve"> </w:t>
-      </w:r>
-      <w:r>
-        <w:t xml:space="preserve">+19%, legal +12%, player +7%. The 0% score itself shifts with the share (med 0.095 → 0.062–0.077), because the build</w:t>
-      </w:r>
-      <w:r>
-        <w:t xml:space="preserve"> </w:t>
-      </w:r>
-      <w:r>
-        <w:t xml:space="preserve">groups columns into prompts by workload: at 10–25% med’s join key is read in a 2–3-column prompt and left empty on</w:t>
-      </w:r>
-      <w:r>
-        <w:t xml:space="preserve"> </w:t>
-      </w:r>
-      <w:r>
-        <w:t xml:space="preserve">half the documents, against 12% in the full build (see RQ2).</w:t>
+        <w:t xml:space="preserve">or 50% of its queries (same test queries; 7 runs over cspaper, player and art) leaves more columns to the patches (art</w:t>
+      </w:r>
+      <w:r>
+        <w:t xml:space="preserve"> </w:t>
+      </w:r>
+      <w:r>
+        <w:t xml:space="preserve">at 10%: 14 new columns instead of 9). Static still collapses at 100% drift (0.000–0.043), the patched curve stays</w:t>
+      </w:r>
+      <w:r>
+        <w:t xml:space="preserve"> </w:t>
+      </w:r>
+      <w:r>
+        <w:t xml:space="preserve">within 0.025 of its 0% score, and no 100% − 0% difference is significant (−0.015 to +0.014). The cost moves from the</w:t>
+      </w:r>
+      <w:r>
+        <w:t xml:space="preserve"> </w:t>
+      </w:r>
+      <w:r>
+        <w:t xml:space="preserve">build to the patches and grows: art at 10% saves 1.0M build tokens but adds 2.6M patch tokens (+19% total); cspaper</w:t>
+      </w:r>
+      <w:r>
+        <w:t xml:space="preserve"> </w:t>
+      </w:r>
+      <w:r>
+        <w:t xml:space="preserve">+23%, player +7%. The 0% score itself shifts with the share (cspaper 0.134 → 0.149–0.162, player 0.379 → 0.353),</w:t>
+      </w:r>
+      <w:r>
+        <w:t xml:space="preserve"> </w:t>
+      </w:r>
+      <w:r>
+        <w:t xml:space="preserve">because the build groups columns into prompts by workload, and a column’s values depend on the prompt it is read in</w:t>
+      </w:r>
+      <w:r>
+        <w:t xml:space="preserve"> </w:t>
+      </w:r>
+      <w:r>
+        <w:t xml:space="preserve">(see RQ2).</w:t>
       </w:r>
     </w:p>
     <w:p>
@@ -1045,7 +1035,7 @@
       <w:r>
         <w:drawing>
           <wp:inline>
-            <wp:extent cx="5334000" cy="2915920"/>
+            <wp:extent cx="5334000" cy="3644900"/>
             <wp:effectExtent b="0" l="0" r="0" t="0"/>
             <wp:docPr descr="The drift result for build workloads cut to 10–50% of their queries." title="" id="28" name="Picture"/>
             <a:graphic>
@@ -1066,7 +1056,7 @@
                   <pic:spPr bwMode="auto">
                     <a:xfrm>
                       <a:off x="0" y="0"/>
-                      <a:ext cx="5334000" cy="2915920"/>
+                      <a:ext cx="5334000" cy="3644900"/>
                     </a:xfrm>
                     <a:prstGeom prst="rect">
                       <a:avLst/>
@@ -1092,7 +1082,7 @@
           <w:iCs/>
           <w:i/>
         </w:rPr>
-        <w:t xml:space="preserve">Figure 3. The drift result for build workloads cut to 10–50% of their queries (all five corpora).</w:t>
+        <w:t xml:space="preserve">Figure 3. The drift result for build workloads cut to 10–50% of their queries (cspaper, player, art).</w:t>
       </w:r>
     </w:p>
     <w:p>
@@ -1280,44 +1270,32 @@
               <w:jc w:val="left"/>
             </w:pPr>
             <w:r>
-              <w:t xml:space="preserve">2.87M, 0.095</w:t>
-            </w:r>
-          </w:p>
-        </w:tc>
-        <w:tc>
-          <w:tcPr/>
-          <w:p>
-            <w:pPr>
-              <w:pStyle w:val="Compact"/>
-              <w:jc w:val="left"/>
-            </w:pPr>
-            <w:r>
-              <w:t xml:space="preserve">22.47M, 0.086</w:t>
-            </w:r>
-          </w:p>
-        </w:tc>
-        <w:tc>
-          <w:tcPr/>
-          <w:p>
-            <w:pPr>
-              <w:pStyle w:val="Compact"/>
-              <w:jc w:val="left"/>
-            </w:pPr>
-            <w:r>
-              <w:t xml:space="preserve">7.8×</w:t>
-            </w:r>
-          </w:p>
-        </w:tc>
-        <w:tc>
-          <w:tcPr/>
-          <w:p>
-            <w:pPr>
-              <w:pStyle w:val="Compact"/>
-              <w:jc w:val="left"/>
-            </w:pPr>
-            <w:r>
-              <w:t xml:space="preserve">1.6%</w:t>
-            </w:r>
+              <w:t xml:space="preserve">not yet run</w:t>
+            </w:r>
+          </w:p>
+        </w:tc>
+        <w:tc>
+          <w:tcPr/>
+          <w:p>
+            <w:pPr>
+              <w:pStyle w:val="Compact"/>
+            </w:pPr>
+          </w:p>
+        </w:tc>
+        <w:tc>
+          <w:tcPr/>
+          <w:p>
+            <w:pPr>
+              <w:pStyle w:val="Compact"/>
+            </w:pPr>
+          </w:p>
+        </w:tc>
+        <w:tc>
+          <w:tcPr/>
+          <w:p>
+            <w:pPr>
+              <w:pStyle w:val="Compact"/>
+            </w:pPr>
           </w:p>
         </w:tc>
       </w:tr>
@@ -1342,44 +1320,32 @@
               <w:jc w:val="left"/>
             </w:pPr>
             <w:r>
-              <w:t xml:space="preserve">5.05M, 0.121</w:t>
-            </w:r>
-          </w:p>
-        </w:tc>
-        <w:tc>
-          <w:tcPr/>
-          <w:p>
-            <w:pPr>
-              <w:pStyle w:val="Compact"/>
-              <w:jc w:val="left"/>
-            </w:pPr>
-            <w:r>
-              <w:t xml:space="preserve">34.49M, 0.114</w:t>
-            </w:r>
-          </w:p>
-        </w:tc>
-        <w:tc>
-          <w:tcPr/>
-          <w:p>
-            <w:pPr>
-              <w:pStyle w:val="Compact"/>
-              <w:jc w:val="left"/>
-            </w:pPr>
-            <w:r>
-              <w:t xml:space="preserve">6.8×</w:t>
-            </w:r>
-          </w:p>
-        </w:tc>
-        <w:tc>
-          <w:tcPr/>
-          <w:p>
-            <w:pPr>
-              <w:pStyle w:val="Compact"/>
-              <w:jc w:val="left"/>
-            </w:pPr>
-            <w:r>
-              <w:t xml:space="preserve">1.6%</w:t>
-            </w:r>
+              <w:t xml:space="preserve">not yet run</w:t>
+            </w:r>
+          </w:p>
+        </w:tc>
+        <w:tc>
+          <w:tcPr/>
+          <w:p>
+            <w:pPr>
+              <w:pStyle w:val="Compact"/>
+            </w:pPr>
+          </w:p>
+        </w:tc>
+        <w:tc>
+          <w:tcPr/>
+          <w:p>
+            <w:pPr>
+              <w:pStyle w:val="Compact"/>
+            </w:pPr>
+          </w:p>
+        </w:tc>
+        <w:tc>
+          <w:tcPr/>
+          <w:p>
+            <w:pPr>
+              <w:pStyle w:val="Compact"/>
+            </w:pPr>
           </w:p>
         </w:tc>
       </w:tr>
@@ -1624,13 +1590,13 @@
         <w:t xml:space="preserve"> </w:t>
       </w:r>
       <w:r>
-        <w:t xml:space="preserve">Five corpora, all drift levels, one model; four draws of the withheld columns on cspaper and player; three smaller build workloads on all five corpora;</w:t>
-      </w:r>
-      <w:r>
-        <w:t xml:space="preserve"> </w:t>
-      </w:r>
-      <w:r>
-        <w:t xml:space="preserve">replicated with two other models (RQ7).</w:t>
+        <w:t xml:space="preserve">Three corpora (cspaper, player, art; med and legal not yet run), all drift levels, one model; four draws</w:t>
+      </w:r>
+      <w:r>
+        <w:t xml:space="preserve"> </w:t>
+      </w:r>
+      <w:r>
+        <w:t xml:space="preserve">of the withheld columns on cspaper and player; three smaller build workloads; replicated with two other models (RQ7).</w:t>
       </w:r>
     </w:p>
     <w:p>
@@ -2128,7 +2094,7 @@
         <w:pStyle w:val="BodyText"/>
       </w:pPr>
       <w:r>
-        <w:t xml:space="preserve">The direction is not even fixed per column. In the smaller-workload builds of RQ1 (E12), med’s join key</w:t>
+        <w:t xml:space="preserve">The direction is not even fixed per column. In the smaller-workload builds of RQ1, art’s</w:t>
       </w:r>
       <w:r>
         <w:t xml:space="preserve"> </w:t>
@@ -2137,41 +2103,25 @@
         <w:rPr>
           <w:rStyle w:val="VerbatimChar"/>
         </w:rPr>
-        <w:t xml:space="preserve">disease.disease_name</w:t>
-      </w:r>
-      <w:r>
-        <w:t xml:space="preserve"> </w:t>
-      </w:r>
-      <w:r>
-        <w:t xml:space="preserve">read with 1–2 other columns is left</w:t>
-      </w:r>
-      <w:r>
-        <w:t xml:space="preserve"> </w:t>
-      </w:r>
-      <w:r>
-        <w:rPr>
-          <w:iCs/>
-          <w:i/>
-        </w:rPr>
-        <w:t xml:space="preserve">empty</w:t>
-      </w:r>
-      <w:r>
-        <w:t xml:space="preserve"> </w:t>
-      </w:r>
-      <w:r>
-        <w:t xml:space="preserve">on half the documents, against 12% when read with</w:t>
-      </w:r>
-      <w:r>
-        <w:t xml:space="preserve"> </w:t>
-      </w:r>
-      <w:r>
-        <w:t xml:space="preserve">8–11 other disease columns; the wide prompt fills it, often with every disease the article mentions. What a prompt’s</w:t>
-      </w:r>
-      <w:r>
-        <w:t xml:space="preserve"> </w:t>
-      </w:r>
-      <w:r>
-        <w:t xml:space="preserve">other columns do to a column is unpredictable in sign, which is a further reason not to tune width.</w:t>
+        <w:t xml:space="preserve">birth_country</w:t>
+      </w:r>
+      <w:r>
+        <w:t xml:space="preserve"> </w:t>
+      </w:r>
+      <w:r>
+        <w:t xml:space="preserve">read with 6</w:t>
+      </w:r>
+      <w:r>
+        <w:t xml:space="preserve"> </w:t>
+      </w:r>
+      <w:r>
+        <w:t xml:space="preserve">columns instead of 15 is right on 0.02 of documents instead of 0.53, while other columns gain. What a prompt’s other</w:t>
+      </w:r>
+      <w:r>
+        <w:t xml:space="preserve"> </w:t>
+      </w:r>
+      <w:r>
+        <w:t xml:space="preserve">columns do to a column is unpredictable in sign, which is a further reason not to tune width.</w:t>
       </w:r>
     </w:p>
     <w:p>
@@ -2264,7 +2214,13 @@
         <w:t xml:space="preserve"> </w:t>
       </w:r>
       <w:r>
-        <w:t xml:space="preserve">Five corpora, 40–141 documents each, one model.</w:t>
+        <w:t xml:space="preserve">Five corpora, 40–141 documents each, one model (extraction on fixed document samples; it does not use the</w:t>
+      </w:r>
+      <w:r>
+        <w:t xml:space="preserve"> </w:t>
+      </w:r>
+      <w:r>
+        <w:t xml:space="preserve">drift test queries).</w:t>
       </w:r>
     </w:p>
     <w:p>
@@ -2275,7 +2231,7 @@
       </w:r>
     </w:p>
     <w:bookmarkEnd w:id="37"/>
-    <w:bookmarkStart w:id="44" w:name="Xea857518a4cc4f8f457a64234e79d2973005789"/>
+    <w:bookmarkStart w:id="41" w:name="Xea857518a4cc4f8f457a64234e79d2973005789"/>
     <w:p>
       <w:pPr>
         <w:pStyle w:val="Heading2"/>
@@ -2286,255 +2242,62 @@
     </w:p>
     <w:p>
       <w:pPr>
-        <w:pStyle w:val="BlockText"/>
+        <w:pStyle w:val="FirstParagraph"/>
       </w:pPr>
       <w:r>
         <w:rPr>
           <w:bCs/>
           <w:b/>
         </w:rPr>
-        <w:t xml:space="preserve">Under revision.</w:t>
-      </w:r>
-      <w:r>
-        <w:t xml:space="preserve"> </w:t>
-      </w:r>
-      <w:r>
-        <w:t xml:space="preserve">The MIN/MAX-over-text queries this section builds on are artifacts of our drift query generator</w:t>
-      </w:r>
-      <w:r>
-        <w:t xml:space="preserve"> </w:t>
-      </w:r>
-      <w:r>
-        <w:t xml:space="preserve">(a type-blind attribute swap; 12 of legal’s and 30 of med’s test queries) and score zero by construction under the</w:t>
-      </w:r>
-      <w:r>
-        <w:t xml:space="preserve"> </w:t>
-      </w:r>
-      <w:r>
-        <w:t xml:space="preserve">benchmark metric. The</w:t>
-      </w:r>
-      <w:r>
-        <w:t xml:space="preserve"> </w:t>
-      </w:r>
-      <w:r>
-        <w:rPr>
-          <w:rStyle w:val="VerbatimChar"/>
-        </w:rPr>
-        <w:t xml:space="preserve">fragile</w:t>
-      </w:r>
-      <w:r>
-        <w:t xml:space="preserve"> </w:t>
-      </w:r>
-      <w:r>
-        <w:t xml:space="preserve">rule’s advantage and legal’s budget collapse come from them; this section will be</w:t>
-      </w:r>
-      <w:r>
-        <w:t xml:space="preserve"> </w:t>
-      </w:r>
-      <w:r>
-        <w:t xml:space="preserve">re-run on test streams without them.</w:t>
-      </w:r>
-    </w:p>
-    <w:p>
-      <w:pPr>
-        <w:pStyle w:val="FirstParagraph"/>
+        <w:t xml:space="preserve">Answer.</w:t>
+      </w:r>
+      <w:r>
+        <w:t xml:space="preserve"> </w:t>
+      </w:r>
+      <w:r>
+        <w:t xml:space="preserve">On the corpora run so far, no policy is reliably better than spending first-come-first-served (patch every</w:t>
+      </w:r>
+      <w:r>
+        <w:t xml:space="preserve"> </w:t>
+      </w:r>
+      <w:r>
+        <w:t xml:space="preserve">query that fits). Pacing the budget helps where early patches over-read and hurts where early patches are the valuable</w:t>
+      </w:r>
+      <w:r>
+        <w:t xml:space="preserve"> </w:t>
+      </w:r>
+      <w:r>
+        <w:t xml:space="preserve">ones; capping any single patch hurts everywhere; skipping patches that bought nothing changes little, because few</w:t>
+      </w:r>
+      <w:r>
+        <w:t xml:space="preserve"> </w:t>
+      </w:r>
+      <w:r>
+        <w:t xml:space="preserve">did. Even an offline plan that knows the whole stream is not better, because a patch’s cost and value depend on the</w:t>
+      </w:r>
+      <w:r>
+        <w:t xml:space="preserve"> </w:t>
+      </w:r>
+      <w:r>
+        <w:t xml:space="preserve">patches before it.</w:t>
+      </w:r>
+    </w:p>
+    <w:p>
+      <w:pPr>
+        <w:pStyle w:val="BodyText"/>
       </w:pPr>
       <w:r>
         <w:rPr>
           <w:bCs/>
           <w:b/>
         </w:rPr>
-        <w:t xml:space="preserve">Answer.</w:t>
-      </w:r>
-      <w:r>
-        <w:t xml:space="preserve"> </w:t>
-      </w:r>
-      <w:r>
-        <w:t xml:space="preserve">Spending the budget first-come-first-served (patch every query that fits) is not monotone: a larger budget</w:t>
-      </w:r>
-      <w:r>
-        <w:t xml:space="preserve"> </w:t>
-      </w:r>
-      <w:r>
-        <w:t xml:space="preserve">can score lower, because expensive early patches can exhaust the budget without improving any answer. A rule that</w:t>
-      </w:r>
-      <w:r>
-        <w:t xml:space="preserve"> </w:t>
-      </w:r>
-      <w:r>
-        <w:t xml:space="preserve">reads only the SQL,</w:t>
-      </w:r>
-      <w:r>
-        <w:t xml:space="preserve"> </w:t>
-      </w:r>
-      <w:r>
-        <w:rPr>
-          <w:iCs/>
-          <w:i/>
-        </w:rPr>
-        <w:t xml:space="preserve">never patch for a query whose answer is the minimum or maximum of a text column</w:t>
-      </w:r>
-      <w:r>
-        <w:t xml:space="preserve">, removes these</w:t>
-      </w:r>
-      <w:r>
-        <w:t xml:space="preserve"> </w:t>
-      </w:r>
-      <w:r>
-        <w:t xml:space="preserve">collapses, saves 16–28% of tokens where it applies, never hurts, and matches a hindsight oracle. No generic pacing or</w:t>
-      </w:r>
-      <w:r>
-        <w:t xml:space="preserve"> </w:t>
-      </w:r>
-      <w:r>
-        <w:t xml:space="preserve">capping policy is reliably better than first-come-first-served.</w:t>
-      </w:r>
-    </w:p>
-    <w:p>
-      <w:pPr>
-        <w:pStyle w:val="BodyText"/>
-      </w:pPr>
-      <w:r>
-        <w:rPr>
-          <w:bCs/>
-          <w:b/>
-        </w:rPr>
         <w:t xml:space="preserve">Evidence.</w:t>
       </w:r>
-    </w:p>
-    <w:p>
-      <w:pPr>
-        <w:pStyle w:val="BodyText"/>
-      </w:pPr>
-      <w:r>
-        <w:rPr>
-          <w:iCs/>
-          <w:i/>
-        </w:rPr>
-        <w:t xml:space="preserve">Why first-come-first-served collapses.</w:t>
-      </w:r>
-      <w:r>
-        <w:t xml:space="preserve"> </w:t>
-      </w:r>
-      <w:r>
-        <w:t xml:space="preserve">On legal at 100% drift, a 50% budget scores 0.053 while a 25% budget</w:t>
-      </w:r>
-      <w:r>
-        <w:t xml:space="preserve"> </w:t>
-      </w:r>
-      <w:r>
-        <w:t xml:space="preserve">scores 0.110. The 50% budget spends 8M of its 14.5M tokens on two early patches whose queries ask for the</w:t>
-      </w:r>
-      <w:r>
-        <w:t xml:space="preserve"> </w:t>
-      </w:r>
-      <w:r>
-        <w:t xml:space="preserve">alphabetically smallest counsel name per group; no extraction can answer those, and they help no later query. The 25%</w:t>
-      </w:r>
-      <w:r>
-        <w:t xml:space="preserve"> </w:t>
-      </w:r>
-      <w:r>
-        <w:t xml:space="preserve">budget cannot afford them and spends on patches that 19 later queries use.</w:t>
-      </w:r>
-    </w:p>
-    <w:p>
-      <w:pPr>
-        <w:pStyle w:val="BodyText"/>
-      </w:pPr>
-      <w:r>
-        <w:drawing>
-          <wp:inline>
-            <wp:extent cx="5334000" cy="2844800"/>
-            <wp:effectExtent b="0" l="0" r="0" t="0"/>
-            <wp:docPr descr="Legal at 100% drift: score by budget, first-come-first-served vs skipping MIN/MAX-over-text queries." title="" id="39" name="Picture"/>
-            <a:graphic>
-              <a:graphicData uri="http://schemas.openxmlformats.org/drawingml/2006/picture">
-                <pic:pic>
-                  <pic:nvPicPr>
-                    <pic:cNvPr descr="figures/rq3_legal_budget.png" id="40" name="Picture"/>
-                    <pic:cNvPicPr>
-                      <a:picLocks noChangeArrowheads="1" noChangeAspect="1"/>
-                    </pic:cNvPicPr>
-                  </pic:nvPicPr>
-                  <pic:blipFill>
-                    <a:blip r:embed="rId38"/>
-                    <a:stretch>
-                      <a:fillRect/>
-                    </a:stretch>
-                  </pic:blipFill>
-                  <pic:spPr bwMode="auto">
-                    <a:xfrm>
-                      <a:off x="0" y="0"/>
-                      <a:ext cx="5334000" cy="2844800"/>
-                    </a:xfrm>
-                    <a:prstGeom prst="rect">
-                      <a:avLst/>
-                    </a:prstGeom>
-                    <a:noFill/>
-                    <a:ln w="9525">
-                      <a:noFill/>
-                      <a:headEnd/>
-                      <a:tailEnd/>
-                    </a:ln>
-                  </pic:spPr>
-                </pic:pic>
-              </a:graphicData>
-            </a:graphic>
-          </wp:inline>
-        </w:drawing>
-      </w:r>
-      <w:r>
-        <w:t xml:space="preserve"> </w:t>
-      </w:r>
-      <w:r>
-        <w:rPr>
-          <w:iCs/>
-          <w:i/>
-        </w:rPr>
-        <w:t xml:space="preserve">Figure 6. Legal at 100% drift: score by budget, first-come-first-served vs skipping MIN/MAX-over-text queries.</w:t>
-      </w:r>
-    </w:p>
-    <w:p>
-      <w:pPr>
-        <w:pStyle w:val="BodyText"/>
-      </w:pPr>
-      <w:r>
-        <w:rPr>
-          <w:iCs/>
-          <w:i/>
-        </w:rPr>
-        <w:t xml:space="preserve">Such queries are unwinnable and expensive everywhere.</w:t>
-      </w:r>
-      <w:r>
-        <w:t xml:space="preserve"> </w:t>
-      </w:r>
-      <w:r>
-        <w:t xml:space="preserve">The 45 of 326 test queries that take MIN/MAX of a text column</w:t>
-      </w:r>
-      <w:r>
-        <w:t xml:space="preserve"> </w:t>
-      </w:r>
-      <w:r>
-        <w:t xml:space="preserve">score 0.03 on average with our system and 0.001 with the baseline, yet trigger 33% of all patch tokens.</w:t>
-      </w:r>
-    </w:p>
-    <w:p>
-      <w:pPr>
-        <w:pStyle w:val="BodyText"/>
-      </w:pPr>
-      <w:r>
-        <w:rPr>
-          <w:iCs/>
-          <w:i/>
-        </w:rPr>
-        <w:t xml:space="preserve">Five policies</w:t>
-      </w:r>
-      <w:r>
-        <w:t xml:space="preserve"> </w:t>
-      </w:r>
-      <w:r>
-        <w:t xml:space="preserve">(mean score over 25 budget × drift settings per corpus; tokens in parentheses where they differ):</w:t>
+      <w:r>
+        <w:t xml:space="preserve"> </w:t>
+      </w:r>
+      <w:r>
+        <w:t xml:space="preserve">Mean score over 25 budget × drift settings per corpus:</w:t>
       </w:r>
     </w:p>
     <w:tbl>
@@ -2661,10 +2424,6 @@
               <w:jc w:val="left"/>
             </w:pPr>
             <w:r>
-              <w:rPr>
-                <w:bCs/>
-                <w:b/>
-              </w:rPr>
               <w:t xml:space="preserve">0.3363</w:t>
             </w:r>
           </w:p>
@@ -2689,19 +2448,19 @@
               <w:jc w:val="left"/>
             </w:pPr>
             <w:r>
-              <w:t xml:space="preserve">0.1106 (219M)</w:t>
-            </w:r>
-          </w:p>
-        </w:tc>
-        <w:tc>
-          <w:tcPr/>
-          <w:p>
-            <w:pPr>
-              <w:pStyle w:val="Compact"/>
-              <w:jc w:val="left"/>
-            </w:pPr>
-            <w:r>
-              <w:t xml:space="preserve">0.0797 (154M)</w:t>
+              <w:t xml:space="preserve">not yet run</w:t>
+            </w:r>
+          </w:p>
+        </w:tc>
+        <w:tc>
+          <w:tcPr/>
+          <w:p>
+            <w:pPr>
+              <w:pStyle w:val="Compact"/>
+              <w:jc w:val="left"/>
+            </w:pPr>
+            <w:r>
+              <w:t xml:space="preserve">not yet run</w:t>
             </w:r>
           </w:p>
         </w:tc>
@@ -2715,7 +2474,7 @@
               <w:jc w:val="left"/>
             </w:pPr>
             <w:r>
-              <w:t xml:space="preserve">Skip MIN/MAX-over-text queries</w:t>
+              <w:t xml:space="preserve">Hindsight oracle (skip patches that bought nothing)</w:t>
             </w:r>
           </w:p>
         </w:tc>
@@ -2760,43 +2519,15 @@
           <w:p>
             <w:pPr>
               <w:pStyle w:val="Compact"/>
-              <w:jc w:val="left"/>
-            </w:pPr>
-            <w:r>
-              <w:rPr>
-                <w:bCs/>
-                <w:b/>
-              </w:rPr>
-              <w:t xml:space="preserve">0.1136</w:t>
-            </w:r>
-            <w:r>
-              <w:t xml:space="preserve"> </w:t>
-            </w:r>
-            <w:r>
-              <w:t xml:space="preserve">(158M)</w:t>
-            </w:r>
-          </w:p>
-        </w:tc>
-        <w:tc>
-          <w:tcPr/>
-          <w:p>
-            <w:pPr>
-              <w:pStyle w:val="Compact"/>
-              <w:jc w:val="left"/>
-            </w:pPr>
-            <w:r>
-              <w:rPr>
-                <w:bCs/>
-                <w:b/>
-              </w:rPr>
-              <w:t xml:space="preserve">0.0828</w:t>
-            </w:r>
-            <w:r>
-              <w:t xml:space="preserve"> </w:t>
-            </w:r>
-            <w:r>
-              <w:t xml:space="preserve">(130M)</w:t>
-            </w:r>
+            </w:pPr>
+          </w:p>
+        </w:tc>
+        <w:tc>
+          <w:tcPr/>
+          <w:p>
+            <w:pPr>
+              <w:pStyle w:val="Compact"/>
+            </w:pPr>
           </w:p>
         </w:tc>
       </w:tr>
@@ -2809,80 +2540,6 @@
               <w:jc w:val="left"/>
             </w:pPr>
             <w:r>
-              <w:t xml:space="preserve">Hindsight oracle (skip patches that bought nothing)</w:t>
-            </w:r>
-          </w:p>
-        </w:tc>
-        <w:tc>
-          <w:tcPr/>
-          <w:p>
-            <w:pPr>
-              <w:pStyle w:val="Compact"/>
-              <w:jc w:val="left"/>
-            </w:pPr>
-            <w:r>
-              <w:t xml:space="preserve">0.1453</w:t>
-            </w:r>
-          </w:p>
-        </w:tc>
-        <w:tc>
-          <w:tcPr/>
-          <w:p>
-            <w:pPr>
-              <w:pStyle w:val="Compact"/>
-              <w:jc w:val="left"/>
-            </w:pPr>
-            <w:r>
-              <w:t xml:space="preserve">0.3363</w:t>
-            </w:r>
-          </w:p>
-        </w:tc>
-        <w:tc>
-          <w:tcPr/>
-          <w:p>
-            <w:pPr>
-              <w:pStyle w:val="Compact"/>
-              <w:jc w:val="left"/>
-            </w:pPr>
-            <w:r>
-              <w:t xml:space="preserve">0.2356</w:t>
-            </w:r>
-          </w:p>
-        </w:tc>
-        <w:tc>
-          <w:tcPr/>
-          <w:p>
-            <w:pPr>
-              <w:pStyle w:val="Compact"/>
-              <w:jc w:val="left"/>
-            </w:pPr>
-            <w:r>
-              <w:t xml:space="preserve">0.1129 (158M)</w:t>
-            </w:r>
-          </w:p>
-        </w:tc>
-        <w:tc>
-          <w:tcPr/>
-          <w:p>
-            <w:pPr>
-              <w:pStyle w:val="Compact"/>
-              <w:jc w:val="left"/>
-            </w:pPr>
-            <w:r>
-              <w:t xml:space="preserve">0.0797 (130M)</w:t>
-            </w:r>
-          </w:p>
-        </w:tc>
-      </w:tr>
-      <w:tr>
-        <w:tc>
-          <w:tcPr/>
-          <w:p>
-            <w:pPr>
-              <w:pStyle w:val="Compact"/>
-              <w:jc w:val="left"/>
-            </w:pPr>
-            <w:r>
               <w:t xml:space="preserve">Cap any single patch at 25% of the budget</w:t>
             </w:r>
           </w:p>
@@ -2928,23 +2585,15 @@
           <w:p>
             <w:pPr>
               <w:pStyle w:val="Compact"/>
-              <w:jc w:val="left"/>
-            </w:pPr>
-            <w:r>
-              <w:t xml:space="preserve">0.0992</w:t>
-            </w:r>
-          </w:p>
-        </w:tc>
-        <w:tc>
-          <w:tcPr/>
-          <w:p>
-            <w:pPr>
-              <w:pStyle w:val="Compact"/>
-              <w:jc w:val="left"/>
-            </w:pPr>
-            <w:r>
-              <w:t xml:space="preserve">0.0812</w:t>
-            </w:r>
+            </w:pPr>
+          </w:p>
+        </w:tc>
+        <w:tc>
+          <w:tcPr/>
+          <w:p>
+            <w:pPr>
+              <w:pStyle w:val="Compact"/>
+            </w:pPr>
           </w:p>
         </w:tc>
       </w:tr>
@@ -3010,23 +2659,15 @@
           <w:p>
             <w:pPr>
               <w:pStyle w:val="Compact"/>
-              <w:jc w:val="left"/>
-            </w:pPr>
-            <w:r>
-              <w:t xml:space="preserve">0.1030</w:t>
-            </w:r>
-          </w:p>
-        </w:tc>
-        <w:tc>
-          <w:tcPr/>
-          <w:p>
-            <w:pPr>
-              <w:pStyle w:val="Compact"/>
-              <w:jc w:val="left"/>
-            </w:pPr>
-            <w:r>
-              <w:t xml:space="preserve">0.0821</w:t>
-            </w:r>
+            </w:pPr>
+          </w:p>
+        </w:tc>
+        <w:tc>
+          <w:tcPr/>
+          <w:p>
+            <w:pPr>
+              <w:pStyle w:val="Compact"/>
+            </w:pPr>
           </w:p>
         </w:tc>
       </w:tr>
@@ -3088,23 +2729,15 @@
           <w:p>
             <w:pPr>
               <w:pStyle w:val="Compact"/>
-              <w:jc w:val="left"/>
-            </w:pPr>
-            <w:r>
-              <w:t xml:space="preserve">0.1128 (156M)</w:t>
-            </w:r>
-          </w:p>
-        </w:tc>
-        <w:tc>
-          <w:tcPr/>
-          <w:p>
-            <w:pPr>
-              <w:pStyle w:val="Compact"/>
-              <w:jc w:val="left"/>
-            </w:pPr>
-            <w:r>
-              <w:t xml:space="preserve">0.0827 (127M)</w:t>
-            </w:r>
+            </w:pPr>
+          </w:p>
+        </w:tc>
+        <w:tc>
+          <w:tcPr/>
+          <w:p>
+            <w:pPr>
+              <w:pStyle w:val="Compact"/>
+            </w:pPr>
           </w:p>
         </w:tc>
       </w:tr>
@@ -3114,25 +2747,19 @@
         <w:pStyle w:val="BodyText"/>
       </w:pPr>
       <w:r>
-        <w:t xml:space="preserve">The SQL rule has no effect where no query matches (cspaper, player, art), and on legal it removes the collapse (50%</w:t>
-      </w:r>
-      <w:r>
-        <w:t xml:space="preserve"> </w:t>
-      </w:r>
-      <w:r>
-        <w:t xml:space="preserve">budget at 100% drift: 0.053 → 0.107) while saving 28% of tokens. Pacing helps where early patches over-read</w:t>
-      </w:r>
-      <w:r>
-        <w:t xml:space="preserve"> </w:t>
-      </w:r>
-      <w:r>
-        <w:t xml:space="preserve">(cspaper, art) and hurts where early patches are the valuable ones (player, legal). Whether any skipping helps tracks</w:t>
-      </w:r>
-      <w:r>
-        <w:t xml:space="preserve"> </w:t>
-      </w:r>
-      <w:r>
-        <w:t xml:space="preserve">the share of patch tokens that bought nothing: none on player, about a third on legal and med.</w:t>
+        <w:t xml:space="preserve">Pacing helps where early patches over-read (cspaper, art) and hurts where early patches are the valuable ones</w:t>
+      </w:r>
+      <w:r>
+        <w:t xml:space="preserve"> </w:t>
+      </w:r>
+      <w:r>
+        <w:t xml:space="preserve">(player). The hindsight oracle equals first-come-first-served on all three corpora: at 100% drift no player patch and</w:t>
+      </w:r>
+      <w:r>
+        <w:t xml:space="preserve"> </w:t>
+      </w:r>
+      <w:r>
+        <w:t xml:space="preserve">few cspaper and art patches bought nothing (RQ4).</w:t>
       </w:r>
     </w:p>
     <w:p>
@@ -3162,25 +2789,25 @@
         <w:t xml:space="preserve"> </w:t>
       </w:r>
       <w:r>
-        <w:t xml:space="preserve">A patch’s cost and value both depend on the patches before it: without the earlier patches that made its filter</w:t>
-      </w:r>
-      <w:r>
-        <w:t xml:space="preserve"> </w:t>
-      </w:r>
-      <w:r>
-        <w:t xml:space="preserve">columns known, a chosen legal patch reads 570 documents instead of 57 (4.2M tokens instead of 0.14M) and no longer</w:t>
-      </w:r>
-      <w:r>
-        <w:t xml:space="preserve"> </w:t>
-      </w:r>
-      <w:r>
-        <w:t xml:space="preserve">fits; and gains measured with every other patch present are not additive. The knapsack does confirm how much budget</w:t>
-      </w:r>
-      <w:r>
-        <w:t xml:space="preserve"> </w:t>
-      </w:r>
-      <w:r>
-        <w:t xml:space="preserve">buys nothing: at the full budget it leaves 23–39% unspent on legal, med and cspaper at about the same score.</w:t>
+        <w:t xml:space="preserve">A patch’s cost and value both depend on the patches before it: without the earlier patches that narrowed its scope, a</w:t>
+      </w:r>
+      <w:r>
+        <w:t xml:space="preserve"> </w:t>
+      </w:r>
+      <w:r>
+        <w:t xml:space="preserve">chosen player patch reads 29 documents instead of 1 (0.55M estimated tokens instead of 0.02M) and no longer fits; and</w:t>
+      </w:r>
+      <w:r>
+        <w:t xml:space="preserve"> </w:t>
+      </w:r>
+      <w:r>
+        <w:t xml:space="preserve">gains measured with every other patch present are not additive. At the full budget the knapsack leaves 39% of</w:t>
+      </w:r>
+      <w:r>
+        <w:t xml:space="preserve"> </w:t>
+      </w:r>
+      <w:r>
+        <w:t xml:space="preserve">cspaper’s budget unspent (0.71M of 1.16M tokens) at the same score.</w:t>
       </w:r>
     </w:p>
     <w:p>
@@ -3192,18 +2819,18 @@
           <wp:inline>
             <wp:extent cx="5334000" cy="2240280"/>
             <wp:effectExtent b="0" l="0" r="0" t="0"/>
-            <wp:docPr descr="Each policy’s mean score minus first-come-first-served, per corpus." title="" id="42" name="Picture"/>
+            <wp:docPr descr="Each policy’s mean score minus first-come-first-served, per corpus." title="" id="39" name="Picture"/>
             <a:graphic>
               <a:graphicData uri="http://schemas.openxmlformats.org/drawingml/2006/picture">
                 <pic:pic>
                   <pic:nvPicPr>
-                    <pic:cNvPr descr="figures/rq3_policies.png" id="43" name="Picture"/>
+                    <pic:cNvPr descr="figures/rq3_policies.png" id="40" name="Picture"/>
                     <pic:cNvPicPr>
                       <a:picLocks noChangeArrowheads="1" noChangeAspect="1"/>
                     </pic:cNvPicPr>
                   </pic:nvPicPr>
                   <pic:blipFill>
-                    <a:blip r:embed="rId41"/>
+                    <a:blip r:embed="rId38"/>
                     <a:stretch>
                       <a:fillRect/>
                     </a:stretch>
@@ -3237,7 +2864,7 @@
           <w:iCs/>
           <w:i/>
         </w:rPr>
-        <w:t xml:space="preserve">Figure 7. Each policy’s mean score minus first-come-first-served, per corpus.</w:t>
+        <w:t xml:space="preserve">Figure 6. Each policy’s mean score minus first-come-first-served, per corpus.</w:t>
       </w:r>
     </w:p>
     <w:p>
@@ -3255,19 +2882,13 @@
         <w:t xml:space="preserve"> </w:t>
       </w:r>
       <w:r>
-        <w:t xml:space="preserve">Budgeted adaptive extraction needs value-aware skipping, and simple SQL-level signals already</w:t>
-      </w:r>
-      <w:r>
-        <w:t xml:space="preserve"> </w:t>
-      </w:r>
-      <w:r>
-        <w:t xml:space="preserve">capture most of the value of hindsight; budget pacing and per-patch caps are not safe defaults, and because patch costs and</w:t>
-      </w:r>
-      <w:r>
-        <w:t xml:space="preserve"> </w:t>
-      </w:r>
-      <w:r>
-        <w:t xml:space="preserve">values depend on order, an offline plan over patches is no substitute for deciding online.</w:t>
+        <w:t xml:space="preserve">Budget pacing and per-patch caps are not safe defaults; and because patch costs and values depend on</w:t>
+      </w:r>
+      <w:r>
+        <w:t xml:space="preserve"> </w:t>
+      </w:r>
+      <w:r>
+        <w:t xml:space="preserve">order, an offline plan over patches is no substitute for deciding online.</w:t>
       </w:r>
     </w:p>
     <w:p>
@@ -3285,13 +2906,7 @@
         <w:t xml:space="preserve"> </w:t>
       </w:r>
       <w:r>
-        <w:t xml:space="preserve">Five corpora × five budgets × five drift levels. Not yet computed: the offline optimum over all patch</w:t>
-      </w:r>
-      <w:r>
-        <w:t xml:space="preserve"> </w:t>
-      </w:r>
-      <w:r>
-        <w:t xml:space="preserve">subsets, which would bound every policy.</w:t>
+        <w:t xml:space="preserve">Three corpora (med and legal not yet run) × five budgets × five drift levels.</w:t>
       </w:r>
     </w:p>
     <w:p>
@@ -3301,8 +2916,8 @@
         </w:pict>
       </w:r>
     </w:p>
-    <w:bookmarkEnd w:id="44"/>
-    <w:bookmarkStart w:id="48" w:name="X5722249a796b26fcc2ef85b7f325a424b6509e1"/>
+    <w:bookmarkEnd w:id="41"/>
+    <w:bookmarkStart w:id="45" w:name="X5722249a796b26fcc2ef85b7f325a424b6509e1"/>
     <w:p>
       <w:pPr>
         <w:pStyle w:val="Heading2"/>
@@ -3326,13 +2941,13 @@
         <w:t xml:space="preserve"> </w:t>
       </w:r>
       <w:r>
-        <w:t xml:space="preserve">Cost, yes, almost exactly. Value only partly: a large share of extraction tokens buy nothing, and two</w:t>
-      </w:r>
-      <w:r>
-        <w:t xml:space="preserve"> </w:t>
-      </w:r>
-      <w:r>
-        <w:t xml:space="preserve">signals visible in the SQL locate most of that waste.</w:t>
+        <w:t xml:space="preserve">Cost, yes, almost exactly. On the corpora run so far few extraction tokens buy nothing, and most of those</w:t>
+      </w:r>
+      <w:r>
+        <w:t xml:space="preserve"> </w:t>
+      </w:r>
+      <w:r>
+        <w:t xml:space="preserve">are spent by patches that read the whole corpus.</w:t>
       </w:r>
     </w:p>
     <w:p>
@@ -3386,7 +3001,13 @@
         <w:t xml:space="preserve"> </w:t>
       </w:r>
       <w:r>
-        <w:t xml:space="preserve">columns: player 0%, art 16%, med 32%, legal 39%, cspaper 39%. Over all 138 patches (152M tokens, 29% wasted):</w:t>
+        <w:t xml:space="preserve">columns, at 100% drift: player 0%, art 16%, cspaper 39% (med and legal not yet run). Over all 67 patches of the</w:t>
+      </w:r>
+      <w:r>
+        <w:t xml:space="preserve"> </w:t>
+      </w:r>
+      <w:r>
+        <w:t xml:space="preserve">unlimited streams at every drift level (31.5M tokens, 5% wasted):</w:t>
       </w:r>
     </w:p>
     <w:tbl>
@@ -3450,31 +3071,31 @@
               <w:jc w:val="left"/>
             </w:pPr>
             <w:r>
-              <w:t xml:space="preserve">MIN/MAX over a text column</w:t>
-            </w:r>
-          </w:p>
-        </w:tc>
-        <w:tc>
-          <w:tcPr/>
-          <w:p>
-            <w:pPr>
-              <w:pStyle w:val="Compact"/>
-              <w:jc w:val="left"/>
-            </w:pPr>
-            <w:r>
-              <w:t xml:space="preserve">68%</w:t>
-            </w:r>
-          </w:p>
-        </w:tc>
-        <w:tc>
-          <w:tcPr/>
-          <w:p>
-            <w:pPr>
-              <w:pStyle w:val="Compact"/>
-              <w:jc w:val="left"/>
-            </w:pPr>
-            <w:r>
-              <w:t xml:space="preserve">73%</w:t>
+              <w:t xml:space="preserve">No filter (the patch reads the whole corpus)</w:t>
+            </w:r>
+          </w:p>
+        </w:tc>
+        <w:tc>
+          <w:tcPr/>
+          <w:p>
+            <w:pPr>
+              <w:pStyle w:val="Compact"/>
+              <w:jc w:val="left"/>
+            </w:pPr>
+            <w:r>
+              <w:t xml:space="preserve">7%</w:t>
+            </w:r>
+          </w:p>
+        </w:tc>
+        <w:tc>
+          <w:tcPr/>
+          <w:p>
+            <w:pPr>
+              <w:pStyle w:val="Compact"/>
+              <w:jc w:val="left"/>
+            </w:pPr>
+            <w:r>
+              <w:t xml:space="preserve">86%</w:t>
             </w:r>
           </w:p>
         </w:tc>
@@ -3488,31 +3109,31 @@
               <w:jc w:val="left"/>
             </w:pPr>
             <w:r>
-              <w:t xml:space="preserve">No filter (the patch reads the whole corpus)</w:t>
-            </w:r>
-          </w:p>
-        </w:tc>
-        <w:tc>
-          <w:tcPr/>
-          <w:p>
-            <w:pPr>
-              <w:pStyle w:val="Compact"/>
-              <w:jc w:val="left"/>
-            </w:pPr>
-            <w:r>
-              <w:t xml:space="preserve">44%</w:t>
-            </w:r>
-          </w:p>
-        </w:tc>
-        <w:tc>
-          <w:tcPr/>
-          <w:p>
-            <w:pPr>
-              <w:pStyle w:val="Compact"/>
-              <w:jc w:val="left"/>
-            </w:pPr>
-            <w:r>
-              <w:t xml:space="preserve">89%</w:t>
+              <w:t xml:space="preserve">A filter scopes the patch</w:t>
+            </w:r>
+          </w:p>
+        </w:tc>
+        <w:tc>
+          <w:tcPr/>
+          <w:p>
+            <w:pPr>
+              <w:pStyle w:val="Compact"/>
+              <w:jc w:val="left"/>
+            </w:pPr>
+            <w:r>
+              <w:t xml:space="preserve">2%</w:t>
+            </w:r>
+          </w:p>
+        </w:tc>
+        <w:tc>
+          <w:tcPr/>
+          <w:p>
+            <w:pPr>
+              <w:pStyle w:val="Compact"/>
+              <w:jc w:val="left"/>
+            </w:pPr>
+            <w:r>
+              <w:t xml:space="preserve">14%</w:t>
             </w:r>
           </w:p>
         </w:tc>
@@ -3526,44 +3147,6 @@
               <w:jc w:val="left"/>
             </w:pPr>
             <w:r>
-              <w:t xml:space="preserve">A filter scopes the patch</w:t>
-            </w:r>
-          </w:p>
-        </w:tc>
-        <w:tc>
-          <w:tcPr/>
-          <w:p>
-            <w:pPr>
-              <w:pStyle w:val="Compact"/>
-              <w:jc w:val="left"/>
-            </w:pPr>
-            <w:r>
-              <w:t xml:space="preserve">8%</w:t>
-            </w:r>
-          </w:p>
-        </w:tc>
-        <w:tc>
-          <w:tcPr/>
-          <w:p>
-            <w:pPr>
-              <w:pStyle w:val="Compact"/>
-              <w:jc w:val="left"/>
-            </w:pPr>
-            <w:r>
-              <w:t xml:space="preserve">11%</w:t>
-            </w:r>
-          </w:p>
-        </w:tc>
-      </w:tr>
-      <w:tr>
-        <w:tc>
-          <w:tcPr/>
-          <w:p>
-            <w:pPr>
-              <w:pStyle w:val="Compact"/>
-              <w:jc w:val="left"/>
-            </w:pPr>
-            <w:r>
               <w:t xml:space="preserve">AVG/SUM aggregate</w:t>
             </w:r>
           </w:p>
@@ -3576,19 +3159,19 @@
               <w:jc w:val="left"/>
             </w:pPr>
             <w:r>
-              <w:t xml:space="preserve">1%</w:t>
-            </w:r>
-          </w:p>
-        </w:tc>
-        <w:tc>
-          <w:tcPr/>
-          <w:p>
-            <w:pPr>
-              <w:pStyle w:val="Compact"/>
-              <w:jc w:val="left"/>
-            </w:pPr>
-            <w:r>
-              <w:t xml:space="preserve">1%</w:t>
+              <w:t xml:space="preserve">2%</w:t>
+            </w:r>
+          </w:p>
+        </w:tc>
+        <w:tc>
+          <w:tcPr/>
+          <w:p>
+            <w:pPr>
+              <w:pStyle w:val="Compact"/>
+              <w:jc w:val="left"/>
+            </w:pPr>
+            <w:r>
+              <w:t xml:space="preserve">14%</w:t>
             </w:r>
           </w:p>
         </w:tc>
@@ -3603,18 +3186,18 @@
           <wp:inline>
             <wp:extent cx="5334000" cy="1648690"/>
             <wp:effectExtent b="0" l="0" r="0" t="0"/>
-            <wp:docPr descr="Wasted extraction tokens by SQL-visible signal." title="" id="46" name="Picture"/>
+            <wp:docPr descr="Wasted extraction tokens by SQL-visible signal." title="" id="43" name="Picture"/>
             <a:graphic>
               <a:graphicData uri="http://schemas.openxmlformats.org/drawingml/2006/picture">
                 <pic:pic>
                   <pic:nvPicPr>
-                    <pic:cNvPr descr="figures/rq4_signals.png" id="47" name="Picture"/>
+                    <pic:cNvPr descr="figures/rq4_signals.png" id="44" name="Picture"/>
                     <pic:cNvPicPr>
                       <a:picLocks noChangeArrowheads="1" noChangeAspect="1"/>
                     </pic:cNvPicPr>
                   </pic:nvPicPr>
                   <pic:blipFill>
-                    <a:blip r:embed="rId45"/>
+                    <a:blip r:embed="rId42"/>
                     <a:stretch>
                       <a:fillRect/>
                     </a:stretch>
@@ -3648,7 +3231,7 @@
           <w:iCs/>
           <w:i/>
         </w:rPr>
-        <w:t xml:space="preserve">Figure 8. Wasted extraction tokens by SQL-visible signal.</w:t>
+        <w:t xml:space="preserve">Figure 7. Wasted extraction tokens by SQL-visible signal.</w:t>
       </w:r>
     </w:p>
     <w:p>
@@ -3666,13 +3249,13 @@
         <w:t xml:space="preserve"> </w:t>
       </w:r>
       <w:r>
-        <w:t xml:space="preserve">A planner can trust its cost model and should spend its modelling effort on value; cheap SQL</w:t>
-      </w:r>
-      <w:r>
-        <w:t xml:space="preserve"> </w:t>
-      </w:r>
-      <w:r>
-        <w:t xml:space="preserve">features already separate risky extractions (whole-corpus reads for text extrema) from safe ones (scoped, numeric).</w:t>
+        <w:t xml:space="preserve">A planner can trust its cost model; where value is uncertain, whole-corpus reads are the extractions</w:t>
+      </w:r>
+      <w:r>
+        <w:t xml:space="preserve"> </w:t>
+      </w:r>
+      <w:r>
+        <w:t xml:space="preserve">to scrutinize.</w:t>
       </w:r>
     </w:p>
     <w:p>
@@ -3690,7 +3273,7 @@
         <w:t xml:space="preserve"> </w:t>
       </w:r>
       <w:r>
-        <w:t xml:space="preserve">Five corpora, the unlimited streams at full drift.</w:t>
+        <w:t xml:space="preserve">Three corpora (med and legal not yet run), the unlimited streams.</w:t>
       </w:r>
     </w:p>
     <w:p>
@@ -3700,8 +3283,8 @@
         </w:pict>
       </w:r>
     </w:p>
-    <w:bookmarkEnd w:id="48"/>
-    <w:bookmarkStart w:id="52" w:name="Xe8b3b4dee71c336614042affb4d375ab12ca1b7"/>
+    <w:bookmarkEnd w:id="45"/>
+    <w:bookmarkStart w:id="49" w:name="Xe8b3b4dee71c336614042affb4d375ab12ca1b7"/>
     <w:p>
       <w:pPr>
         <w:pStyle w:val="Heading2"/>
@@ -4092,18 +3675,18 @@
           <wp:inline>
             <wp:extent cx="5334000" cy="2726266"/>
             <wp:effectExtent b="0" l="0" r="0" t="0"/>
-            <wp:docPr descr="Score vs tokens for planner configurations and single shared passes (player)." title="" id="50" name="Picture"/>
+            <wp:docPr descr="Score vs tokens for planner configurations and single shared passes (player)." title="" id="47" name="Picture"/>
             <a:graphic>
               <a:graphicData uri="http://schemas.openxmlformats.org/drawingml/2006/picture">
                 <pic:pic>
                   <pic:nvPicPr>
-                    <pic:cNvPr descr="figures/rq5_planner.png" id="51" name="Picture"/>
+                    <pic:cNvPr descr="figures/rq5_planner.png" id="48" name="Picture"/>
                     <pic:cNvPicPr>
                       <a:picLocks noChangeArrowheads="1" noChangeAspect="1"/>
                     </pic:cNvPicPr>
                   </pic:nvPicPr>
                   <pic:blipFill>
-                    <a:blip r:embed="rId49"/>
+                    <a:blip r:embed="rId46"/>
                     <a:stretch>
                       <a:fillRect/>
                     </a:stretch>
@@ -4137,7 +3720,7 @@
           <w:iCs/>
           <w:i/>
         </w:rPr>
-        <w:t xml:space="preserve">Figure 9. Score vs tokens for planner configurations and single shared passes (player).</w:t>
+        <w:t xml:space="preserve">Figure 8. Score vs tokens for planner configurations and single shared passes (player).</w:t>
       </w:r>
     </w:p>
     <w:p>
@@ -4201,8 +3784,8 @@
         </w:pict>
       </w:r>
     </w:p>
-    <w:bookmarkEnd w:id="52"/>
-    <w:bookmarkStart w:id="56" w:name="Xe9a8932c350571f932f195ad307ddbaa6c29e8e"/>
+    <w:bookmarkEnd w:id="49"/>
+    <w:bookmarkStart w:id="53" w:name="Xe9a8932c350571f932f195ad307ddbaa6c29e8e"/>
     <w:p>
       <w:pPr>
         <w:pStyle w:val="Heading2"/>
@@ -4314,18 +3897,18 @@
           <wp:inline>
             <wp:extent cx="5334000" cy="2252133"/>
             <wp:effectExtent b="0" l="0" r="0" t="0"/>
-            <wp:docPr descr="Cells that differ between budgeted and unlimited streams, by kind (log scale)." title="" id="54" name="Picture"/>
+            <wp:docPr descr="Cells that differ between budgeted and unlimited streams, by kind (log scale)." title="" id="51" name="Picture"/>
             <a:graphic>
               <a:graphicData uri="http://schemas.openxmlformats.org/drawingml/2006/picture">
                 <pic:pic>
                   <pic:nvPicPr>
-                    <pic:cNvPr descr="figures/rq6_cells.png" id="55" name="Picture"/>
+                    <pic:cNvPr descr="figures/rq6_cells.png" id="52" name="Picture"/>
                     <pic:cNvPicPr>
                       <a:picLocks noChangeArrowheads="1" noChangeAspect="1"/>
                     </pic:cNvPicPr>
                   </pic:nvPicPr>
                   <pic:blipFill>
-                    <a:blip r:embed="rId53"/>
+                    <a:blip r:embed="rId50"/>
                     <a:stretch>
                       <a:fillRect/>
                     </a:stretch>
@@ -4359,7 +3942,7 @@
           <w:iCs/>
           <w:i/>
         </w:rPr>
-        <w:t xml:space="preserve">Figure 10. Cells that differ between budgeted and unlimited streams, by kind (log scale).</w:t>
+        <w:t xml:space="preserve">Figure 9. Cells that differ between budgeted and unlimited streams, by kind (log scale).</w:t>
       </w:r>
     </w:p>
     <w:p>
@@ -4401,7 +3984,7 @@
         <w:t xml:space="preserve"> </w:t>
       </w:r>
       <w:r>
-        <w:t xml:space="preserve">Five corpora, all budget × drift settings.</w:t>
+        <w:t xml:space="preserve">Three corpora (med and legal not yet run), all budget × drift settings.</w:t>
       </w:r>
     </w:p>
     <w:p>
@@ -4411,8 +3994,8 @@
         </w:pict>
       </w:r>
     </w:p>
-    <w:bookmarkEnd w:id="56"/>
-    <w:bookmarkStart w:id="60" w:name="Xdc29460b1fb7bc7d935a35e4e1ce23be79b2d07"/>
+    <w:bookmarkEnd w:id="53"/>
+    <w:bookmarkStart w:id="57" w:name="Xdc29460b1fb7bc7d935a35e4e1ce23be79b2d07"/>
     <w:p>
       <w:pPr>
         <w:pStyle w:val="Heading2"/>
@@ -4823,86 +4406,36 @@
               <w:jc w:val="left"/>
             </w:pPr>
             <w:r>
-              <w:t xml:space="preserve">med, patched at 0% → 100% drift (static at 100%)</w:t>
-            </w:r>
-          </w:p>
-        </w:tc>
-        <w:tc>
-          <w:tcPr/>
-          <w:p>
-            <w:pPr>
-              <w:pStyle w:val="Compact"/>
-            </w:pPr>
-          </w:p>
-        </w:tc>
-        <w:tc>
-          <w:tcPr/>
-          <w:p>
-            <w:pPr>
-              <w:pStyle w:val="Compact"/>
-              <w:jc w:val="left"/>
-            </w:pPr>
-            <w:r>
-              <w:t xml:space="preserve">0.095 → 0.086 (0.031)</w:t>
-            </w:r>
-          </w:p>
-        </w:tc>
-        <w:tc>
-          <w:tcPr/>
-          <w:p>
-            <w:pPr>
-              <w:pStyle w:val="Compact"/>
-              <w:jc w:val="left"/>
-            </w:pPr>
-            <w:r>
-              <w:t xml:space="preserve">0.092 → 0.098 (0.050)</w:t>
-            </w:r>
-          </w:p>
-        </w:tc>
-      </w:tr>
-      <w:tr>
-        <w:tc>
-          <w:tcPr/>
-          <w:p>
-            <w:pPr>
-              <w:pStyle w:val="Compact"/>
-              <w:jc w:val="left"/>
-            </w:pPr>
-            <w:r>
-              <w:t xml:space="preserve">legal, patched at 0% → 100% drift (static at 100%)</w:t>
-            </w:r>
-          </w:p>
-        </w:tc>
-        <w:tc>
-          <w:tcPr/>
-          <w:p>
-            <w:pPr>
-              <w:pStyle w:val="Compact"/>
-            </w:pPr>
-          </w:p>
-        </w:tc>
-        <w:tc>
-          <w:tcPr/>
-          <w:p>
-            <w:pPr>
-              <w:pStyle w:val="Compact"/>
-              <w:jc w:val="left"/>
-            </w:pPr>
-            <w:r>
-              <w:t xml:space="preserve">0.121 → 0.114 (0.005)</w:t>
-            </w:r>
-          </w:p>
-        </w:tc>
-        <w:tc>
-          <w:tcPr/>
-          <w:p>
-            <w:pPr>
-              <w:pStyle w:val="Compact"/>
-              <w:jc w:val="left"/>
-            </w:pPr>
-            <w:r>
-              <w:t xml:space="preserve">0.239 → 0.224 (0.005)</w:t>
-            </w:r>
+              <w:t xml:space="preserve">med, legal</w:t>
+            </w:r>
+          </w:p>
+        </w:tc>
+        <w:tc>
+          <w:tcPr/>
+          <w:p>
+            <w:pPr>
+              <w:pStyle w:val="Compact"/>
+              <w:jc w:val="left"/>
+            </w:pPr>
+            <w:r>
+              <w:t xml:space="preserve">not yet run</w:t>
+            </w:r>
+          </w:p>
+        </w:tc>
+        <w:tc>
+          <w:tcPr/>
+          <w:p>
+            <w:pPr>
+              <w:pStyle w:val="Compact"/>
+            </w:pPr>
+          </w:p>
+        </w:tc>
+        <w:tc>
+          <w:tcPr/>
+          <w:p>
+            <w:pPr>
+              <w:pStyle w:val="Compact"/>
+            </w:pPr>
           </w:p>
         </w:tc>
       </w:tr>
@@ -4936,18 +4469,18 @@
           <wp:inline>
             <wp:extent cx="5334000" cy="1559169"/>
             <wp:effectExtent b="0" l="0" r="0" t="0"/>
-            <wp:docPr descr="Three models: single pass, and patched vs static at 100% drift." title="" id="58" name="Picture"/>
+            <wp:docPr descr="Three models: single pass, and patched vs static at 100% drift." title="" id="55" name="Picture"/>
             <a:graphic>
               <a:graphicData uri="http://schemas.openxmlformats.org/drawingml/2006/picture">
                 <pic:pic>
                   <pic:nvPicPr>
-                    <pic:cNvPr descr="figures/rq7_models.png" id="59" name="Picture"/>
+                    <pic:cNvPr descr="figures/rq7_models.png" id="56" name="Picture"/>
                     <pic:cNvPicPr>
                       <a:picLocks noChangeArrowheads="1" noChangeAspect="1"/>
                     </pic:cNvPicPr>
                   </pic:nvPicPr>
                   <pic:blipFill>
-                    <a:blip r:embed="rId57"/>
+                    <a:blip r:embed="rId54"/>
                     <a:stretch>
                       <a:fillRect/>
                     </a:stretch>
@@ -4981,7 +4514,7 @@
           <w:iCs/>
           <w:i/>
         </w:rPr>
-        <w:t xml:space="preserve">Figure 11. Three models: single pass, and patched vs static at 100% drift.</w:t>
+        <w:t xml:space="preserve">Figure 10. Three models: single pass, and patched vs static at 100% drift.</w:t>
       </w:r>
     </w:p>
     <w:p>
@@ -5013,25 +4546,13 @@
         <w:pStyle w:val="BodyText"/>
       </w:pPr>
       <w:r>
-        <w:t xml:space="preserve">The 32B model raises the 0%-drift score on every corpus (cspaper +0.028, player +0.022, art +0.023, legal +0.118)</w:t>
-      </w:r>
-      <w:r>
-        <w:t xml:space="preserve"> </w:t>
-      </w:r>
-      <w:r>
-        <w:t xml:space="preserve">except med (−0.003); on legal it doubles the score at the same patch cost (0.224 vs 0.114 at 100% drift, 29.9M tokens</w:t>
-      </w:r>
-      <w:r>
-        <w:t xml:space="preserve"> </w:t>
-      </w:r>
-      <w:r>
-        <w:t xml:space="preserve">each). Its 100% − 0% difference is significant on cspaper and player only (+0.062, +0.020), the narrow-prompt effect</w:t>
-      </w:r>
-      <w:r>
-        <w:t xml:space="preserve"> </w:t>
-      </w:r>
-      <w:r>
-        <w:t xml:space="preserve">of the</w:t>
+        <w:t xml:space="preserve">The 32B model raises the 0%-drift score on every corpus (cspaper +0.028, player +0.022, art +0.023). Its 100% − 0%</w:t>
+      </w:r>
+      <w:r>
+        <w:t xml:space="preserve"> </w:t>
+      </w:r>
+      <w:r>
+        <w:t xml:space="preserve">difference is significant on cspaper and player (+0.062, +0.020) and not on art, the narrow-prompt effect of the</w:t>
       </w:r>
       <w:r>
         <w:t xml:space="preserve"> </w:t>
@@ -5065,7 +4586,7 @@
         <w:t xml:space="preserve"> </w:t>
       </w:r>
       <w:r>
-        <w:t xml:space="preserve">Qwen 32B on all five corpora; Llama 8B on three (med, legal running); quantization on one corpus.</w:t>
+        <w:t xml:space="preserve">Three corpora (med and legal not yet run); quantization on one corpus.</w:t>
       </w:r>
     </w:p>
     <w:p>
@@ -5075,8 +4596,8 @@
         </w:pict>
       </w:r>
     </w:p>
-    <w:bookmarkEnd w:id="60"/>
-    <w:bookmarkStart w:id="67" w:name="X7120b8bd2634908d82c5ef655f8b5faf4a3d922"/>
+    <w:bookmarkEnd w:id="57"/>
+    <w:bookmarkStart w:id="64" w:name="X7120b8bd2634908d82c5ef655f8b5faf4a3d922"/>
     <w:p>
       <w:pPr>
         <w:pStyle w:val="Heading2"/>
@@ -5100,19 +4621,19 @@
         <w:t xml:space="preserve"> </w:t>
       </w:r>
       <w:r>
-        <w:t xml:space="preserve">It depends on the corpus. Where documents have simple facts and tables join cleanly, the loss is in cell</w:t>
-      </w:r>
-      <w:r>
-        <w:t xml:space="preserve"> </w:t>
-      </w:r>
-      <w:r>
-        <w:t xml:space="preserve">values; where values are free text, lists or join keys, it is in structure (wrong or missing rows and groups). Two</w:t>
-      </w:r>
-      <w:r>
-        <w:t xml:space="preserve"> </w:t>
-      </w:r>
-      <w:r>
-        <w:t xml:space="preserve">causes cut across corpora and bound every system: the benchmark’s metadata instructs extractors to fill fields that</w:t>
+        <w:t xml:space="preserve">It depends on the corpus. Where documents have simple facts and tables join cleanly (player, cspaper), the</w:t>
+      </w:r>
+      <w:r>
+        <w:t xml:space="preserve"> </w:t>
+      </w:r>
+      <w:r>
+        <w:t xml:space="preserve">loss is in cell values; where values are free-text labels (art), it is in both values and structure (wrong or missing</w:t>
+      </w:r>
+      <w:r>
+        <w:t xml:space="preserve"> </w:t>
+      </w:r>
+      <w:r>
+        <w:t xml:space="preserve">rows and groups). Two causes cut across corpora and bound every system: the benchmark’s metadata instructs extractors to fill fields that</w:t>
       </w:r>
       <w:r>
         <w:t xml:space="preserve"> </w:t>
@@ -5287,32 +4808,24 @@
               <w:jc w:val="left"/>
             </w:pPr>
             <w:r>
-              <w:t xml:space="preserve">0.758</w:t>
-            </w:r>
-          </w:p>
-        </w:tc>
-        <w:tc>
-          <w:tcPr/>
-          <w:p>
-            <w:pPr>
-              <w:pStyle w:val="Compact"/>
-              <w:jc w:val="left"/>
-            </w:pPr>
-            <w:r>
-              <w:t xml:space="preserve">0.168</w:t>
-            </w:r>
-          </w:p>
-        </w:tc>
-        <w:tc>
-          <w:tcPr/>
-          <w:p>
-            <w:pPr>
-              <w:pStyle w:val="Compact"/>
-              <w:jc w:val="left"/>
-            </w:pPr>
-            <w:r>
-              <w:t xml:space="preserve">cell values</w:t>
-            </w:r>
+              <w:t xml:space="preserve">not yet run</w:t>
+            </w:r>
+          </w:p>
+        </w:tc>
+        <w:tc>
+          <w:tcPr/>
+          <w:p>
+            <w:pPr>
+              <w:pStyle w:val="Compact"/>
+            </w:pPr>
+          </w:p>
+        </w:tc>
+        <w:tc>
+          <w:tcPr/>
+          <w:p>
+            <w:pPr>
+              <w:pStyle w:val="Compact"/>
+            </w:pPr>
           </w:p>
         </w:tc>
       </w:tr>
@@ -5437,32 +4950,24 @@
               <w:jc w:val="left"/>
             </w:pPr>
             <w:r>
-              <w:t xml:space="preserve">0.335</w:t>
-            </w:r>
-          </w:p>
-        </w:tc>
-        <w:tc>
-          <w:tcPr/>
-          <w:p>
-            <w:pPr>
-              <w:pStyle w:val="Compact"/>
-              <w:jc w:val="left"/>
-            </w:pPr>
-            <w:r>
-              <w:t xml:space="preserve">0.157</w:t>
-            </w:r>
-          </w:p>
-        </w:tc>
-        <w:tc>
-          <w:tcPr/>
-          <w:p>
-            <w:pPr>
-              <w:pStyle w:val="Compact"/>
-              <w:jc w:val="left"/>
-            </w:pPr>
-            <w:r>
-              <w:t xml:space="preserve">structure: 61 of 76 queries return too few rows (list-valued join keys, free-text comparisons)</w:t>
-            </w:r>
+              <w:t xml:space="preserve">not yet run</w:t>
+            </w:r>
+          </w:p>
+        </w:tc>
+        <w:tc>
+          <w:tcPr/>
+          <w:p>
+            <w:pPr>
+              <w:pStyle w:val="Compact"/>
+            </w:pPr>
+          </w:p>
+        </w:tc>
+        <w:tc>
+          <w:tcPr/>
+          <w:p>
+            <w:pPr>
+              <w:pStyle w:val="Compact"/>
+            </w:pPr>
           </w:p>
         </w:tc>
       </w:tr>
@@ -5476,18 +4981,18 @@
           <wp:inline>
             <wp:extent cx="5334000" cy="2384611"/>
             <wp:effectExtent b="0" l="0" r="0" t="0"/>
-            <wp:docPr descr="Structure F2 vs cell F1 per corpus, with on-demand patching at 100% drift." title="" id="62" name="Picture"/>
+            <wp:docPr descr="Structure F2 vs cell F1 per corpus, with on-demand patching at 100% drift." title="" id="59" name="Picture"/>
             <a:graphic>
               <a:graphicData uri="http://schemas.openxmlformats.org/drawingml/2006/picture">
                 <pic:pic>
                   <pic:nvPicPr>
-                    <pic:cNvPr descr="figures/rq8_bottleneck.png" id="63" name="Picture"/>
+                    <pic:cNvPr descr="figures/rq8_bottleneck.png" id="60" name="Picture"/>
                     <pic:cNvPicPr>
                       <a:picLocks noChangeArrowheads="1" noChangeAspect="1"/>
                     </pic:cNvPicPr>
                   </pic:nvPicPr>
                   <pic:blipFill>
-                    <a:blip r:embed="rId61"/>
+                    <a:blip r:embed="rId58"/>
                     <a:stretch>
                       <a:fillRect/>
                     </a:stretch>
@@ -5521,7 +5026,7 @@
           <w:iCs/>
           <w:i/>
         </w:rPr>
-        <w:t xml:space="preserve">Figure 12. Structure F2 vs cell F1 per corpus, with on-demand patching at 100% drift.</w:t>
+        <w:t xml:space="preserve">Figure 11. Structure F2 vs cell F1 per corpus, with on-demand patching at 100% drift.</w:t>
       </w:r>
     </w:p>
     <w:p>
@@ -5539,7 +5044,7 @@
         <w:t xml:space="preserve"> </w:t>
       </w:r>
       <w:r>
-        <w:t xml:space="preserve">Of the 132 columns the benchmark’s attribute files mark</w:t>
+        <w:t xml:space="preserve">Of the 59 columns the benchmark’s attribute files mark</w:t>
       </w:r>
       <w:r>
         <w:t xml:space="preserve"> </w:t>
@@ -5554,13 +5059,31 @@
         <w:t xml:space="preserve">”</w:t>
       </w:r>
       <w:r>
-        <w:t xml:space="preserve">, 69 are empty in at</w:t>
-      </w:r>
-      <w:r>
-        <w:t xml:space="preserve"> </w:t>
-      </w:r>
-      <w:r>
-        <w:t xml:space="preserve">least 5% of gold rows (57 of them used by the workloads; e.g. a medical column empty in 85% of gold rows). Extractors</w:t>
+        <w:t xml:space="preserve"> </w:t>
+      </w:r>
+      <w:r>
+        <w:t xml:space="preserve">in cspaper, player</w:t>
+      </w:r>
+      <w:r>
+        <w:t xml:space="preserve"> </w:t>
+      </w:r>
+      <w:r>
+        <w:t xml:space="preserve">and art, 19 are empty in at least 5% of gold rows (e.g. cspaper</w:t>
+      </w:r>
+      <w:r>
+        <w:t xml:space="preserve"> </w:t>
+      </w:r>
+      <w:r>
+        <w:rPr>
+          <w:rStyle w:val="VerbatimChar"/>
+        </w:rPr>
+        <w:t xml:space="preserve">performance_on_hotpotqa</w:t>
+      </w:r>
+      <w:r>
+        <w:t xml:space="preserve"> </w:t>
+      </w:r>
+      <w:r>
+        <w:t xml:space="preserve">empty in 84%). Extractors</w:t>
       </w:r>
       <w:r>
         <w:t xml:space="preserve"> </w:t>
@@ -5590,7 +5113,7 @@
         <w:t xml:space="preserve"> </w:t>
       </w:r>
       <w:r>
-        <w:t xml:space="preserve">invented values for missed ones (score changes from −0.053 to +0.020 on four corpora; −0.043 on med).</w:t>
+        <w:t xml:space="preserve">invented values for missed ones (score changes from −0.053 to +0.020).</w:t>
       </w:r>
     </w:p>
     <w:p>
@@ -5638,18 +5161,18 @@
           <wp:inline>
             <wp:extent cx="5334000" cy="2761129"/>
             <wp:effectExtent b="0" l="0" r="0" t="0"/>
-            <wp:docPr descr="Exact vs lenient agreement for the ten columns with the largest gap." title="" id="65" name="Picture"/>
+            <wp:docPr descr="Exact vs lenient agreement for the ten columns with the largest gap." title="" id="62" name="Picture"/>
             <a:graphic>
               <a:graphicData uri="http://schemas.openxmlformats.org/drawingml/2006/picture">
                 <pic:pic>
                   <pic:nvPicPr>
-                    <pic:cNvPr descr="figures/rq8_form.png" id="66" name="Picture"/>
+                    <pic:cNvPr descr="figures/rq8_form.png" id="63" name="Picture"/>
                     <pic:cNvPicPr>
                       <a:picLocks noChangeArrowheads="1" noChangeAspect="1"/>
                     </pic:cNvPicPr>
                   </pic:nvPicPr>
                   <pic:blipFill>
-                    <a:blip r:embed="rId64"/>
+                    <a:blip r:embed="rId61"/>
                     <a:stretch>
                       <a:fillRect/>
                     </a:stretch>
@@ -5683,7 +5206,7 @@
           <w:iCs/>
           <w:i/>
         </w:rPr>
-        <w:t xml:space="preserve">Figure 13. Exact vs lenient agreement for the ten columns with the largest gap.</w:t>
+        <w:t xml:space="preserve">Figure 12. Exact vs lenient agreement for the ten columns with the largest gap.</w:t>
       </w:r>
     </w:p>
     <w:p>
@@ -5695,13 +5218,13 @@
           <w:iCs/>
           <w:i/>
         </w:rPr>
-        <w:t xml:space="preserve">By query type:</w:t>
-      </w:r>
-      <w:r>
-        <w:t xml:space="preserve"> </w:t>
-      </w:r>
-      <w:r>
-        <w:t xml:space="preserve">AVG/SUM 0.36, MIN/MAX over numbers 0.24, COUNT 0.21, MIN/MAX over text 0.03.</w:t>
+        <w:t xml:space="preserve">By query type</w:t>
+      </w:r>
+      <w:r>
+        <w:t xml:space="preserve"> </w:t>
+      </w:r>
+      <w:r>
+        <w:t xml:space="preserve">(patched, 100% drift): AVG 0.42, SUM 0.35, MIN over numbers 0.33, COUNT 0.28, MAX over numbers 0.18.</w:t>
       </w:r>
     </w:p>
     <w:p>
@@ -5725,13 +5248,7 @@
         <w:t xml:space="preserve"> </w:t>
       </w:r>
       <w:r>
-        <w:t xml:space="preserve">score set-valued columns as sets; systems gain most from accurate field definitions and from treating text extrema</w:t>
-      </w:r>
-      <w:r>
-        <w:t xml:space="preserve"> </w:t>
-      </w:r>
-      <w:r>
-        <w:t xml:space="preserve">and list-valued join keys as special cases.</w:t>
+        <w:t xml:space="preserve">score set-valued columns as sets; systems gain most from accurate field definitions.</w:t>
       </w:r>
     </w:p>
     <w:p>
@@ -5749,7 +5266,7 @@
         <w:t xml:space="preserve"> </w:t>
       </w:r>
       <w:r>
-        <w:t xml:space="preserve">Five corpora; one model for the per-column analysis.</w:t>
+        <w:t xml:space="preserve">Three corpora (med and legal not yet run); one model for the per-column analysis.</w:t>
       </w:r>
     </w:p>
     <w:p>
@@ -5759,8 +5276,8 @@
         </w:pict>
       </w:r>
     </w:p>
-    <w:bookmarkEnd w:id="67"/>
-    <w:bookmarkStart w:id="71" w:name="X4fbca8666ffa01dde183b623440658a29ce2a84"/>
+    <w:bookmarkEnd w:id="64"/>
+    <w:bookmarkStart w:id="68" w:name="X4fbca8666ffa01dde183b623440658a29ce2a84"/>
     <w:p>
       <w:pPr>
         <w:pStyle w:val="Heading2"/>
@@ -5796,7 +5313,7 @@
         <w:t xml:space="preserve"> </w:t>
       </w:r>
       <w:r>
-        <w:t xml:space="preserve">served view (−0.066 on art). Two carry cost: reusing patched columns (without it, 3.7–16.9× the tokens for the same</w:t>
+        <w:t xml:space="preserve">served view (−0.066 on art). Two carry cost: reusing patched columns (without it, 4.9–16.9× the tokens for the same</w:t>
       </w:r>
       <w:r>
         <w:t xml:space="preserve"> </w:t>
@@ -5814,7 +5331,7 @@
         <w:t xml:space="preserve"> </w:t>
       </w:r>
       <w:r>
-        <w:t xml:space="preserve">score by at most 0.015 in either direction.</w:t>
+        <w:t xml:space="preserve">score by at most 0.011 in either direction.</w:t>
       </w:r>
     </w:p>
     <w:p>
@@ -6002,19 +5519,19 @@
               <w:jc w:val="left"/>
             </w:pPr>
             <w:r>
-              <w:t xml:space="preserve">+0.005</w:t>
-            </w:r>
-          </w:p>
-        </w:tc>
-        <w:tc>
-          <w:tcPr/>
-          <w:p>
-            <w:pPr>
-              <w:pStyle w:val="Compact"/>
-              <w:jc w:val="left"/>
-            </w:pPr>
-            <w:r>
-              <w:t xml:space="preserve">−0.034</w:t>
+              <w:t xml:space="preserve">not yet run</w:t>
+            </w:r>
+          </w:p>
+        </w:tc>
+        <w:tc>
+          <w:tcPr/>
+          <w:p>
+            <w:pPr>
+              <w:pStyle w:val="Compact"/>
+              <w:jc w:val="left"/>
+            </w:pPr>
+            <w:r>
+              <w:t xml:space="preserve">not yet run</w:t>
             </w:r>
           </w:p>
         </w:tc>
@@ -6085,23 +5602,15 @@
           <w:p>
             <w:pPr>
               <w:pStyle w:val="Compact"/>
-              <w:jc w:val="left"/>
-            </w:pPr>
-            <w:r>
-              <w:t xml:space="preserve">+0.004</w:t>
-            </w:r>
-          </w:p>
-        </w:tc>
-        <w:tc>
-          <w:tcPr/>
-          <w:p>
-            <w:pPr>
-              <w:pStyle w:val="Compact"/>
-              <w:jc w:val="left"/>
-            </w:pPr>
-            <w:r>
-              <w:t xml:space="preserve">0.000</w:t>
-            </w:r>
+            </w:pPr>
+          </w:p>
+        </w:tc>
+        <w:tc>
+          <w:tcPr/>
+          <w:p>
+            <w:pPr>
+              <w:pStyle w:val="Compact"/>
+            </w:pPr>
           </w:p>
         </w:tc>
         <w:tc>
@@ -6171,23 +5680,15 @@
           <w:p>
             <w:pPr>
               <w:pStyle w:val="Compact"/>
-              <w:jc w:val="left"/>
-            </w:pPr>
-            <w:r>
-              <w:t xml:space="preserve">+0.010</w:t>
-            </w:r>
-          </w:p>
-        </w:tc>
-        <w:tc>
-          <w:tcPr/>
-          <w:p>
-            <w:pPr>
-              <w:pStyle w:val="Compact"/>
-              <w:jc w:val="left"/>
-            </w:pPr>
-            <w:r>
-              <w:t xml:space="preserve">−0.016</w:t>
-            </w:r>
+            </w:pPr>
+          </w:p>
+        </w:tc>
+        <w:tc>
+          <w:tcPr/>
+          <w:p>
+            <w:pPr>
+              <w:pStyle w:val="Compact"/>
+            </w:pPr>
           </w:p>
         </w:tc>
         <w:tc>
@@ -6257,34 +5758,26 @@
           <w:p>
             <w:pPr>
               <w:pStyle w:val="Compact"/>
-              <w:jc w:val="left"/>
-            </w:pPr>
-            <w:r>
-              <w:t xml:space="preserve">+0.002</w:t>
-            </w:r>
-          </w:p>
-        </w:tc>
-        <w:tc>
-          <w:tcPr/>
-          <w:p>
-            <w:pPr>
-              <w:pStyle w:val="Compact"/>
-              <w:jc w:val="left"/>
-            </w:pPr>
-            <w:r>
-              <w:t xml:space="preserve">−0.012</w:t>
-            </w:r>
-          </w:p>
-        </w:tc>
-        <w:tc>
-          <w:tcPr/>
-          <w:p>
-            <w:pPr>
-              <w:pStyle w:val="Compact"/>
-              <w:jc w:val="left"/>
-            </w:pPr>
-            <w:r>
-              <w:t xml:space="preserve">3.7–16.9×</w:t>
+            </w:pPr>
+          </w:p>
+        </w:tc>
+        <w:tc>
+          <w:tcPr/>
+          <w:p>
+            <w:pPr>
+              <w:pStyle w:val="Compact"/>
+            </w:pPr>
+          </w:p>
+        </w:tc>
+        <w:tc>
+          <w:tcPr/>
+          <w:p>
+            <w:pPr>
+              <w:pStyle w:val="Compact"/>
+              <w:jc w:val="left"/>
+            </w:pPr>
+            <w:r>
+              <w:t xml:space="preserve">4.9–16.9×</w:t>
             </w:r>
           </w:p>
         </w:tc>
@@ -6343,23 +5836,15 @@
           <w:p>
             <w:pPr>
               <w:pStyle w:val="Compact"/>
-              <w:jc w:val="left"/>
-            </w:pPr>
-            <w:r>
-              <w:t xml:space="preserve">0.000</w:t>
-            </w:r>
-          </w:p>
-        </w:tc>
-        <w:tc>
-          <w:tcPr/>
-          <w:p>
-            <w:pPr>
-              <w:pStyle w:val="Compact"/>
-              <w:jc w:val="left"/>
-            </w:pPr>
-            <w:r>
-              <w:t xml:space="preserve">+0.001</w:t>
-            </w:r>
+            </w:pPr>
+          </w:p>
+        </w:tc>
+        <w:tc>
+          <w:tcPr/>
+          <w:p>
+            <w:pPr>
+              <w:pStyle w:val="Compact"/>
+            </w:pPr>
           </w:p>
         </w:tc>
         <w:tc>
@@ -6429,23 +5914,15 @@
           <w:p>
             <w:pPr>
               <w:pStyle w:val="Compact"/>
-              <w:jc w:val="left"/>
-            </w:pPr>
-            <w:r>
-              <w:t xml:space="preserve">+0.015*</w:t>
-            </w:r>
-          </w:p>
-        </w:tc>
-        <w:tc>
-          <w:tcPr/>
-          <w:p>
-            <w:pPr>
-              <w:pStyle w:val="Compact"/>
-              <w:jc w:val="left"/>
-            </w:pPr>
-            <w:r>
-              <w:t xml:space="preserve">−0.012*</w:t>
-            </w:r>
+            </w:pPr>
+          </w:p>
+        </w:tc>
+        <w:tc>
+          <w:tcPr/>
+          <w:p>
+            <w:pPr>
+              <w:pStyle w:val="Compact"/>
+            </w:pPr>
           </w:p>
         </w:tc>
         <w:tc>
@@ -6515,23 +5992,15 @@
           <w:p>
             <w:pPr>
               <w:pStyle w:val="Compact"/>
-              <w:jc w:val="left"/>
-            </w:pPr>
-            <w:r>
-              <w:t xml:space="preserve">0.000</w:t>
-            </w:r>
-          </w:p>
-        </w:tc>
-        <w:tc>
-          <w:tcPr/>
-          <w:p>
-            <w:pPr>
-              <w:pStyle w:val="Compact"/>
-              <w:jc w:val="left"/>
-            </w:pPr>
-            <w:r>
-              <w:t xml:space="preserve">−0.007</w:t>
-            </w:r>
+            </w:pPr>
+          </w:p>
+        </w:tc>
+        <w:tc>
+          <w:tcPr/>
+          <w:p>
+            <w:pPr>
+              <w:pStyle w:val="Compact"/>
+            </w:pPr>
           </w:p>
         </w:tc>
         <w:tc>
@@ -6601,23 +6070,15 @@
           <w:p>
             <w:pPr>
               <w:pStyle w:val="Compact"/>
-              <w:jc w:val="left"/>
-            </w:pPr>
-            <w:r>
-              <w:t xml:space="preserve">+0.003</w:t>
-            </w:r>
-          </w:p>
-        </w:tc>
-        <w:tc>
-          <w:tcPr/>
-          <w:p>
-            <w:pPr>
-              <w:pStyle w:val="Compact"/>
-              <w:jc w:val="left"/>
-            </w:pPr>
-            <w:r>
-              <w:t xml:space="preserve">+0.010</w:t>
-            </w:r>
+            </w:pPr>
+          </w:p>
+        </w:tc>
+        <w:tc>
+          <w:tcPr/>
+          <w:p>
+            <w:pPr>
+              <w:pStyle w:val="Compact"/>
+            </w:pPr>
           </w:p>
         </w:tc>
         <w:tc>
@@ -6643,18 +6104,18 @@
           <wp:inline>
             <wp:extent cx="5334000" cy="2297723"/>
             <wp:effectExtent b="0" l="0" r="0" t="0"/>
-            <wp:docPr descr="Each component turned off in turn: score change and patch tokens." title="" id="69" name="Picture"/>
+            <wp:docPr descr="Each component turned off in turn: score change and patch tokens." title="" id="66" name="Picture"/>
             <a:graphic>
               <a:graphicData uri="http://schemas.openxmlformats.org/drawingml/2006/picture">
                 <pic:pic>
                   <pic:nvPicPr>
-                    <pic:cNvPr descr="figures/ablations.png" id="70" name="Picture"/>
+                    <pic:cNvPr descr="figures/ablations.png" id="67" name="Picture"/>
                     <pic:cNvPicPr>
                       <a:picLocks noChangeArrowheads="1" noChangeAspect="1"/>
                     </pic:cNvPicPr>
                   </pic:nvPicPr>
                   <pic:blipFill>
-                    <a:blip r:embed="rId68"/>
+                    <a:blip r:embed="rId65"/>
                     <a:stretch>
                       <a:fillRect/>
                     </a:stretch>
@@ -6688,7 +6149,7 @@
           <w:iCs/>
           <w:i/>
         </w:rPr>
-        <w:t xml:space="preserve">Figure 14. Each component turned off in turn: score change (95% CI) and patch tokens, at 100% drift.</w:t>
+        <w:t xml:space="preserve">Figure 13. Each component turned off in turn: score change (95% CI) and patch tokens, at 100% drift.</w:t>
       </w:r>
     </w:p>
     <w:p>
@@ -6736,7 +6197,7 @@
         <w:t xml:space="preserve"> </w:t>
       </w:r>
       <w:r>
-        <w:t xml:space="preserve">specs alone move it little. Reading all new columns together costs 0.13–0.35× the patch tokens.</w:t>
+        <w:t xml:space="preserve">specs alone move it little. Reading all new columns together costs 0.27–0.35× the patch tokens.</w:t>
       </w:r>
     </w:p>
     <w:p>
@@ -6778,7 +6239,7 @@
         <w:t xml:space="preserve"> </w:t>
       </w:r>
       <w:r>
-        <w:t xml:space="preserve">Five corpora, one model (Qwen 2.5 7B), 100% drift.</w:t>
+        <w:t xml:space="preserve">Three corpora (med and legal not yet run), one model (Qwen 2.5 7B), 100% drift.</w:t>
       </w:r>
     </w:p>
     <w:p>
@@ -6788,8 +6249,8 @@
         </w:pict>
       </w:r>
     </w:p>
-    <w:bookmarkEnd w:id="71"/>
-    <w:bookmarkStart w:id="75" w:name="comparison-with-docetl"/>
+    <w:bookmarkEnd w:id="68"/>
+    <w:bookmarkStart w:id="72" w:name="comparison-with-docetl"/>
     <w:p>
       <w:pPr>
         <w:pStyle w:val="Heading2"/>
@@ -7254,80 +6715,56 @@
               <w:jc w:val="left"/>
             </w:pPr>
             <w:r>
-              <w:t xml:space="preserve">76</w:t>
-            </w:r>
-          </w:p>
-        </w:tc>
-        <w:tc>
-          <w:tcPr/>
-          <w:p>
-            <w:pPr>
-              <w:pStyle w:val="Compact"/>
-              <w:jc w:val="left"/>
-            </w:pPr>
-            <w:r>
-              <w:t xml:space="preserve">0.056</w:t>
-            </w:r>
-          </w:p>
-        </w:tc>
-        <w:tc>
-          <w:tcPr/>
-          <w:p>
-            <w:pPr>
-              <w:pStyle w:val="Compact"/>
-              <w:jc w:val="left"/>
-            </w:pPr>
-            <w:r>
-              <w:t xml:space="preserve">0.086</w:t>
-            </w:r>
-          </w:p>
-        </w:tc>
-        <w:tc>
-          <w:tcPr/>
-          <w:p>
-            <w:pPr>
-              <w:pStyle w:val="Compact"/>
-              <w:jc w:val="left"/>
-            </w:pPr>
-            <w:r>
-              <w:t xml:space="preserve">+0.030 (0.010 – 0.054)</w:t>
-            </w:r>
-          </w:p>
-        </w:tc>
-        <w:tc>
-          <w:tcPr/>
-          <w:p>
-            <w:pPr>
-              <w:pStyle w:val="Compact"/>
-              <w:jc w:val="left"/>
-            </w:pPr>
-            <w:r>
-              <w:t xml:space="preserve">170.6M</w:t>
-            </w:r>
-          </w:p>
-        </w:tc>
-        <w:tc>
-          <w:tcPr/>
-          <w:p>
-            <w:pPr>
-              <w:pStyle w:val="Compact"/>
-              <w:jc w:val="left"/>
-            </w:pPr>
-            <w:r>
-              <w:t xml:space="preserve">22.46M</w:t>
-            </w:r>
-          </w:p>
-        </w:tc>
-        <w:tc>
-          <w:tcPr/>
-          <w:p>
-            <w:pPr>
-              <w:pStyle w:val="Compact"/>
-              <w:jc w:val="left"/>
-            </w:pPr>
-            <w:r>
-              <w:t xml:space="preserve">8×</w:t>
-            </w:r>
+              <w:t xml:space="preserve">not yet run</w:t>
+            </w:r>
+          </w:p>
+        </w:tc>
+        <w:tc>
+          <w:tcPr/>
+          <w:p>
+            <w:pPr>
+              <w:pStyle w:val="Compact"/>
+            </w:pPr>
+          </w:p>
+        </w:tc>
+        <w:tc>
+          <w:tcPr/>
+          <w:p>
+            <w:pPr>
+              <w:pStyle w:val="Compact"/>
+            </w:pPr>
+          </w:p>
+        </w:tc>
+        <w:tc>
+          <w:tcPr/>
+          <w:p>
+            <w:pPr>
+              <w:pStyle w:val="Compact"/>
+            </w:pPr>
+          </w:p>
+        </w:tc>
+        <w:tc>
+          <w:tcPr/>
+          <w:p>
+            <w:pPr>
+              <w:pStyle w:val="Compact"/>
+            </w:pPr>
+          </w:p>
+        </w:tc>
+        <w:tc>
+          <w:tcPr/>
+          <w:p>
+            <w:pPr>
+              <w:pStyle w:val="Compact"/>
+            </w:pPr>
+          </w:p>
+        </w:tc>
+        <w:tc>
+          <w:tcPr/>
+          <w:p>
+            <w:pPr>
+              <w:pStyle w:val="Compact"/>
+            </w:pPr>
           </w:p>
         </w:tc>
       </w:tr>
@@ -7352,80 +6789,56 @@
               <w:jc w:val="left"/>
             </w:pPr>
             <w:r>
-              <w:t xml:space="preserve">30</w:t>
-            </w:r>
-          </w:p>
-        </w:tc>
-        <w:tc>
-          <w:tcPr/>
-          <w:p>
-            <w:pPr>
-              <w:pStyle w:val="Compact"/>
-              <w:jc w:val="left"/>
-            </w:pPr>
-            <w:r>
-              <w:t xml:space="preserve">0.040</w:t>
-            </w:r>
-          </w:p>
-        </w:tc>
-        <w:tc>
-          <w:tcPr/>
-          <w:p>
-            <w:pPr>
-              <w:pStyle w:val="Compact"/>
-              <w:jc w:val="left"/>
-            </w:pPr>
-            <w:r>
-              <w:t xml:space="preserve">0.114</w:t>
-            </w:r>
-          </w:p>
-        </w:tc>
-        <w:tc>
-          <w:tcPr/>
-          <w:p>
-            <w:pPr>
-              <w:pStyle w:val="Compact"/>
-              <w:jc w:val="left"/>
-            </w:pPr>
-            <w:r>
-              <w:t xml:space="preserve">+0.075 (0.029 – 0.124)</w:t>
-            </w:r>
-          </w:p>
-        </w:tc>
-        <w:tc>
-          <w:tcPr/>
-          <w:p>
-            <w:pPr>
-              <w:pStyle w:val="Compact"/>
-              <w:jc w:val="left"/>
-            </w:pPr>
-            <w:r>
-              <w:t xml:space="preserve">475.1M</w:t>
-            </w:r>
-          </w:p>
-        </w:tc>
-        <w:tc>
-          <w:tcPr/>
-          <w:p>
-            <w:pPr>
-              <w:pStyle w:val="Compact"/>
-              <w:jc w:val="left"/>
-            </w:pPr>
-            <w:r>
-              <w:t xml:space="preserve">34.49M</w:t>
-            </w:r>
-          </w:p>
-        </w:tc>
-        <w:tc>
-          <w:tcPr/>
-          <w:p>
-            <w:pPr>
-              <w:pStyle w:val="Compact"/>
-              <w:jc w:val="left"/>
-            </w:pPr>
-            <w:r>
-              <w:t xml:space="preserve">14×</w:t>
-            </w:r>
+              <w:t xml:space="preserve">not yet run</w:t>
+            </w:r>
+          </w:p>
+        </w:tc>
+        <w:tc>
+          <w:tcPr/>
+          <w:p>
+            <w:pPr>
+              <w:pStyle w:val="Compact"/>
+            </w:pPr>
+          </w:p>
+        </w:tc>
+        <w:tc>
+          <w:tcPr/>
+          <w:p>
+            <w:pPr>
+              <w:pStyle w:val="Compact"/>
+            </w:pPr>
+          </w:p>
+        </w:tc>
+        <w:tc>
+          <w:tcPr/>
+          <w:p>
+            <w:pPr>
+              <w:pStyle w:val="Compact"/>
+            </w:pPr>
+          </w:p>
+        </w:tc>
+        <w:tc>
+          <w:tcPr/>
+          <w:p>
+            <w:pPr>
+              <w:pStyle w:val="Compact"/>
+            </w:pPr>
+          </w:p>
+        </w:tc>
+        <w:tc>
+          <w:tcPr/>
+          <w:p>
+            <w:pPr>
+              <w:pStyle w:val="Compact"/>
+            </w:pPr>
+          </w:p>
+        </w:tc>
+        <w:tc>
+          <w:tcPr/>
+          <w:p>
+            <w:pPr>
+              <w:pStyle w:val="Compact"/>
+            </w:pPr>
           </w:p>
         </w:tc>
       </w:tr>
@@ -7439,18 +6852,18 @@
           <wp:inline>
             <wp:extent cx="5334000" cy="1723292"/>
             <wp:effectExtent b="0" l="0" r="0" t="0"/>
-            <wp:docPr descr="Ours vs DocETL per corpus (left) and on player by number of joins (right)." title="" id="73" name="Picture"/>
+            <wp:docPr descr="Ours vs DocETL per corpus (left) and on player by number of joins (right)." title="" id="70" name="Picture"/>
             <a:graphic>
               <a:graphicData uri="http://schemas.openxmlformats.org/drawingml/2006/picture">
                 <pic:pic>
                   <pic:nvPicPr>
-                    <pic:cNvPr descr="figures/docetl.png" id="74" name="Picture"/>
+                    <pic:cNvPr descr="figures/docetl.png" id="71" name="Picture"/>
                     <pic:cNvPicPr>
                       <a:picLocks noChangeArrowheads="1" noChangeAspect="1"/>
                     </pic:cNvPicPr>
                   </pic:nvPicPr>
                   <pic:blipFill>
-                    <a:blip r:embed="rId72"/>
+                    <a:blip r:embed="rId69"/>
                     <a:stretch>
                       <a:fillRect/>
                     </a:stretch>
@@ -7484,7 +6897,7 @@
           <w:iCs/>
           <w:i/>
         </w:rPr>
-        <w:t xml:space="preserve">Figure 15. Ours vs DocETL per corpus (left) and on player by number of joins (right).</w:t>
+        <w:t xml:space="preserve">Figure 14. Ours vs DocETL per corpus (left) and on player by number of joins (right).</w:t>
       </w:r>
     </w:p>
     <w:p>
@@ -7528,11 +6941,11 @@
         <w:t xml:space="preserve"> </w:t>
       </w:r>
       <w:r>
-        <w:t xml:space="preserve">All 326 drift test queries on the five corpora; one model.</w:t>
-      </w:r>
-    </w:p>
-    <w:bookmarkEnd w:id="75"/>
-    <w:bookmarkEnd w:id="76"/>
+        <w:t xml:space="preserve">All 220 drift test queries on cspaper, player and art (med and legal not yet run); one model.</w:t>
+      </w:r>
+    </w:p>
+    <w:bookmarkEnd w:id="72"/>
+    <w:bookmarkEnd w:id="73"/>
     <w:sectPr/>
   </w:body>
 </w:document>

</xml_diff>

<commit_message>
Cost analysis in tokens with OpenRouter list prices (qwen-2.5-7b, llama-3.1-8b; 32B range): build vs patches, per-query, reuse/scope/train-share variants, DocETL, models
Co-Authored-By: Claude Opus 5.5 <noreply@anthropic.com>
</commit_message>
<xml_diff>
--- a/results/experiments/RESULTS_PAPER.docx
+++ b/results/experiments/RESULTS_PAPER.docx
@@ -2,7 +2,7 @@
 <file path=word/document.xml><?xml version="1.0" encoding="utf-8"?>
 <w:document xmlns:w="http://schemas.openxmlformats.org/wordprocessingml/2006/main" xmlns:m="http://schemas.openxmlformats.org/officeDocument/2006/math" xmlns:r="http://schemas.openxmlformats.org/officeDocument/2006/relationships" xmlns:o="urn:schemas-microsoft-com:office:office" xmlns:v="urn:schemas-microsoft-com:vml" xmlns:w10="urn:schemas-microsoft-com:office:word" xmlns:a="http://schemas.openxmlformats.org/drawingml/2006/main" xmlns:pic="http://schemas.openxmlformats.org/drawingml/2006/picture" xmlns:wp="http://schemas.openxmlformats.org/drawingml/2006/wordprocessingDrawing">
   <w:body>
-    <w:bookmarkStart w:id="73" w:name="answers-to-the-research-questions"/>
+    <w:bookmarkStart w:id="74" w:name="answers-to-the-research-questions"/>
     <w:p>
       <w:pPr>
         <w:pStyle w:val="Heading1"/>
@@ -6250,7 +6250,1264 @@
       </w:r>
     </w:p>
     <w:bookmarkEnd w:id="68"/>
-    <w:bookmarkStart w:id="72" w:name="comparison-with-docetl"/>
+    <w:bookmarkStart w:id="69" w:name="cost"/>
+    <w:p>
+      <w:pPr>
+        <w:pStyle w:val="Heading2"/>
+      </w:pPr>
+      <w:r>
+        <w:t xml:space="preserve">Cost</w:t>
+      </w:r>
+    </w:p>
+    <w:p>
+      <w:pPr>
+        <w:pStyle w:val="FirstParagraph"/>
+      </w:pPr>
+      <w:r>
+        <w:rPr>
+          <w:bCs/>
+          <w:b/>
+        </w:rPr>
+        <w:t xml:space="preserve">Answer.</w:t>
+      </w:r>
+      <w:r>
+        <w:t xml:space="preserve"> </w:t>
+      </w:r>
+      <w:r>
+        <w:t xml:space="preserve">Under drift, on-demand patching is most of the cost: at 100% drift patches are 71–75% of all extraction</w:t>
+      </w:r>
+      <w:r>
+        <w:t xml:space="preserve"> </w:t>
+      </w:r>
+      <w:r>
+        <w:t xml:space="preserve">tokens, and a query that needs a patch costs 0.2–1.1M tokens, while a query answered from the database costs nothing</w:t>
+      </w:r>
+      <w:r>
+        <w:t xml:space="preserve"> </w:t>
+      </w:r>
+      <w:r>
+        <w:t xml:space="preserve">more. At list prices for the 7B model a whole corpus costs $0.16–0.88 with patching (build plus every patch) and</w:t>
+      </w:r>
+      <w:r>
+        <w:t xml:space="preserve"> </w:t>
+      </w:r>
+      <w:r>
+        <w:t xml:space="preserve">$0.06–0.34 if the build had anticipated every column. Reuse of patched columns is the largest saving (5–17×), and the</w:t>
+      </w:r>
+      <w:r>
+        <w:t xml:space="preserve"> </w:t>
+      </w:r>
+      <w:r>
+        <w:t xml:space="preserve">system is 13–25× cheaper than DocETL on the same queries.</w:t>
+      </w:r>
+    </w:p>
+    <w:p>
+      <w:pPr>
+        <w:pStyle w:val="BodyText"/>
+      </w:pPr>
+      <w:r>
+        <w:rPr>
+          <w:bCs/>
+          <w:b/>
+        </w:rPr>
+        <w:t xml:space="preserve">Evidence.</w:t>
+      </w:r>
+      <w:r>
+        <w:t xml:space="preserve"> </w:t>
+      </w:r>
+      <w:r>
+        <w:t xml:space="preserve">Tokens as charged by the server; dollars at OpenRouter list rates for</w:t>
+      </w:r>
+      <w:r>
+        <w:t xml:space="preserve"> </w:t>
+      </w:r>
+      <w:r>
+        <w:rPr>
+          <w:rStyle w:val="VerbatimChar"/>
+        </w:rPr>
+        <w:t xml:space="preserve">qwen/qwen-2.5-7b-instruct</w:t>
+      </w:r>
+      <w:r>
+        <w:t xml:space="preserve"> </w:t>
+      </w:r>
+      <w:r>
+        <w:t xml:space="preserve">($0.10 per million input tokens, $0.20 per million output tokens; fetched 2026-10-07). Build plus all patches for each</w:t>
+      </w:r>
+      <w:r>
+        <w:t xml:space="preserve"> </w:t>
+      </w:r>
+      <w:r>
+        <w:t xml:space="preserve">corpus’s test queries:</w:t>
+      </w:r>
+    </w:p>
+    <w:tbl>
+      <w:tblPr>
+        <w:tblStyle w:val="Table"/>
+        <w:tblW w:type="pct" w:w="5000"/>
+        <w:tblLook w:firstRow="1" w:lastRow="0" w:firstColumn="0" w:lastColumn="0" w:noHBand="0" w:noVBand="0" w:val="0020"/>
+      </w:tblPr>
+      <w:tblGrid>
+        <w:gridCol w:w="1131"/>
+        <w:gridCol w:w="1131"/>
+        <w:gridCol w:w="1131"/>
+        <w:gridCol w:w="1131"/>
+        <w:gridCol w:w="1131"/>
+        <w:gridCol w:w="1131"/>
+        <w:gridCol w:w="1131"/>
+      </w:tblGrid>
+      <w:tr>
+        <w:trPr>
+          <w:tblHeader w:val="true"/>
+        </w:trPr>
+        <w:tc>
+          <w:tcPr/>
+          <w:p>
+            <w:pPr>
+              <w:pStyle w:val="Compact"/>
+              <w:jc w:val="left"/>
+            </w:pPr>
+            <w:r>
+              <w:t xml:space="preserve">Corpus</w:t>
+            </w:r>
+          </w:p>
+        </w:tc>
+        <w:tc>
+          <w:tcPr/>
+          <w:p>
+            <w:pPr>
+              <w:pStyle w:val="Compact"/>
+              <w:jc w:val="left"/>
+            </w:pPr>
+            <w:r>
+              <w:t xml:space="preserve">Test queries</w:t>
+            </w:r>
+          </w:p>
+        </w:tc>
+        <w:tc>
+          <w:tcPr/>
+          <w:p>
+            <w:pPr>
+              <w:pStyle w:val="Compact"/>
+              <w:jc w:val="left"/>
+            </w:pPr>
+            <w:r>
+              <w:t xml:space="preserve">All anticipated (0% drift)</w:t>
+            </w:r>
+          </w:p>
+        </w:tc>
+        <w:tc>
+          <w:tcPr/>
+          <w:p>
+            <w:pPr>
+              <w:pStyle w:val="Compact"/>
+              <w:jc w:val="left"/>
+            </w:pPr>
+            <w:r>
+              <w:t xml:space="preserve">None anticipated (100% drift)</w:t>
+            </w:r>
+          </w:p>
+        </w:tc>
+        <w:tc>
+          <w:tcPr/>
+          <w:p>
+            <w:pPr>
+              <w:pStyle w:val="Compact"/>
+              <w:jc w:val="left"/>
+            </w:pPr>
+            <w:r>
+              <w:t xml:space="preserve">Patches’ share</w:t>
+            </w:r>
+          </w:p>
+        </w:tc>
+        <w:tc>
+          <w:tcPr/>
+          <w:p>
+            <w:pPr>
+              <w:pStyle w:val="Compact"/>
+              <w:jc w:val="left"/>
+            </w:pPr>
+            <w:r>
+              <w:t xml:space="preserve">Per query that needs a patch (median)</w:t>
+            </w:r>
+          </w:p>
+        </w:tc>
+        <w:tc>
+          <w:tcPr/>
+          <w:p>
+            <w:pPr>
+              <w:pStyle w:val="Compact"/>
+              <w:jc w:val="left"/>
+            </w:pPr>
+            <w:r>
+              <w:t xml:space="preserve">Per test query, 0% / 100%</w:t>
+            </w:r>
+          </w:p>
+        </w:tc>
+      </w:tr>
+      <w:tr>
+        <w:tc>
+          <w:tcPr/>
+          <w:p>
+            <w:pPr>
+              <w:pStyle w:val="Compact"/>
+              <w:jc w:val="left"/>
+            </w:pPr>
+            <w:r>
+              <w:t xml:space="preserve">cspaper</w:t>
+            </w:r>
+          </w:p>
+        </w:tc>
+        <w:tc>
+          <w:tcPr/>
+          <w:p>
+            <w:pPr>
+              <w:pStyle w:val="Compact"/>
+              <w:jc w:val="left"/>
+            </w:pPr>
+            <w:r>
+              <w:t xml:space="preserve">59</w:t>
+            </w:r>
+          </w:p>
+        </w:tc>
+        <w:tc>
+          <w:tcPr/>
+          <w:p>
+            <w:pPr>
+              <w:pStyle w:val="Compact"/>
+              <w:jc w:val="left"/>
+            </w:pPr>
+            <w:r>
+              <w:t xml:space="preserve">0.55M, $0.058</w:t>
+            </w:r>
+          </w:p>
+        </w:tc>
+        <w:tc>
+          <w:tcPr/>
+          <w:p>
+            <w:pPr>
+              <w:pStyle w:val="Compact"/>
+              <w:jc w:val="left"/>
+            </w:pPr>
+            <w:r>
+              <w:t xml:space="preserve">1.56M, $0.160</w:t>
+            </w:r>
+          </w:p>
+        </w:tc>
+        <w:tc>
+          <w:tcPr/>
+          <w:p>
+            <w:pPr>
+              <w:pStyle w:val="Compact"/>
+              <w:jc w:val="left"/>
+            </w:pPr>
+            <w:r>
+              <w:t xml:space="preserve">75%</w:t>
+            </w:r>
+          </w:p>
+        </w:tc>
+        <w:tc>
+          <w:tcPr/>
+          <w:p>
+            <w:pPr>
+              <w:pStyle w:val="Compact"/>
+              <w:jc w:val="left"/>
+            </w:pPr>
+            <w:r>
+              <w:t xml:space="preserve">220k tokens, $0.017</w:t>
+            </w:r>
+          </w:p>
+        </w:tc>
+        <w:tc>
+          <w:tcPr/>
+          <w:p>
+            <w:pPr>
+              <w:pStyle w:val="Compact"/>
+              <w:jc w:val="left"/>
+            </w:pPr>
+            <w:r>
+              <w:t xml:space="preserve">$0.0010 / $0.0027</w:t>
+            </w:r>
+          </w:p>
+        </w:tc>
+      </w:tr>
+      <w:tr>
+        <w:tc>
+          <w:tcPr/>
+          <w:p>
+            <w:pPr>
+              <w:pStyle w:val="Compact"/>
+              <w:jc w:val="left"/>
+            </w:pPr>
+            <w:r>
+              <w:t xml:space="preserve">player</w:t>
+            </w:r>
+          </w:p>
+        </w:tc>
+        <w:tc>
+          <w:tcPr/>
+          <w:p>
+            <w:pPr>
+              <w:pStyle w:val="Compact"/>
+              <w:jc w:val="left"/>
+            </w:pPr>
+            <w:r>
+              <w:t xml:space="preserve">118</w:t>
+            </w:r>
+          </w:p>
+        </w:tc>
+        <w:tc>
+          <w:tcPr/>
+          <w:p>
+            <w:pPr>
+              <w:pStyle w:val="Compact"/>
+              <w:jc w:val="left"/>
+            </w:pPr>
+            <w:r>
+              <w:t xml:space="preserve">2.12M, $0.214</w:t>
+            </w:r>
+          </w:p>
+        </w:tc>
+        <w:tc>
+          <w:tcPr/>
+          <w:p>
+            <w:pPr>
+              <w:pStyle w:val="Compact"/>
+              <w:jc w:val="left"/>
+            </w:pPr>
+            <w:r>
+              <w:t xml:space="preserve">7.71M, $0.778</w:t>
+            </w:r>
+          </w:p>
+        </w:tc>
+        <w:tc>
+          <w:tcPr/>
+          <w:p>
+            <w:pPr>
+              <w:pStyle w:val="Compact"/>
+              <w:jc w:val="left"/>
+            </w:pPr>
+            <w:r>
+              <w:t xml:space="preserve">74%</w:t>
+            </w:r>
+          </w:p>
+        </w:tc>
+        <w:tc>
+          <w:tcPr/>
+          <w:p>
+            <w:pPr>
+              <w:pStyle w:val="Compact"/>
+              <w:jc w:val="left"/>
+            </w:pPr>
+            <w:r>
+              <w:t xml:space="preserve">930k tokens, $0.071</w:t>
+            </w:r>
+          </w:p>
+        </w:tc>
+        <w:tc>
+          <w:tcPr/>
+          <w:p>
+            <w:pPr>
+              <w:pStyle w:val="Compact"/>
+              <w:jc w:val="left"/>
+            </w:pPr>
+            <w:r>
+              <w:t xml:space="preserve">$0.0018 / $0.0066</w:t>
+            </w:r>
+          </w:p>
+        </w:tc>
+      </w:tr>
+      <w:tr>
+        <w:tc>
+          <w:tcPr/>
+          <w:p>
+            <w:pPr>
+              <w:pStyle w:val="Compact"/>
+              <w:jc w:val="left"/>
+            </w:pPr>
+            <w:r>
+              <w:t xml:space="preserve">art</w:t>
+            </w:r>
+          </w:p>
+        </w:tc>
+        <w:tc>
+          <w:tcPr/>
+          <w:p>
+            <w:pPr>
+              <w:pStyle w:val="Compact"/>
+              <w:jc w:val="left"/>
+            </w:pPr>
+            <w:r>
+              <w:t xml:space="preserve">43</w:t>
+            </w:r>
+          </w:p>
+        </w:tc>
+        <w:tc>
+          <w:tcPr/>
+          <w:p>
+            <w:pPr>
+              <w:pStyle w:val="Compact"/>
+              <w:jc w:val="left"/>
+            </w:pPr>
+            <w:r>
+              <w:t xml:space="preserve">3.18M, $0.339</w:t>
+            </w:r>
+          </w:p>
+        </w:tc>
+        <w:tc>
+          <w:tcPr/>
+          <w:p>
+            <w:pPr>
+              <w:pStyle w:val="Compact"/>
+              <w:jc w:val="left"/>
+            </w:pPr>
+            <w:r>
+              <w:t xml:space="preserve">8.52M, $0.881</w:t>
+            </w:r>
+          </w:p>
+        </w:tc>
+        <w:tc>
+          <w:tcPr/>
+          <w:p>
+            <w:pPr>
+              <w:pStyle w:val="Compact"/>
+              <w:jc w:val="left"/>
+            </w:pPr>
+            <w:r>
+              <w:t xml:space="preserve">71%</w:t>
+            </w:r>
+          </w:p>
+        </w:tc>
+        <w:tc>
+          <w:tcPr/>
+          <w:p>
+            <w:pPr>
+              <w:pStyle w:val="Compact"/>
+              <w:jc w:val="left"/>
+            </w:pPr>
+            <w:r>
+              <w:t xml:space="preserve">974k tokens, $0.069</w:t>
+            </w:r>
+          </w:p>
+        </w:tc>
+        <w:tc>
+          <w:tcPr/>
+          <w:p>
+            <w:pPr>
+              <w:pStyle w:val="Compact"/>
+              <w:jc w:val="left"/>
+            </w:pPr>
+            <w:r>
+              <w:t xml:space="preserve">$0.0079 / $0.0205</w:t>
+            </w:r>
+          </w:p>
+        </w:tc>
+      </w:tr>
+      <w:tr>
+        <w:tc>
+          <w:tcPr/>
+          <w:p>
+            <w:pPr>
+              <w:pStyle w:val="Compact"/>
+              <w:jc w:val="left"/>
+            </w:pPr>
+            <w:r>
+              <w:t xml:space="preserve">med, legal</w:t>
+            </w:r>
+          </w:p>
+        </w:tc>
+        <w:tc>
+          <w:tcPr/>
+          <w:p>
+            <w:pPr>
+              <w:pStyle w:val="Compact"/>
+              <w:jc w:val="left"/>
+            </w:pPr>
+            <w:r>
+              <w:t xml:space="preserve">not yet run</w:t>
+            </w:r>
+          </w:p>
+        </w:tc>
+        <w:tc>
+          <w:tcPr/>
+          <w:p>
+            <w:pPr>
+              <w:pStyle w:val="Compact"/>
+            </w:pPr>
+          </w:p>
+        </w:tc>
+        <w:tc>
+          <w:tcPr/>
+          <w:p>
+            <w:pPr>
+              <w:pStyle w:val="Compact"/>
+            </w:pPr>
+          </w:p>
+        </w:tc>
+        <w:tc>
+          <w:tcPr/>
+          <w:p>
+            <w:pPr>
+              <w:pStyle w:val="Compact"/>
+            </w:pPr>
+          </w:p>
+        </w:tc>
+        <w:tc>
+          <w:tcPr/>
+          <w:p>
+            <w:pPr>
+              <w:pStyle w:val="Compact"/>
+            </w:pPr>
+          </w:p>
+        </w:tc>
+        <w:tc>
+          <w:tcPr/>
+          <w:p>
+            <w:pPr>
+              <w:pStyle w:val="Compact"/>
+            </w:pPr>
+          </w:p>
+        </w:tc>
+      </w:tr>
+    </w:tbl>
+    <w:p>
+      <w:pPr>
+        <w:pStyle w:val="BodyText"/>
+      </w:pPr>
+      <w:r>
+        <w:t xml:space="preserve">Only 7–9 of each corpus’s test queries need a patch at 100% drift (the first to use each new column); every later</w:t>
+      </w:r>
+      <w:r>
+        <w:t xml:space="preserve"> </w:t>
+      </w:r>
+      <w:r>
+        <w:t xml:space="preserve">query reuses what they read. A query answered from the database adds no extraction cost.</w:t>
+      </w:r>
+    </w:p>
+    <w:p>
+      <w:pPr>
+        <w:pStyle w:val="BodyText"/>
+      </w:pPr>
+      <w:r>
+        <w:rPr>
+          <w:iCs/>
+          <w:i/>
+        </w:rPr>
+        <w:t xml:space="preserve">What changes the cost</w:t>
+      </w:r>
+      <w:r>
+        <w:t xml:space="preserve"> </w:t>
+      </w:r>
+      <w:r>
+        <w:t xml:space="preserve">(100% drift, 7B rates):</w:t>
+      </w:r>
+    </w:p>
+    <w:tbl>
+      <w:tblPr>
+        <w:tblStyle w:val="Table"/>
+        <w:tblW w:type="pct" w:w="5000"/>
+        <w:tblLook w:firstRow="1" w:lastRow="0" w:firstColumn="0" w:lastColumn="0" w:noHBand="0" w:noVBand="0" w:val="0020"/>
+      </w:tblPr>
+      <w:tblGrid>
+        <w:gridCol w:w="1980"/>
+        <w:gridCol w:w="1980"/>
+        <w:gridCol w:w="1980"/>
+        <w:gridCol w:w="1980"/>
+      </w:tblGrid>
+      <w:tr>
+        <w:trPr>
+          <w:tblHeader w:val="true"/>
+        </w:trPr>
+        <w:tc>
+          <w:tcPr/>
+          <w:p>
+            <w:pPr>
+              <w:pStyle w:val="Compact"/>
+              <w:jc w:val="left"/>
+            </w:pPr>
+            <w:r>
+              <w:t xml:space="preserve">Variant</w:t>
+            </w:r>
+          </w:p>
+        </w:tc>
+        <w:tc>
+          <w:tcPr/>
+          <w:p>
+            <w:pPr>
+              <w:pStyle w:val="Compact"/>
+              <w:jc w:val="left"/>
+            </w:pPr>
+            <w:r>
+              <w:t xml:space="preserve">cspaper</w:t>
+            </w:r>
+          </w:p>
+        </w:tc>
+        <w:tc>
+          <w:tcPr/>
+          <w:p>
+            <w:pPr>
+              <w:pStyle w:val="Compact"/>
+              <w:jc w:val="left"/>
+            </w:pPr>
+            <w:r>
+              <w:t xml:space="preserve">player</w:t>
+            </w:r>
+          </w:p>
+        </w:tc>
+        <w:tc>
+          <w:tcPr/>
+          <w:p>
+            <w:pPr>
+              <w:pStyle w:val="Compact"/>
+              <w:jc w:val="left"/>
+            </w:pPr>
+            <w:r>
+              <w:t xml:space="preserve">art</w:t>
+            </w:r>
+          </w:p>
+        </w:tc>
+      </w:tr>
+      <w:tr>
+        <w:tc>
+          <w:tcPr/>
+          <w:p>
+            <w:pPr>
+              <w:pStyle w:val="Compact"/>
+              <w:jc w:val="left"/>
+            </w:pPr>
+            <w:r>
+              <w:t xml:space="preserve">Recorded system (build + patches)</w:t>
+            </w:r>
+          </w:p>
+        </w:tc>
+        <w:tc>
+          <w:tcPr/>
+          <w:p>
+            <w:pPr>
+              <w:pStyle w:val="Compact"/>
+              <w:jc w:val="left"/>
+            </w:pPr>
+            <w:r>
+              <w:t xml:space="preserve">$0.160</w:t>
+            </w:r>
+          </w:p>
+        </w:tc>
+        <w:tc>
+          <w:tcPr/>
+          <w:p>
+            <w:pPr>
+              <w:pStyle w:val="Compact"/>
+              <w:jc w:val="left"/>
+            </w:pPr>
+            <w:r>
+              <w:t xml:space="preserve">$0.778</w:t>
+            </w:r>
+          </w:p>
+        </w:tc>
+        <w:tc>
+          <w:tcPr/>
+          <w:p>
+            <w:pPr>
+              <w:pStyle w:val="Compact"/>
+              <w:jc w:val="left"/>
+            </w:pPr>
+            <w:r>
+              <w:t xml:space="preserve">$0.881</w:t>
+            </w:r>
+          </w:p>
+        </w:tc>
+      </w:tr>
+      <w:tr>
+        <w:tc>
+          <w:tcPr/>
+          <w:p>
+            <w:pPr>
+              <w:pStyle w:val="Compact"/>
+              <w:jc w:val="left"/>
+            </w:pPr>
+            <w:r>
+              <w:t xml:space="preserve">Build workload cut to 10% of its queries (E12)</w:t>
+            </w:r>
+          </w:p>
+        </w:tc>
+        <w:tc>
+          <w:tcPr/>
+          <w:p>
+            <w:pPr>
+              <w:pStyle w:val="Compact"/>
+              <w:jc w:val="left"/>
+            </w:pPr>
+            <w:r>
+              <w:t xml:space="preserve">$0.196 (+23%)</w:t>
+            </w:r>
+          </w:p>
+        </w:tc>
+        <w:tc>
+          <w:tcPr/>
+          <w:p>
+            <w:pPr>
+              <w:pStyle w:val="Compact"/>
+              <w:jc w:val="left"/>
+            </w:pPr>
+            <w:r>
+              <w:t xml:space="preserve">$0.830 (+7%)</w:t>
+            </w:r>
+          </w:p>
+        </w:tc>
+        <w:tc>
+          <w:tcPr/>
+          <w:p>
+            <w:pPr>
+              <w:pStyle w:val="Compact"/>
+              <w:jc w:val="left"/>
+            </w:pPr>
+            <w:r>
+              <w:t xml:space="preserve">$1.036 (+18%)</w:t>
+            </w:r>
+          </w:p>
+        </w:tc>
+      </w:tr>
+      <w:tr>
+        <w:tc>
+          <w:tcPr/>
+          <w:p>
+            <w:pPr>
+              <w:pStyle w:val="Compact"/>
+              <w:jc w:val="left"/>
+            </w:pPr>
+            <w:r>
+              <w:t xml:space="preserve">No reuse of patched columns: patches only</w:t>
+            </w:r>
+          </w:p>
+        </w:tc>
+        <w:tc>
+          <w:tcPr/>
+          <w:p>
+            <w:pPr>
+              <w:pStyle w:val="Compact"/>
+              <w:jc w:val="left"/>
+            </w:pPr>
+            <w:r>
+              <w:t xml:space="preserve">$1.10 (vs $0.12)</w:t>
+            </w:r>
+          </w:p>
+        </w:tc>
+        <w:tc>
+          <w:tcPr/>
+          <w:p>
+            <w:pPr>
+              <w:pStyle w:val="Compact"/>
+              <w:jc w:val="left"/>
+            </w:pPr>
+            <w:r>
+              <w:t xml:space="preserve">$9.65 (vs $0.57)</w:t>
+            </w:r>
+          </w:p>
+        </w:tc>
+        <w:tc>
+          <w:tcPr/>
+          <w:p>
+            <w:pPr>
+              <w:pStyle w:val="Compact"/>
+              <w:jc w:val="left"/>
+            </w:pPr>
+            <w:r>
+              <w:t xml:space="preserve">$3.03 (vs $0.62)</w:t>
+            </w:r>
+          </w:p>
+        </w:tc>
+      </w:tr>
+      <w:tr>
+        <w:tc>
+          <w:tcPr/>
+          <w:p>
+            <w:pPr>
+              <w:pStyle w:val="Compact"/>
+              <w:jc w:val="left"/>
+            </w:pPr>
+            <w:r>
+              <w:t xml:space="preserve">Patch every document (no scope): patches only</w:t>
+            </w:r>
+          </w:p>
+        </w:tc>
+        <w:tc>
+          <w:tcPr/>
+          <w:p>
+            <w:pPr>
+              <w:pStyle w:val="Compact"/>
+              <w:jc w:val="left"/>
+            </w:pPr>
+            <w:r>
+              <w:t xml:space="preserve">$0.16 (vs $0.12)</w:t>
+            </w:r>
+          </w:p>
+        </w:tc>
+        <w:tc>
+          <w:tcPr/>
+          <w:p>
+            <w:pPr>
+              <w:pStyle w:val="Compact"/>
+              <w:jc w:val="left"/>
+            </w:pPr>
+            <w:r>
+              <w:t xml:space="preserve">$0.57 (same)</w:t>
+            </w:r>
+          </w:p>
+        </w:tc>
+        <w:tc>
+          <w:tcPr/>
+          <w:p>
+            <w:pPr>
+              <w:pStyle w:val="Compact"/>
+              <w:jc w:val="left"/>
+            </w:pPr>
+            <w:r>
+              <w:t xml:space="preserve">$0.91 (vs $0.62)</w:t>
+            </w:r>
+          </w:p>
+        </w:tc>
+      </w:tr>
+      <w:tr>
+        <w:tc>
+          <w:tcPr/>
+          <w:p>
+            <w:pPr>
+              <w:pStyle w:val="Compact"/>
+              <w:jc w:val="left"/>
+            </w:pPr>
+            <w:r>
+              <w:t xml:space="preserve">Long documents read to the first window: patches only</w:t>
+            </w:r>
+          </w:p>
+        </w:tc>
+        <w:tc>
+          <w:tcPr/>
+          <w:p>
+            <w:pPr>
+              <w:pStyle w:val="Compact"/>
+              <w:jc w:val="left"/>
+            </w:pPr>
+            <w:r>
+              <w:t xml:space="preserve">$0.12 (same)</w:t>
+            </w:r>
+          </w:p>
+        </w:tc>
+        <w:tc>
+          <w:tcPr/>
+          <w:p>
+            <w:pPr>
+              <w:pStyle w:val="Compact"/>
+              <w:jc w:val="left"/>
+            </w:pPr>
+            <w:r>
+              <w:t xml:space="preserve">$0.33 (vs $0.57)</w:t>
+            </w:r>
+          </w:p>
+        </w:tc>
+        <w:tc>
+          <w:tcPr/>
+          <w:p>
+            <w:pPr>
+              <w:pStyle w:val="Compact"/>
+              <w:jc w:val="left"/>
+            </w:pPr>
+            <w:r>
+              <w:t xml:space="preserve">$0.62 (same)</w:t>
+            </w:r>
+          </w:p>
+        </w:tc>
+      </w:tr>
+      <w:tr>
+        <w:tc>
+          <w:tcPr/>
+          <w:p>
+            <w:pPr>
+              <w:pStyle w:val="Compact"/>
+              <w:jc w:val="left"/>
+            </w:pPr>
+            <w:r>
+              <w:t xml:space="preserve">DocETL on the same test queries</w:t>
+            </w:r>
+          </w:p>
+        </w:tc>
+        <w:tc>
+          <w:tcPr/>
+          <w:p>
+            <w:pPr>
+              <w:pStyle w:val="Compact"/>
+              <w:jc w:val="left"/>
+            </w:pPr>
+            <w:r>
+              <w:t xml:space="preserve">$2.13</w:t>
+            </w:r>
+          </w:p>
+        </w:tc>
+        <w:tc>
+          <w:tcPr/>
+          <w:p>
+            <w:pPr>
+              <w:pStyle w:val="Compact"/>
+              <w:jc w:val="left"/>
+            </w:pPr>
+            <w:r>
+              <w:t xml:space="preserve">$19.15</w:t>
+            </w:r>
+          </w:p>
+        </w:tc>
+        <w:tc>
+          <w:tcPr/>
+          <w:p>
+            <w:pPr>
+              <w:pStyle w:val="Compact"/>
+              <w:jc w:val="left"/>
+            </w:pPr>
+            <w:r>
+              <w:t xml:space="preserve">$5.94</w:t>
+            </w:r>
+          </w:p>
+        </w:tc>
+      </w:tr>
+    </w:tbl>
+    <w:p>
+      <w:pPr>
+        <w:pStyle w:val="BodyText"/>
+      </w:pPr>
+      <w:r>
+        <w:rPr>
+          <w:iCs/>
+          <w:i/>
+        </w:rPr>
+        <w:t xml:space="preserve">Across models</w:t>
+      </w:r>
+      <w:r>
+        <w:t xml:space="preserve"> </w:t>
+      </w:r>
+      <w:r>
+        <w:t xml:space="preserve">(build + patches at 100% drift; token counts are within a few percent across models, so prices</w:t>
+      </w:r>
+      <w:r>
+        <w:t xml:space="preserve"> </w:t>
+      </w:r>
+      <w:r>
+        <w:t xml:space="preserve">differ by rate alone):</w:t>
+      </w:r>
+    </w:p>
+    <w:tbl>
+      <w:tblPr>
+        <w:tblStyle w:val="Table"/>
+        <w:tblW w:type="pct" w:w="5000"/>
+        <w:tblLook w:firstRow="1" w:lastRow="0" w:firstColumn="0" w:lastColumn="0" w:noHBand="0" w:noVBand="0" w:val="0020"/>
+      </w:tblPr>
+      <w:tblGrid>
+        <w:gridCol w:w="1980"/>
+        <w:gridCol w:w="1980"/>
+        <w:gridCol w:w="1980"/>
+        <w:gridCol w:w="1980"/>
+      </w:tblGrid>
+      <w:tr>
+        <w:trPr>
+          <w:tblHeader w:val="true"/>
+        </w:trPr>
+        <w:tc>
+          <w:tcPr/>
+          <w:p>
+            <w:pPr>
+              <w:pStyle w:val="Compact"/>
+              <w:jc w:val="left"/>
+            </w:pPr>
+            <w:r>
+              <w:t xml:space="preserve">Corpus</w:t>
+            </w:r>
+          </w:p>
+        </w:tc>
+        <w:tc>
+          <w:tcPr/>
+          <w:p>
+            <w:pPr>
+              <w:pStyle w:val="Compact"/>
+              <w:jc w:val="left"/>
+            </w:pPr>
+            <w:r>
+              <w:t xml:space="preserve">Llama 3.1 8B ($0.05 / $0.08)</w:t>
+            </w:r>
+          </w:p>
+        </w:tc>
+        <w:tc>
+          <w:tcPr/>
+          <w:p>
+            <w:pPr>
+              <w:pStyle w:val="Compact"/>
+              <w:jc w:val="left"/>
+            </w:pPr>
+            <w:r>
+              <w:t xml:space="preserve">Qwen 2.5 7B ($0.10 / $0.20)</w:t>
+            </w:r>
+          </w:p>
+        </w:tc>
+        <w:tc>
+          <w:tcPr/>
+          <w:p>
+            <w:pPr>
+              <w:pStyle w:val="Compact"/>
+              <w:jc w:val="left"/>
+            </w:pPr>
+            <w:r>
+              <w:t xml:space="preserve">Qwen 2.5 32B (not listed; $0.08 / $0.28 to $0.66 / $1.00)</w:t>
+            </w:r>
+          </w:p>
+        </w:tc>
+      </w:tr>
+      <w:tr>
+        <w:tc>
+          <w:tcPr/>
+          <w:p>
+            <w:pPr>
+              <w:pStyle w:val="Compact"/>
+              <w:jc w:val="left"/>
+            </w:pPr>
+            <w:r>
+              <w:t xml:space="preserve">cspaper</w:t>
+            </w:r>
+          </w:p>
+        </w:tc>
+        <w:tc>
+          <w:tcPr/>
+          <w:p>
+            <w:pPr>
+              <w:pStyle w:val="Compact"/>
+              <w:jc w:val="left"/>
+            </w:pPr>
+            <w:r>
+              <w:t xml:space="preserve">$0.09 (score 0.125)</w:t>
+            </w:r>
+          </w:p>
+        </w:tc>
+        <w:tc>
+          <w:tcPr/>
+          <w:p>
+            <w:pPr>
+              <w:pStyle w:val="Compact"/>
+              <w:jc w:val="left"/>
+            </w:pPr>
+            <w:r>
+              <w:t xml:space="preserve">$0.16 (0.153)</w:t>
+            </w:r>
+          </w:p>
+        </w:tc>
+        <w:tc>
+          <w:tcPr/>
+          <w:p>
+            <w:pPr>
+              <w:pStyle w:val="Compact"/>
+              <w:jc w:val="left"/>
+            </w:pPr>
+            <w:r>
+              <w:t xml:space="preserve">$0.14–1.08 (0.224)</w:t>
+            </w:r>
+          </w:p>
+        </w:tc>
+      </w:tr>
+      <w:tr>
+        <w:tc>
+          <w:tcPr/>
+          <w:p>
+            <w:pPr>
+              <w:pStyle w:val="Compact"/>
+              <w:jc w:val="left"/>
+            </w:pPr>
+            <w:r>
+              <w:t xml:space="preserve">player</w:t>
+            </w:r>
+          </w:p>
+        </w:tc>
+        <w:tc>
+          <w:tcPr/>
+          <w:p>
+            <w:pPr>
+              <w:pStyle w:val="Compact"/>
+              <w:jc w:val="left"/>
+            </w:pPr>
+            <w:r>
+              <w:t xml:space="preserve">$0.39 (0.359)</w:t>
+            </w:r>
+          </w:p>
+        </w:tc>
+        <w:tc>
+          <w:tcPr/>
+          <w:p>
+            <w:pPr>
+              <w:pStyle w:val="Compact"/>
+              <w:jc w:val="left"/>
+            </w:pPr>
+            <w:r>
+              <w:t xml:space="preserve">$0.78 (0.387)</w:t>
+            </w:r>
+          </w:p>
+        </w:tc>
+        <w:tc>
+          <w:tcPr/>
+          <w:p>
+            <w:pPr>
+              <w:pStyle w:val="Compact"/>
+              <w:jc w:val="left"/>
+            </w:pPr>
+            <w:r>
+              <w:t xml:space="preserve">$0.64–5.14 (0.421)</w:t>
+            </w:r>
+          </w:p>
+        </w:tc>
+      </w:tr>
+      <w:tr>
+        <w:tc>
+          <w:tcPr/>
+          <w:p>
+            <w:pPr>
+              <w:pStyle w:val="Compact"/>
+              <w:jc w:val="left"/>
+            </w:pPr>
+            <w:r>
+              <w:t xml:space="preserve">art</w:t>
+            </w:r>
+          </w:p>
+        </w:tc>
+        <w:tc>
+          <w:tcPr/>
+          <w:p>
+            <w:pPr>
+              <w:pStyle w:val="Compact"/>
+              <w:jc w:val="left"/>
+            </w:pPr>
+            <w:r>
+              <w:t xml:space="preserve">$0.50 (0.203)</w:t>
+            </w:r>
+          </w:p>
+        </w:tc>
+        <w:tc>
+          <w:tcPr/>
+          <w:p>
+            <w:pPr>
+              <w:pStyle w:val="Compact"/>
+              <w:jc w:val="left"/>
+            </w:pPr>
+            <w:r>
+              <w:t xml:space="preserve">$0.88 (0.256)</w:t>
+            </w:r>
+          </w:p>
+        </w:tc>
+        <w:tc>
+          <w:tcPr/>
+          <w:p>
+            <w:pPr>
+              <w:pStyle w:val="Compact"/>
+              <w:jc w:val="left"/>
+            </w:pPr>
+            <w:r>
+              <w:t xml:space="preserve">$0.73–5.58 (0.289)</w:t>
+            </w:r>
+          </w:p>
+        </w:tc>
+      </w:tr>
+    </w:tbl>
+    <w:p>
+      <w:pPr>
+        <w:pStyle w:val="BodyText"/>
+      </w:pPr>
+      <w:r>
+        <w:t xml:space="preserve">Qwen 2.5 32B Instruct is not on OpenRouter; the range uses the closest listed models,</w:t>
+      </w:r>
+      <w:r>
+        <w:t xml:space="preserve"> </w:t>
+      </w:r>
+      <w:r>
+        <w:rPr>
+          <w:rStyle w:val="VerbatimChar"/>
+        </w:rPr>
+        <w:t xml:space="preserve">qwen/qwen3-32b</w:t>
+      </w:r>
+      <w:r>
+        <w:t xml:space="preserve"> </w:t>
+      </w:r>
+      <w:r>
+        <w:t xml:space="preserve">(low) and</w:t>
+      </w:r>
+      <w:r>
+        <w:t xml:space="preserve"> </w:t>
+      </w:r>
+      <w:r>
+        <w:rPr>
+          <w:rStyle w:val="VerbatimChar"/>
+        </w:rPr>
+        <w:t xml:space="preserve">qwen/qwen-2.5-coder-32b-instruct</w:t>
+      </w:r>
+      <w:r>
+        <w:t xml:space="preserve"> </w:t>
+      </w:r>
+      <w:r>
+        <w:t xml:space="preserve">(high, same generation and size).</w:t>
+      </w:r>
+    </w:p>
+    <w:p>
+      <w:pPr>
+        <w:pStyle w:val="BodyText"/>
+      </w:pPr>
+      <w:r>
+        <w:rPr>
+          <w:bCs/>
+          <w:b/>
+        </w:rPr>
+        <w:t xml:space="preserve">Implication.</w:t>
+      </w:r>
+      <w:r>
+        <w:t xml:space="preserve"> </w:t>
+      </w:r>
+      <w:r>
+        <w:t xml:space="preserve">The cost of adapting to drift is a handful of whole-corpus reads, each 0.2–1.1M tokens (cents at small</w:t>
+      </w:r>
+      <w:r>
+        <w:t xml:space="preserve"> </w:t>
+      </w:r>
+      <w:r>
+        <w:t xml:space="preserve">model rates), paid once per new column and shared by every later query that uses it. Reuse is what keeps it small;</w:t>
+      </w:r>
+      <w:r>
+        <w:t xml:space="preserve"> </w:t>
+      </w:r>
+      <w:r>
+        <w:t xml:space="preserve">anticipating columns during the build removes most of it.</w:t>
+      </w:r>
+    </w:p>
+    <w:p>
+      <w:pPr>
+        <w:pStyle w:val="BodyText"/>
+      </w:pPr>
+      <w:r>
+        <w:rPr>
+          <w:bCs/>
+          <w:b/>
+        </w:rPr>
+        <w:t xml:space="preserve">Scope.</w:t>
+      </w:r>
+      <w:r>
+        <w:t xml:space="preserve"> </w:t>
+      </w:r>
+      <w:r>
+        <w:t xml:space="preserve">Three corpora (med and legal not yet run); tokens measured, the fixed levels’ builds costed as one shared</w:t>
+      </w:r>
+      <w:r>
+        <w:t xml:space="preserve"> </w:t>
+      </w:r>
+      <w:r>
+        <w:t xml:space="preserve">read (within about 2%, E1.3); prices are list rates on 2026-10-07 and exclude local serving costs.</w:t>
+      </w:r>
+    </w:p>
+    <w:p>
+      <w:r>
+        <w:pict>
+          <v:rect style="width:0;height:1.5pt" o:hralign="center" o:hrstd="t" o:hr="t"/>
+        </w:pict>
+      </w:r>
+    </w:p>
+    <w:bookmarkEnd w:id="69"/>
+    <w:bookmarkStart w:id="73" w:name="comparison-with-docetl"/>
     <w:p>
       <w:pPr>
         <w:pStyle w:val="Heading2"/>
@@ -6852,18 +8109,18 @@
           <wp:inline>
             <wp:extent cx="5334000" cy="1723292"/>
             <wp:effectExtent b="0" l="0" r="0" t="0"/>
-            <wp:docPr descr="Ours vs DocETL per corpus (left) and on player by number of joins (right)." title="" id="70" name="Picture"/>
+            <wp:docPr descr="Ours vs DocETL per corpus (left) and on player by number of joins (right)." title="" id="71" name="Picture"/>
             <a:graphic>
               <a:graphicData uri="http://schemas.openxmlformats.org/drawingml/2006/picture">
                 <pic:pic>
                   <pic:nvPicPr>
-                    <pic:cNvPr descr="figures/docetl.png" id="71" name="Picture"/>
+                    <pic:cNvPr descr="figures/docetl.png" id="72" name="Picture"/>
                     <pic:cNvPicPr>
                       <a:picLocks noChangeArrowheads="1" noChangeAspect="1"/>
                     </pic:cNvPicPr>
                   </pic:nvPicPr>
                   <pic:blipFill>
-                    <a:blip r:embed="rId69"/>
+                    <a:blip r:embed="rId70"/>
                     <a:stretch>
                       <a:fillRect/>
                     </a:stretch>
@@ -6944,8 +8201,8 @@
         <w:t xml:space="preserve">All 220 drift test queries on cspaper, player and art (med and legal not yet run); one model.</w:t>
       </w:r>
     </w:p>
-    <w:bookmarkEnd w:id="72"/>
     <w:bookmarkEnd w:id="73"/>
+    <w:bookmarkEnd w:id="74"/>
     <w:sectPr/>
   </w:body>
 </w:document>

</xml_diff>

<commit_message>
Cost section: DocETL ratio 7-25x; model token differences up to 19%
Co-Authored-By: Claude Opus 5.5 <noreply@anthropic.com>
</commit_message>
<xml_diff>
--- a/results/experiments/RESULTS_PAPER.docx
+++ b/results/experiments/RESULTS_PAPER.docx
@@ -6298,7 +6298,7 @@
         <w:t xml:space="preserve"> </w:t>
       </w:r>
       <w:r>
-        <w:t xml:space="preserve">system is 13–25× cheaper than DocETL on the same queries.</w:t>
+        <w:t xml:space="preserve">system is 7–25× cheaper than DocETL on the same queries.</w:t>
       </w:r>
     </w:p>
     <w:p>
@@ -7182,13 +7182,13 @@
         <w:t xml:space="preserve"> </w:t>
       </w:r>
       <w:r>
-        <w:t xml:space="preserve">(build + patches at 100% drift; token counts are within a few percent across models, so prices</w:t>
-      </w:r>
-      <w:r>
-        <w:t xml:space="preserve"> </w:t>
-      </w:r>
-      <w:r>
-        <w:t xml:space="preserve">differ by rate alone):</w:t>
+        <w:t xml:space="preserve">(build + patches at 100% drift; patch tokens differ by at most 19% across models — Llama reads</w:t>
+      </w:r>
+      <w:r>
+        <w:t xml:space="preserve"> </w:t>
+      </w:r>
+      <w:r>
+        <w:t xml:space="preserve">more on art — so prices differ mostly by rate):</w:t>
       </w:r>
     </w:p>
     <w:tbl>

</xml_diff>

<commit_message>
med and legal back in the results (regenerated queries): RQ1, anticipation, RQ4 waste, RQ8, query types, cost, DocETL; figures on five corpora where complete
Co-Authored-By: Claude Opus 5.5 <noreply@anthropic.com>
</commit_message>
<xml_diff>
--- a/results/experiments/RESULTS_PAPER.docx
+++ b/results/experiments/RESULTS_PAPER.docx
@@ -293,13 +293,19 @@
         <w:t xml:space="preserve"> </w:t>
       </w:r>
       <w:r>
-        <w:t xml:space="preserve">tables, about 300), and court cases (legal, 570). The results below cover cspaper, player and art (220 drift test</w:t>
-      </w:r>
-      <w:r>
-        <w:t xml:space="preserve"> </w:t>
-      </w:r>
-      <w:r>
-        <w:t xml:space="preserve">queries); med and legal have not been run yet.</w:t>
+        <w:t xml:space="preserve">tables, about 300), and court cases (legal, 570). 290 drift test queries over all five. Budget policies, ablations,</w:t>
+      </w:r>
+      <w:r>
+        <w:t xml:space="preserve"> </w:t>
+      </w:r>
+      <w:r>
+        <w:t xml:space="preserve">other models and smaller build workloads on med and legal are still running; those sections cover cspaper, player</w:t>
+      </w:r>
+      <w:r>
+        <w:t xml:space="preserve"> </w:t>
+      </w:r>
+      <w:r>
+        <w:t xml:space="preserve">and art.</w:t>
       </w:r>
     </w:p>
     <w:p>
@@ -699,24 +705,32 @@
               <w:jc w:val="left"/>
             </w:pPr>
             <w:r>
-              <w:t xml:space="preserve">not yet run</w:t>
-            </w:r>
-          </w:p>
-        </w:tc>
-        <w:tc>
-          <w:tcPr/>
-          <w:p>
-            <w:pPr>
-              <w:pStyle w:val="Compact"/>
-            </w:pPr>
-          </w:p>
-        </w:tc>
-        <w:tc>
-          <w:tcPr/>
-          <w:p>
-            <w:pPr>
-              <w:pStyle w:val="Compact"/>
-            </w:pPr>
+              <w:t xml:space="preserve">0.005</w:t>
+            </w:r>
+          </w:p>
+        </w:tc>
+        <w:tc>
+          <w:tcPr/>
+          <w:p>
+            <w:pPr>
+              <w:pStyle w:val="Compact"/>
+              <w:jc w:val="left"/>
+            </w:pPr>
+            <w:r>
+              <w:t xml:space="preserve">0.170</w:t>
+            </w:r>
+          </w:p>
+        </w:tc>
+        <w:tc>
+          <w:tcPr/>
+          <w:p>
+            <w:pPr>
+              <w:pStyle w:val="Compact"/>
+              <w:jc w:val="left"/>
+            </w:pPr>
+            <w:r>
+              <w:t xml:space="preserve">+0.165 (0.096 – 0.237)</w:t>
+            </w:r>
           </w:p>
         </w:tc>
       </w:tr>
@@ -741,24 +755,32 @@
               <w:jc w:val="left"/>
             </w:pPr>
             <w:r>
-              <w:t xml:space="preserve">not yet run</w:t>
-            </w:r>
-          </w:p>
-        </w:tc>
-        <w:tc>
-          <w:tcPr/>
-          <w:p>
-            <w:pPr>
-              <w:pStyle w:val="Compact"/>
-            </w:pPr>
-          </w:p>
-        </w:tc>
-        <w:tc>
-          <w:tcPr/>
-          <w:p>
-            <w:pPr>
-              <w:pStyle w:val="Compact"/>
-            </w:pPr>
+              <w:t xml:space="preserve">0.041</w:t>
+            </w:r>
+          </w:p>
+        </w:tc>
+        <w:tc>
+          <w:tcPr/>
+          <w:p>
+            <w:pPr>
+              <w:pStyle w:val="Compact"/>
+              <w:jc w:val="left"/>
+            </w:pPr>
+            <w:r>
+              <w:t xml:space="preserve">0.115</w:t>
+            </w:r>
+          </w:p>
+        </w:tc>
+        <w:tc>
+          <w:tcPr/>
+          <w:p>
+            <w:pPr>
+              <w:pStyle w:val="Compact"/>
+              <w:jc w:val="left"/>
+            </w:pPr>
+            <w:r>
+              <w:t xml:space="preserve">+0.074 (0.035 – 0.119)</w:t>
+            </w:r>
           </w:p>
         </w:tc>
       </w:tr>
@@ -768,7 +790,7 @@
         <w:pStyle w:val="BodyText"/>
       </w:pPr>
       <w:r>
-        <w:t xml:space="preserve">With patching, the score at 100% drift is never more than 0.014 below the fully anticipated build (0% drift). On</w:t>
+        <w:t xml:space="preserve">With patching, the score at 100% drift is never more than 0.015 below the fully anticipated build (0% drift). On</w:t>
       </w:r>
       <w:r>
         <w:t xml:space="preserve"> </w:t>
@@ -845,7 +867,7 @@
       <w:r>
         <w:drawing>
           <wp:inline>
-            <wp:extent cx="5334000" cy="1828800"/>
+            <wp:extent cx="5334000" cy="1163781"/>
             <wp:effectExtent b="0" l="0" r="0" t="0"/>
             <wp:docPr descr="Score as drift grows, static build vs on-demand patching, per corpus." title="" id="22" name="Picture"/>
             <a:graphic>
@@ -866,7 +888,7 @@
                   <pic:spPr bwMode="auto">
                     <a:xfrm>
                       <a:off x="0" y="0"/>
-                      <a:ext cx="5334000" cy="1828800"/>
+                      <a:ext cx="5334000" cy="1163781"/>
                     </a:xfrm>
                     <a:prstGeom prst="rect">
                       <a:avLst/>
@@ -1270,32 +1292,44 @@
               <w:jc w:val="left"/>
             </w:pPr>
             <w:r>
-              <w:t xml:space="preserve">not yet run</w:t>
-            </w:r>
-          </w:p>
-        </w:tc>
-        <w:tc>
-          <w:tcPr/>
-          <w:p>
-            <w:pPr>
-              <w:pStyle w:val="Compact"/>
-            </w:pPr>
-          </w:p>
-        </w:tc>
-        <w:tc>
-          <w:tcPr/>
-          <w:p>
-            <w:pPr>
-              <w:pStyle w:val="Compact"/>
-            </w:pPr>
-          </w:p>
-        </w:tc>
-        <w:tc>
-          <w:tcPr/>
-          <w:p>
-            <w:pPr>
-              <w:pStyle w:val="Compact"/>
-            </w:pPr>
+              <w:t xml:space="preserve">2.81M, 0.130</w:t>
+            </w:r>
+          </w:p>
+        </w:tc>
+        <w:tc>
+          <w:tcPr/>
+          <w:p>
+            <w:pPr>
+              <w:pStyle w:val="Compact"/>
+              <w:jc w:val="left"/>
+            </w:pPr>
+            <w:r>
+              <w:t xml:space="preserve">16.62M, 0.115</w:t>
+            </w:r>
+          </w:p>
+        </w:tc>
+        <w:tc>
+          <w:tcPr/>
+          <w:p>
+            <w:pPr>
+              <w:pStyle w:val="Compact"/>
+              <w:jc w:val="left"/>
+            </w:pPr>
+            <w:r>
+              <w:t xml:space="preserve">5.9×</w:t>
+            </w:r>
+          </w:p>
+        </w:tc>
+        <w:tc>
+          <w:tcPr/>
+          <w:p>
+            <w:pPr>
+              <w:pStyle w:val="Compact"/>
+              <w:jc w:val="left"/>
+            </w:pPr>
+            <w:r>
+              <w:t xml:space="preserve">1.9%</w:t>
+            </w:r>
           </w:p>
         </w:tc>
       </w:tr>
@@ -1320,32 +1354,44 @@
               <w:jc w:val="left"/>
             </w:pPr>
             <w:r>
-              <w:t xml:space="preserve">not yet run</w:t>
-            </w:r>
-          </w:p>
-        </w:tc>
-        <w:tc>
-          <w:tcPr/>
-          <w:p>
-            <w:pPr>
-              <w:pStyle w:val="Compact"/>
-            </w:pPr>
-          </w:p>
-        </w:tc>
-        <w:tc>
-          <w:tcPr/>
-          <w:p>
-            <w:pPr>
-              <w:pStyle w:val="Compact"/>
-            </w:pPr>
-          </w:p>
-        </w:tc>
-        <w:tc>
-          <w:tcPr/>
-          <w:p>
-            <w:pPr>
-              <w:pStyle w:val="Compact"/>
-            </w:pPr>
+              <w:t xml:space="preserve">4.94M, 0.173</w:t>
+            </w:r>
+          </w:p>
+        </w:tc>
+        <w:tc>
+          <w:tcPr/>
+          <w:p>
+            <w:pPr>
+              <w:pStyle w:val="Compact"/>
+              <w:jc w:val="left"/>
+            </w:pPr>
+            <w:r>
+              <w:t xml:space="preserve">24.33M, 0.170</w:t>
+            </w:r>
+          </w:p>
+        </w:tc>
+        <w:tc>
+          <w:tcPr/>
+          <w:p>
+            <w:pPr>
+              <w:pStyle w:val="Compact"/>
+              <w:jc w:val="left"/>
+            </w:pPr>
+            <w:r>
+              <w:t xml:space="preserve">4.9×</w:t>
+            </w:r>
+          </w:p>
+        </w:tc>
+        <w:tc>
+          <w:tcPr/>
+          <w:p>
+            <w:pPr>
+              <w:pStyle w:val="Compact"/>
+              <w:jc w:val="left"/>
+            </w:pPr>
+            <w:r>
+              <w:t xml:space="preserve">1.9%</w:t>
+            </w:r>
           </w:p>
         </w:tc>
       </w:tr>
@@ -1590,13 +1636,13 @@
         <w:t xml:space="preserve"> </w:t>
       </w:r>
       <w:r>
-        <w:t xml:space="preserve">Three corpora (cspaper, player, art; med and legal not yet run), all drift levels, one model; four draws</w:t>
-      </w:r>
-      <w:r>
-        <w:t xml:space="preserve"> </w:t>
-      </w:r>
-      <w:r>
-        <w:t xml:space="preserve">of the withheld columns on cspaper and player; three smaller build workloads; replicated with two other models (RQ7).</w:t>
+        <w:t xml:space="preserve">Five corpora, all drift levels, one model; four draws of the withheld columns on cspaper and player; three</w:t>
+      </w:r>
+      <w:r>
+        <w:t xml:space="preserve"> </w:t>
+      </w:r>
+      <w:r>
+        <w:t xml:space="preserve">smaller build workloads on cspaper, player and art; replicated with two other models (RQ7).</w:t>
       </w:r>
     </w:p>
     <w:p>
@@ -2941,13 +2987,13 @@
         <w:t xml:space="preserve"> </w:t>
       </w:r>
       <w:r>
-        <w:t xml:space="preserve">Cost, yes, almost exactly. On the corpora run so far few extraction tokens buy nothing, and most of those</w:t>
-      </w:r>
-      <w:r>
-        <w:t xml:space="preserve"> </w:t>
-      </w:r>
-      <w:r>
-        <w:t xml:space="preserve">are spent by patches that read the whole corpus.</w:t>
+        <w:t xml:space="preserve">Cost, yes, almost exactly. Value only partly: 16% of patch tokens buy nothing, mostly on corpora whose</w:t>
+      </w:r>
+      <w:r>
+        <w:t xml:space="preserve"> </w:t>
+      </w:r>
+      <w:r>
+        <w:t xml:space="preserve">values are often absent (med, cspaper), and whole-corpus patches hold the larger share of that waste.</w:t>
       </w:r>
     </w:p>
     <w:p>
@@ -3001,13 +3047,13 @@
         <w:t xml:space="preserve"> </w:t>
       </w:r>
       <w:r>
-        <w:t xml:space="preserve">columns, at 100% drift: player 0%, art 16%, cspaper 39% (med and legal not yet run). Over all 67 patches of the</w:t>
-      </w:r>
-      <w:r>
-        <w:t xml:space="preserve"> </w:t>
-      </w:r>
-      <w:r>
-        <w:t xml:space="preserve">unlimited streams at every drift level (31.5M tokens, 5% wasted):</w:t>
+        <w:t xml:space="preserve">columns, at 100% drift: player 0%, art 16%, legal 19%, med 33%, cspaper 39%. Over all 116 patches of the unlimited</w:t>
+      </w:r>
+      <w:r>
+        <w:t xml:space="preserve"> </w:t>
+      </w:r>
+      <w:r>
+        <w:t xml:space="preserve">streams at every drift level (118M tokens, 16% wasted):</w:t>
       </w:r>
     </w:p>
     <w:tbl>
@@ -3083,19 +3129,19 @@
               <w:jc w:val="left"/>
             </w:pPr>
             <w:r>
-              <w:t xml:space="preserve">7%</w:t>
-            </w:r>
-          </w:p>
-        </w:tc>
-        <w:tc>
-          <w:tcPr/>
-          <w:p>
-            <w:pPr>
-              <w:pStyle w:val="Compact"/>
-              <w:jc w:val="left"/>
-            </w:pPr>
-            <w:r>
-              <w:t xml:space="preserve">86%</w:t>
+              <w:t xml:space="preserve">20%</w:t>
+            </w:r>
+          </w:p>
+        </w:tc>
+        <w:tc>
+          <w:tcPr/>
+          <w:p>
+            <w:pPr>
+              <w:pStyle w:val="Compact"/>
+              <w:jc w:val="left"/>
+            </w:pPr>
+            <w:r>
+              <w:t xml:space="preserve">58%</w:t>
             </w:r>
           </w:p>
         </w:tc>
@@ -3121,19 +3167,19 @@
               <w:jc w:val="left"/>
             </w:pPr>
             <w:r>
-              <w:t xml:space="preserve">2%</w:t>
-            </w:r>
-          </w:p>
-        </w:tc>
-        <w:tc>
-          <w:tcPr/>
-          <w:p>
-            <w:pPr>
-              <w:pStyle w:val="Compact"/>
-              <w:jc w:val="left"/>
-            </w:pPr>
-            <w:r>
-              <w:t xml:space="preserve">14%</w:t>
+              <w:t xml:space="preserve">12%</w:t>
+            </w:r>
+          </w:p>
+        </w:tc>
+        <w:tc>
+          <w:tcPr/>
+          <w:p>
+            <w:pPr>
+              <w:pStyle w:val="Compact"/>
+              <w:jc w:val="left"/>
+            </w:pPr>
+            <w:r>
+              <w:t xml:space="preserve">42%</w:t>
             </w:r>
           </w:p>
         </w:tc>
@@ -3171,7 +3217,7 @@
               <w:jc w:val="left"/>
             </w:pPr>
             <w:r>
-              <w:t xml:space="preserve">14%</w:t>
+              <w:t xml:space="preserve">1%</w:t>
             </w:r>
           </w:p>
         </w:tc>
@@ -3273,7 +3319,7 @@
         <w:t xml:space="preserve"> </w:t>
       </w:r>
       <w:r>
-        <w:t xml:space="preserve">Three corpora (med and legal not yet run), the unlimited streams.</w:t>
+        <w:t xml:space="preserve">Five corpora, the unlimited streams.</w:t>
       </w:r>
     </w:p>
     <w:p>
@@ -3984,7 +4030,7 @@
         <w:t xml:space="preserve"> </w:t>
       </w:r>
       <w:r>
-        <w:t xml:space="preserve">Three corpora (med and legal not yet run), all budget × drift settings.</w:t>
+        <w:t xml:space="preserve">Five corpora, all budget × drift settings.</w:t>
       </w:r>
     </w:p>
     <w:p>
@@ -4621,19 +4667,19 @@
         <w:t xml:space="preserve"> </w:t>
       </w:r>
       <w:r>
-        <w:t xml:space="preserve">It depends on the corpus. Where documents have simple facts and tables join cleanly (player, cspaper), the</w:t>
-      </w:r>
-      <w:r>
-        <w:t xml:space="preserve"> </w:t>
-      </w:r>
-      <w:r>
-        <w:t xml:space="preserve">loss is in cell values; where values are free-text labels (art), it is in both values and structure (wrong or missing</w:t>
-      </w:r>
-      <w:r>
-        <w:t xml:space="preserve"> </w:t>
-      </w:r>
-      <w:r>
-        <w:t xml:space="preserve">rows and groups). Two causes cut across corpora and bound every system: the benchmark’s metadata instructs extractors to fill fields that</w:t>
+        <w:t xml:space="preserve">It depends on the corpus. Where documents have simple facts and tables join cleanly, the loss is in cell</w:t>
+      </w:r>
+      <w:r>
+        <w:t xml:space="preserve"> </w:t>
+      </w:r>
+      <w:r>
+        <w:t xml:space="preserve">values; where values are free text, lists or join keys, it is in structure (wrong or missing rows and groups). Two</w:t>
+      </w:r>
+      <w:r>
+        <w:t xml:space="preserve"> </w:t>
+      </w:r>
+      <w:r>
+        <w:t xml:space="preserve">causes cut across corpora and bound every system: the benchmark’s metadata instructs extractors to fill fields that</w:t>
       </w:r>
       <w:r>
         <w:t xml:space="preserve"> </w:t>
@@ -4808,24 +4854,32 @@
               <w:jc w:val="left"/>
             </w:pPr>
             <w:r>
-              <w:t xml:space="preserve">not yet run</w:t>
-            </w:r>
-          </w:p>
-        </w:tc>
-        <w:tc>
-          <w:tcPr/>
-          <w:p>
-            <w:pPr>
-              <w:pStyle w:val="Compact"/>
-            </w:pPr>
-          </w:p>
-        </w:tc>
-        <w:tc>
-          <w:tcPr/>
-          <w:p>
-            <w:pPr>
-              <w:pStyle w:val="Compact"/>
-            </w:pPr>
+              <w:t xml:space="preserve">0.720</w:t>
+            </w:r>
+          </w:p>
+        </w:tc>
+        <w:tc>
+          <w:tcPr/>
+          <w:p>
+            <w:pPr>
+              <w:pStyle w:val="Compact"/>
+              <w:jc w:val="left"/>
+            </w:pPr>
+            <w:r>
+              <w:t xml:space="preserve">0.229</w:t>
+            </w:r>
+          </w:p>
+        </w:tc>
+        <w:tc>
+          <w:tcPr/>
+          <w:p>
+            <w:pPr>
+              <w:pStyle w:val="Compact"/>
+              <w:jc w:val="left"/>
+            </w:pPr>
+            <w:r>
+              <w:t xml:space="preserve">cell values</w:t>
+            </w:r>
           </w:p>
         </w:tc>
       </w:tr>
@@ -4950,24 +5004,32 @@
               <w:jc w:val="left"/>
             </w:pPr>
             <w:r>
-              <w:t xml:space="preserve">not yet run</w:t>
-            </w:r>
-          </w:p>
-        </w:tc>
-        <w:tc>
-          <w:tcPr/>
-          <w:p>
-            <w:pPr>
-              <w:pStyle w:val="Compact"/>
-            </w:pPr>
-          </w:p>
-        </w:tc>
-        <w:tc>
-          <w:tcPr/>
-          <w:p>
-            <w:pPr>
-              <w:pStyle w:val="Compact"/>
-            </w:pPr>
+              <w:t xml:space="preserve">0.334</w:t>
+            </w:r>
+          </w:p>
+        </w:tc>
+        <w:tc>
+          <w:tcPr/>
+          <w:p>
+            <w:pPr>
+              <w:pStyle w:val="Compact"/>
+              <w:jc w:val="left"/>
+            </w:pPr>
+            <w:r>
+              <w:t xml:space="preserve">0.230</w:t>
+            </w:r>
+          </w:p>
+        </w:tc>
+        <w:tc>
+          <w:tcPr/>
+          <w:p>
+            <w:pPr>
+              <w:pStyle w:val="Compact"/>
+              <w:jc w:val="left"/>
+            </w:pPr>
+            <w:r>
+              <w:t xml:space="preserve">structure: too few rows (list-valued join keys, free-text comparisons)</w:t>
+            </w:r>
           </w:p>
         </w:tc>
       </w:tr>
@@ -5224,7 +5286,13 @@
         <w:t xml:space="preserve"> </w:t>
       </w:r>
       <w:r>
-        <w:t xml:space="preserve">(patched, 100% drift): AVG 0.42, SUM 0.35, MIN over numbers 0.33, COUNT 0.28, MAX over numbers 0.18.</w:t>
+        <w:t xml:space="preserve">(patched, 100% drift, 290 queries): AVG 0.40, SUM 0.34, MIN over numbers 0.31, COUNT 0.23, MAX over</w:t>
+      </w:r>
+      <w:r>
+        <w:t xml:space="preserve"> </w:t>
+      </w:r>
+      <w:r>
+        <w:t xml:space="preserve">numbers 0.19; MIN/MAX over numbers stored as text (years, amounts) 0.21–0.25.</w:t>
       </w:r>
     </w:p>
     <w:p>
@@ -5266,7 +5334,7 @@
         <w:t xml:space="preserve"> </w:t>
       </w:r>
       <w:r>
-        <w:t xml:space="preserve">Three corpora (med and legal not yet run); one model for the per-column analysis.</w:t>
+        <w:t xml:space="preserve">Five corpora (the metadata count on cspaper, player and art); one model for the per-column analysis.</w:t>
       </w:r>
     </w:p>
     <w:p>
@@ -6274,25 +6342,25 @@
         <w:t xml:space="preserve"> </w:t>
       </w:r>
       <w:r>
-        <w:t xml:space="preserve">Under drift, on-demand patching is most of the cost: at 100% drift patches are 71–75% of all extraction</w:t>
-      </w:r>
-      <w:r>
-        <w:t xml:space="preserve"> </w:t>
-      </w:r>
-      <w:r>
-        <w:t xml:space="preserve">tokens, and a query that needs a patch costs 0.2–1.1M tokens, while a query answered from the database costs nothing</w:t>
-      </w:r>
-      <w:r>
-        <w:t xml:space="preserve"> </w:t>
-      </w:r>
-      <w:r>
-        <w:t xml:space="preserve">more. At list prices for the 7B model a whole corpus costs $0.16–0.88 with patching (build plus every patch) and</w:t>
-      </w:r>
-      <w:r>
-        <w:t xml:space="preserve"> </w:t>
-      </w:r>
-      <w:r>
-        <w:t xml:space="preserve">$0.06–0.34 if the build had anticipated every column. Reuse of patched columns is the largest saving (5–17×), and the</w:t>
+        <w:t xml:space="preserve">Under drift, on-demand patching is most of the cost: at 100% drift patches are 71–85% of all extraction</w:t>
+      </w:r>
+      <w:r>
+        <w:t xml:space="preserve"> </w:t>
+      </w:r>
+      <w:r>
+        <w:t xml:space="preserve">tokens, and a query that needs a patch costs 0.2–3.9M tokens (legal’s long judgments are the most expensive), while a</w:t>
+      </w:r>
+      <w:r>
+        <w:t xml:space="preserve"> </w:t>
+      </w:r>
+      <w:r>
+        <w:t xml:space="preserve">query answered from the database costs nothing more. At list prices for the 7B model a whole corpus costs $0.16–2.46</w:t>
+      </w:r>
+      <w:r>
+        <w:t xml:space="preserve"> </w:t>
+      </w:r>
+      <w:r>
+        <w:t xml:space="preserve">with patching (build plus every patch) and $0.06–0.50 if the build had anticipated every column. Reuse of patched columns is the largest saving (5–17×), and the</w:t>
       </w:r>
       <w:r>
         <w:t xml:space="preserve"> </w:t>
@@ -6711,60 +6779,166 @@
               <w:jc w:val="left"/>
             </w:pPr>
             <w:r>
-              <w:t xml:space="preserve">med, legal</w:t>
-            </w:r>
-          </w:p>
-        </w:tc>
-        <w:tc>
-          <w:tcPr/>
-          <w:p>
-            <w:pPr>
-              <w:pStyle w:val="Compact"/>
-              <w:jc w:val="left"/>
-            </w:pPr>
-            <w:r>
-              <w:t xml:space="preserve">not yet run</w:t>
-            </w:r>
-          </w:p>
-        </w:tc>
-        <w:tc>
-          <w:tcPr/>
-          <w:p>
-            <w:pPr>
-              <w:pStyle w:val="Compact"/>
-            </w:pPr>
-          </w:p>
-        </w:tc>
-        <w:tc>
-          <w:tcPr/>
-          <w:p>
-            <w:pPr>
-              <w:pStyle w:val="Compact"/>
-            </w:pPr>
-          </w:p>
-        </w:tc>
-        <w:tc>
-          <w:tcPr/>
-          <w:p>
-            <w:pPr>
-              <w:pStyle w:val="Compact"/>
-            </w:pPr>
-          </w:p>
-        </w:tc>
-        <w:tc>
-          <w:tcPr/>
-          <w:p>
-            <w:pPr>
-              <w:pStyle w:val="Compact"/>
-            </w:pPr>
-          </w:p>
-        </w:tc>
-        <w:tc>
-          <w:tcPr/>
-          <w:p>
-            <w:pPr>
-              <w:pStyle w:val="Compact"/>
-            </w:pPr>
+              <w:t xml:space="preserve">med</w:t>
+            </w:r>
+          </w:p>
+        </w:tc>
+        <w:tc>
+          <w:tcPr/>
+          <w:p>
+            <w:pPr>
+              <w:pStyle w:val="Compact"/>
+              <w:jc w:val="left"/>
+            </w:pPr>
+            <w:r>
+              <w:t xml:space="preserve">43</w:t>
+            </w:r>
+          </w:p>
+        </w:tc>
+        <w:tc>
+          <w:tcPr/>
+          <w:p>
+            <w:pPr>
+              <w:pStyle w:val="Compact"/>
+              <w:jc w:val="left"/>
+            </w:pPr>
+            <w:r>
+              <w:t xml:space="preserve">2.81M, $0.286</w:t>
+            </w:r>
+          </w:p>
+        </w:tc>
+        <w:tc>
+          <w:tcPr/>
+          <w:p>
+            <w:pPr>
+              <w:pStyle w:val="Compact"/>
+              <w:jc w:val="left"/>
+            </w:pPr>
+            <w:r>
+              <w:t xml:space="preserve">16.62M, $1.677</w:t>
+            </w:r>
+          </w:p>
+        </w:tc>
+        <w:tc>
+          <w:tcPr/>
+          <w:p>
+            <w:pPr>
+              <w:pStyle w:val="Compact"/>
+              <w:jc w:val="left"/>
+            </w:pPr>
+            <w:r>
+              <w:t xml:space="preserve">85%</w:t>
+            </w:r>
+          </w:p>
+        </w:tc>
+        <w:tc>
+          <w:tcPr/>
+          <w:p>
+            <w:pPr>
+              <w:pStyle w:val="Compact"/>
+              <w:jc w:val="left"/>
+            </w:pPr>
+            <w:r>
+              <w:t xml:space="preserve">948k tokens, $0.101</w:t>
+            </w:r>
+          </w:p>
+        </w:tc>
+        <w:tc>
+          <w:tcPr/>
+          <w:p>
+            <w:pPr>
+              <w:pStyle w:val="Compact"/>
+              <w:jc w:val="left"/>
+            </w:pPr>
+            <w:r>
+              <w:t xml:space="preserve">$0.0066 / $0.0390</w:t>
+            </w:r>
+          </w:p>
+        </w:tc>
+      </w:tr>
+      <w:tr>
+        <w:tc>
+          <w:tcPr/>
+          <w:p>
+            <w:pPr>
+              <w:pStyle w:val="Compact"/>
+              <w:jc w:val="left"/>
+            </w:pPr>
+            <w:r>
+              <w:t xml:space="preserve">legal</w:t>
+            </w:r>
+          </w:p>
+        </w:tc>
+        <w:tc>
+          <w:tcPr/>
+          <w:p>
+            <w:pPr>
+              <w:pStyle w:val="Compact"/>
+              <w:jc w:val="left"/>
+            </w:pPr>
+            <w:r>
+              <w:t xml:space="preserve">27</w:t>
+            </w:r>
+          </w:p>
+        </w:tc>
+        <w:tc>
+          <w:tcPr/>
+          <w:p>
+            <w:pPr>
+              <w:pStyle w:val="Compact"/>
+              <w:jc w:val="left"/>
+            </w:pPr>
+            <w:r>
+              <w:t xml:space="preserve">4.94M, $0.503</w:t>
+            </w:r>
+          </w:p>
+        </w:tc>
+        <w:tc>
+          <w:tcPr/>
+          <w:p>
+            <w:pPr>
+              <w:pStyle w:val="Compact"/>
+              <w:jc w:val="left"/>
+            </w:pPr>
+            <w:r>
+              <w:t xml:space="preserve">24.33M, $2.456</w:t>
+            </w:r>
+          </w:p>
+        </w:tc>
+        <w:tc>
+          <w:tcPr/>
+          <w:p>
+            <w:pPr>
+              <w:pStyle w:val="Compact"/>
+              <w:jc w:val="left"/>
+            </w:pPr>
+            <w:r>
+              <w:t xml:space="preserve">81%</w:t>
+            </w:r>
+          </w:p>
+        </w:tc>
+        <w:tc>
+          <w:tcPr/>
+          <w:p>
+            <w:pPr>
+              <w:pStyle w:val="Compact"/>
+              <w:jc w:val="left"/>
+            </w:pPr>
+            <w:r>
+              <w:t xml:space="preserve">3.9M tokens, $0.332</w:t>
+            </w:r>
+          </w:p>
+        </w:tc>
+        <w:tc>
+          <w:tcPr/>
+          <w:p>
+            <w:pPr>
+              <w:pStyle w:val="Compact"/>
+              <w:jc w:val="left"/>
+            </w:pPr>
+            <w:r>
+              <w:t xml:space="preserve">$0.0186 / $0.0910</w:t>
+            </w:r>
           </w:p>
         </w:tc>
       </w:tr>
@@ -6774,7 +6948,7 @@
         <w:pStyle w:val="BodyText"/>
       </w:pPr>
       <w:r>
-        <w:t xml:space="preserve">Only 7–9 of each corpus’s test queries need a patch at 100% drift (the first to use each new column); every later</w:t>
+        <w:t xml:space="preserve">Only 6–14 of each corpus’s test queries need a patch at 100% drift (the first to use each new column); every later</w:t>
       </w:r>
       <w:r>
         <w:t xml:space="preserve"> </w:t>
@@ -6798,7 +6972,13 @@
         <w:t xml:space="preserve"> </w:t>
       </w:r>
       <w:r>
-        <w:t xml:space="preserve">(100% drift, 7B rates):</w:t>
+        <w:t xml:space="preserve">(100% drift, 7B rates; cspaper, player and art — the variants have not been re-run on med and</w:t>
+      </w:r>
+      <w:r>
+        <w:t xml:space="preserve"> </w:t>
+      </w:r>
+      <w:r>
+        <w:t xml:space="preserve">legal yet; DocETL on the same queries costs $8.94 on med and $33.52 on 21 of legal’s 27):</w:t>
       </w:r>
     </w:p>
     <w:tbl>
@@ -7490,13 +7670,19 @@
         <w:t xml:space="preserve"> </w:t>
       </w:r>
       <w:r>
-        <w:t xml:space="preserve">Three corpora (med and legal not yet run); tokens measured, the fixed levels’ builds costed as one shared</w:t>
-      </w:r>
-      <w:r>
-        <w:t xml:space="preserve"> </w:t>
-      </w:r>
-      <w:r>
-        <w:t xml:space="preserve">read (within about 2%, E1.3); prices are list rates on 2026-10-07 and exclude local serving costs.</w:t>
+        <w:t xml:space="preserve">Five corpora for the main table, three for the variants and models; tokens measured, the fixed levels’</w:t>
+      </w:r>
+      <w:r>
+        <w:t xml:space="preserve"> </w:t>
+      </w:r>
+      <w:r>
+        <w:t xml:space="preserve">builds costed as one shared read (within about 2%, E1.3); prices are list rates on 2026-10-07 and exclude local</w:t>
+      </w:r>
+      <w:r>
+        <w:t xml:space="preserve"> </w:t>
+      </w:r>
+      <w:r>
+        <w:t xml:space="preserve">serving costs.</w:t>
       </w:r>
     </w:p>
     <w:p>
@@ -7537,7 +7723,7 @@
         <w:t xml:space="preserve"> </w:t>
       </w:r>
       <w:r>
-        <w:t xml:space="preserve">uses 7–25× fewer tokens. DocETL extracts per query and does not reuse extractions; its accuracy collapses on joins.</w:t>
+        <w:t xml:space="preserve">uses 5–25× fewer tokens. DocETL extracts per query and does not reuse extractions; its accuracy collapses on joins.</w:t>
       </w:r>
     </w:p>
     <w:tbl>
@@ -7972,56 +8158,80 @@
               <w:jc w:val="left"/>
             </w:pPr>
             <w:r>
-              <w:t xml:space="preserve">not yet run</w:t>
-            </w:r>
-          </w:p>
-        </w:tc>
-        <w:tc>
-          <w:tcPr/>
-          <w:p>
-            <w:pPr>
-              <w:pStyle w:val="Compact"/>
-            </w:pPr>
-          </w:p>
-        </w:tc>
-        <w:tc>
-          <w:tcPr/>
-          <w:p>
-            <w:pPr>
-              <w:pStyle w:val="Compact"/>
-            </w:pPr>
-          </w:p>
-        </w:tc>
-        <w:tc>
-          <w:tcPr/>
-          <w:p>
-            <w:pPr>
-              <w:pStyle w:val="Compact"/>
-            </w:pPr>
-          </w:p>
-        </w:tc>
-        <w:tc>
-          <w:tcPr/>
-          <w:p>
-            <w:pPr>
-              <w:pStyle w:val="Compact"/>
-            </w:pPr>
-          </w:p>
-        </w:tc>
-        <w:tc>
-          <w:tcPr/>
-          <w:p>
-            <w:pPr>
-              <w:pStyle w:val="Compact"/>
-            </w:pPr>
-          </w:p>
-        </w:tc>
-        <w:tc>
-          <w:tcPr/>
-          <w:p>
-            <w:pPr>
-              <w:pStyle w:val="Compact"/>
-            </w:pPr>
+              <w:t xml:space="preserve">43</w:t>
+            </w:r>
+          </w:p>
+        </w:tc>
+        <w:tc>
+          <w:tcPr/>
+          <w:p>
+            <w:pPr>
+              <w:pStyle w:val="Compact"/>
+              <w:jc w:val="left"/>
+            </w:pPr>
+            <w:r>
+              <w:t xml:space="preserve">0.072</w:t>
+            </w:r>
+          </w:p>
+        </w:tc>
+        <w:tc>
+          <w:tcPr/>
+          <w:p>
+            <w:pPr>
+              <w:pStyle w:val="Compact"/>
+              <w:jc w:val="left"/>
+            </w:pPr>
+            <w:r>
+              <w:t xml:space="preserve">0.115</w:t>
+            </w:r>
+          </w:p>
+        </w:tc>
+        <w:tc>
+          <w:tcPr/>
+          <w:p>
+            <w:pPr>
+              <w:pStyle w:val="Compact"/>
+              <w:jc w:val="left"/>
+            </w:pPr>
+            <w:r>
+              <w:t xml:space="preserve">+0.044 (0.012 – 0.078)</w:t>
+            </w:r>
+          </w:p>
+        </w:tc>
+        <w:tc>
+          <w:tcPr/>
+          <w:p>
+            <w:pPr>
+              <w:pStyle w:val="Compact"/>
+              <w:jc w:val="left"/>
+            </w:pPr>
+            <w:r>
+              <w:t xml:space="preserve">88.8M</w:t>
+            </w:r>
+          </w:p>
+        </w:tc>
+        <w:tc>
+          <w:tcPr/>
+          <w:p>
+            <w:pPr>
+              <w:pStyle w:val="Compact"/>
+              <w:jc w:val="left"/>
+            </w:pPr>
+            <w:r>
+              <w:t xml:space="preserve">16.62M</w:t>
+            </w:r>
+          </w:p>
+        </w:tc>
+        <w:tc>
+          <w:tcPr/>
+          <w:p>
+            <w:pPr>
+              <w:pStyle w:val="Compact"/>
+              <w:jc w:val="left"/>
+            </w:pPr>
+            <w:r>
+              <w:t xml:space="preserve">5×</w:t>
+            </w:r>
           </w:p>
         </w:tc>
       </w:tr>
@@ -8046,56 +8256,80 @@
               <w:jc w:val="left"/>
             </w:pPr>
             <w:r>
-              <w:t xml:space="preserve">not yet run</w:t>
-            </w:r>
-          </w:p>
-        </w:tc>
-        <w:tc>
-          <w:tcPr/>
-          <w:p>
-            <w:pPr>
-              <w:pStyle w:val="Compact"/>
-            </w:pPr>
-          </w:p>
-        </w:tc>
-        <w:tc>
-          <w:tcPr/>
-          <w:p>
-            <w:pPr>
-              <w:pStyle w:val="Compact"/>
-            </w:pPr>
-          </w:p>
-        </w:tc>
-        <w:tc>
-          <w:tcPr/>
-          <w:p>
-            <w:pPr>
-              <w:pStyle w:val="Compact"/>
-            </w:pPr>
-          </w:p>
-        </w:tc>
-        <w:tc>
-          <w:tcPr/>
-          <w:p>
-            <w:pPr>
-              <w:pStyle w:val="Compact"/>
-            </w:pPr>
-          </w:p>
-        </w:tc>
-        <w:tc>
-          <w:tcPr/>
-          <w:p>
-            <w:pPr>
-              <w:pStyle w:val="Compact"/>
-            </w:pPr>
-          </w:p>
-        </w:tc>
-        <w:tc>
-          <w:tcPr/>
-          <w:p>
-            <w:pPr>
-              <w:pStyle w:val="Compact"/>
-            </w:pPr>
+              <w:t xml:space="preserve">21 of 27</w:t>
+            </w:r>
+          </w:p>
+        </w:tc>
+        <w:tc>
+          <w:tcPr/>
+          <w:p>
+            <w:pPr>
+              <w:pStyle w:val="Compact"/>
+              <w:jc w:val="left"/>
+            </w:pPr>
+            <w:r>
+              <w:t xml:space="preserve">0.057</w:t>
+            </w:r>
+          </w:p>
+        </w:tc>
+        <w:tc>
+          <w:tcPr/>
+          <w:p>
+            <w:pPr>
+              <w:pStyle w:val="Compact"/>
+              <w:jc w:val="left"/>
+            </w:pPr>
+            <w:r>
+              <w:t xml:space="preserve">0.153</w:t>
+            </w:r>
+          </w:p>
+        </w:tc>
+        <w:tc>
+          <w:tcPr/>
+          <w:p>
+            <w:pPr>
+              <w:pStyle w:val="Compact"/>
+              <w:jc w:val="left"/>
+            </w:pPr>
+            <w:r>
+              <w:t xml:space="preserve">+0.097 (0.031 – 0.170)</w:t>
+            </w:r>
+          </w:p>
+        </w:tc>
+        <w:tc>
+          <w:tcPr/>
+          <w:p>
+            <w:pPr>
+              <w:pStyle w:val="Compact"/>
+              <w:jc w:val="left"/>
+            </w:pPr>
+            <w:r>
+              <w:t xml:space="preserve">333.0M</w:t>
+            </w:r>
+          </w:p>
+        </w:tc>
+        <w:tc>
+          <w:tcPr/>
+          <w:p>
+            <w:pPr>
+              <w:pStyle w:val="Compact"/>
+              <w:jc w:val="left"/>
+            </w:pPr>
+            <w:r>
+              <w:t xml:space="preserve">20.36M</w:t>
+            </w:r>
+          </w:p>
+        </w:tc>
+        <w:tc>
+          <w:tcPr/>
+          <w:p>
+            <w:pPr>
+              <w:pStyle w:val="Compact"/>
+              <w:jc w:val="left"/>
+            </w:pPr>
+            <w:r>
+              <w:t xml:space="preserve">16×</w:t>
+            </w:r>
           </w:p>
         </w:tc>
       </w:tr>
@@ -8198,7 +8432,7 @@
         <w:t xml:space="preserve"> </w:t>
       </w:r>
       <w:r>
-        <w:t xml:space="preserve">All 220 drift test queries on cspaper, player and art (med and legal not yet run); one model.</w:t>
+        <w:t xml:space="preserve">284 of the 290 drift test queries (legal’s 6 newest queries not yet run with DocETL); one model.</w:t>
       </w:r>
     </w:p>
     <w:bookmarkEnd w:id="73"/>

</xml_diff>